<commit_message>
Sync paper website with September 2026 submission materials
</commit_message>
<xml_diff>
--- a/public/Manuscript.docx
+++ b/public/Manuscript.docx
@@ -21,7 +21,28 @@
           <w:szCs w:val="36"/>
           <w:highlight w:val="none"/>
         </w:rPr>
-        <w:t>Emotional distress drives change in adolescent problematic digital use and related symptoms</w:t>
+        <w:t>Emotional distress predict</w:t>
+      </w:r>
+      <w:r>
+        <w:rPr>
+          <w:rFonts w:hint="eastAsia" w:ascii="Arial" w:hAnsi="Arial" w:eastAsia="宋体" w:cs="Arial"/>
+          <w:b/>
+          <w:sz w:val="36"/>
+          <w:szCs w:val="36"/>
+          <w:highlight w:val="none"/>
+          <w:lang w:val="en-US" w:eastAsia="zh-CN"/>
+        </w:rPr>
+        <w:t>s</w:t>
+      </w:r>
+      <w:r>
+        <w:rPr>
+          <w:rFonts w:hint="default" w:ascii="Arial" w:hAnsi="Arial" w:cs="Arial"/>
+          <w:b/>
+          <w:sz w:val="36"/>
+          <w:szCs w:val="36"/>
+          <w:highlight w:val="none"/>
+        </w:rPr>
+        <w:t xml:space="preserve"> change in adolescent problematic digital use and related symptoms</w:t>
       </w:r>
     </w:p>
     <w:p>
@@ -205,7 +226,24 @@
           <w:sz w:val="19"/>
           <w:highlight w:val="none"/>
         </w:rPr>
-        <w:t>School of Biomedical Engineering and Informatics, Nanjing Medical University, Nanjing, Chin</w:t>
+        <w:t>S</w:t>
+      </w:r>
+      <w:r>
+        <w:rPr>
+          <w:rFonts w:hint="eastAsia" w:ascii="Arial" w:hAnsi="Arial" w:eastAsia="宋体" w:cs="Arial"/>
+          <w:sz w:val="19"/>
+          <w:highlight w:val="none"/>
+          <w:lang w:val="en-US" w:eastAsia="zh-CN"/>
+        </w:rPr>
+        <w:t>c</w:t>
+      </w:r>
+      <w:r>
+        <w:rPr>
+          <w:rFonts w:hint="default" w:ascii="Arial" w:hAnsi="Arial" w:cs="Arial"/>
+          <w:sz w:val="19"/>
+          <w:highlight w:val="none"/>
+        </w:rPr>
+        <w:t>hool of Biomedical Engineering and Informatics, Nanjing Medical University, Nanjing, Chin</w:t>
       </w:r>
       <w:r>
         <w:rPr>
@@ -351,22 +389,217 @@
           <w:rFonts w:hint="eastAsia"/>
           <w:highlight w:val="none"/>
         </w:rPr>
-        <w:t>Whether adolescent problematic digital use precedes or follows broader mental-health difficulties remains unresolved. In the School-based Evaluation Advancing Response for Child Health (SEARCH) cohort in China (N=10,356; n=6,092 reassessed about one year later), emotional distress was the principal temporal driver (+0.249, 95% CI 0.086 to 0.418), predicting later problematic digital use, insomnia, behavioural difficulties and diet, whereas digital use was neutral</w:t>
+        <w:t xml:space="preserve">Whether adolescent problematic digital use precedes or follows broader </w:t>
       </w:r>
       <w:r>
         <w:rPr>
           <w:rFonts w:hint="eastAsia" w:eastAsia="宋体"/>
           <w:highlight w:val="none"/>
+          <w:lang w:eastAsia="zh-CN"/>
+        </w:rPr>
+        <w:t>mental health difficulties</w:t>
+      </w:r>
+      <w:r>
+        <w:rPr>
+          <w:rFonts w:hint="eastAsia"/>
+          <w:highlight w:val="none"/>
+        </w:rPr>
+        <w:t xml:space="preserve"> remains unresolved. In the School-based Evaluation Advancing Response for Child Health (SEARCH) cohort in China (N</w:t>
+      </w:r>
+      <w:r>
+        <w:rPr>
+          <w:rFonts w:hint="eastAsia" w:eastAsia="宋体"/>
+          <w:highlight w:val="none"/>
           <w:lang w:val="en-US" w:eastAsia="zh-CN"/>
         </w:rPr>
-        <w:t xml:space="preserve">. </w:t>
+        <w:t xml:space="preserve"> </w:t>
       </w:r>
       <w:r>
         <w:rPr>
           <w:rFonts w:hint="eastAsia"/>
           <w:highlight w:val="none"/>
         </w:rPr>
-        <w:t>Extending this pattern, the UK Millennium Cohort Study (n=7,838) identified social-media use as the strongest sink (−0.211, 95% CI −0.260 to −0.139), whereas hyperactivity/inattention was the leading source. Structurally, control differed from temporal directionality, whereas Bayesian modelling converged on an emotion-as-source architecture. Finally, Global Mind Project triangulation (n=147,506) identified emotion as the strongest hub. Together, these findings identify emotional distress as the principal temporal driver and screen-related behaviours as components, rather than primary upstream causes, of broader psychopathology.</w:t>
+        <w:t>=</w:t>
+      </w:r>
+      <w:r>
+        <w:rPr>
+          <w:rFonts w:hint="eastAsia" w:eastAsia="宋体"/>
+          <w:highlight w:val="none"/>
+          <w:lang w:val="en-US" w:eastAsia="zh-CN"/>
+        </w:rPr>
+        <w:t xml:space="preserve"> </w:t>
+      </w:r>
+      <w:r>
+        <w:rPr>
+          <w:rFonts w:hint="eastAsia"/>
+          <w:highlight w:val="none"/>
+        </w:rPr>
+        <w:t>10,356; n</w:t>
+      </w:r>
+      <w:r>
+        <w:rPr>
+          <w:rFonts w:hint="eastAsia" w:eastAsia="宋体"/>
+          <w:highlight w:val="none"/>
+          <w:lang w:val="en-US" w:eastAsia="zh-CN"/>
+        </w:rPr>
+        <w:t xml:space="preserve"> </w:t>
+      </w:r>
+      <w:r>
+        <w:rPr>
+          <w:rFonts w:hint="eastAsia"/>
+          <w:highlight w:val="none"/>
+        </w:rPr>
+        <w:t>=</w:t>
+      </w:r>
+      <w:r>
+        <w:rPr>
+          <w:rFonts w:hint="eastAsia" w:eastAsia="宋体"/>
+          <w:highlight w:val="none"/>
+          <w:lang w:val="en-US" w:eastAsia="zh-CN"/>
+        </w:rPr>
+        <w:t xml:space="preserve"> </w:t>
+      </w:r>
+      <w:r>
+        <w:rPr>
+          <w:rFonts w:hint="eastAsia"/>
+          <w:highlight w:val="none"/>
+        </w:rPr>
+        <w:t>6,092 reassessed one year later), a cross-lagged panel network (CLPN) showed that emotional distress had the strongest positive net directionality (+0.249, 95% CI 0.086 to 0.418) and predicted later problematic digital use, insomnia, broad difficulties and diet.</w:t>
+      </w:r>
+      <w:r>
+        <w:rPr>
+          <w:rFonts w:hint="eastAsia" w:eastAsia="宋体"/>
+          <w:highlight w:val="none"/>
+          <w:lang w:val="en-US" w:eastAsia="zh-CN"/>
+        </w:rPr>
+        <w:t xml:space="preserve"> Problematic digital use showed no significant net directionality. </w:t>
+      </w:r>
+      <w:r>
+        <w:rPr>
+          <w:rFonts w:hint="eastAsia"/>
+          <w:highlight w:val="none"/>
+        </w:rPr>
+        <w:t>In the UK Millennium Cohort Study (n</w:t>
+      </w:r>
+      <w:r>
+        <w:rPr>
+          <w:rFonts w:hint="eastAsia" w:eastAsia="宋体"/>
+          <w:highlight w:val="none"/>
+          <w:lang w:val="en-US" w:eastAsia="zh-CN"/>
+        </w:rPr>
+        <w:t xml:space="preserve"> </w:t>
+      </w:r>
+      <w:r>
+        <w:rPr>
+          <w:rFonts w:hint="eastAsia"/>
+          <w:highlight w:val="none"/>
+        </w:rPr>
+        <w:t>=</w:t>
+      </w:r>
+      <w:r>
+        <w:rPr>
+          <w:rFonts w:hint="eastAsia" w:eastAsia="宋体"/>
+          <w:highlight w:val="none"/>
+          <w:lang w:val="en-US" w:eastAsia="zh-CN"/>
+        </w:rPr>
+        <w:t xml:space="preserve"> </w:t>
+      </w:r>
+      <w:r>
+        <w:rPr>
+          <w:rFonts w:hint="eastAsia"/>
+          <w:highlight w:val="none"/>
+        </w:rPr>
+        <w:t>7,838)</w:t>
+      </w:r>
+      <w:r>
+        <w:rPr>
+          <w:rFonts w:hint="eastAsia" w:eastAsia="宋体"/>
+          <w:highlight w:val="none"/>
+          <w:lang w:val="en-US" w:eastAsia="zh-CN"/>
+        </w:rPr>
+        <w:t>,</w:t>
+      </w:r>
+      <w:r>
+        <w:rPr>
+          <w:rFonts w:hint="eastAsia"/>
+          <w:highlight w:val="none"/>
+        </w:rPr>
+        <w:t xml:space="preserve"> </w:t>
+      </w:r>
+      <w:r>
+        <w:rPr>
+          <w:rFonts w:hint="eastAsia" w:eastAsia="宋体"/>
+          <w:highlight w:val="none"/>
+          <w:lang w:eastAsia="zh-CN"/>
+        </w:rPr>
+        <w:t>social media use</w:t>
+      </w:r>
+      <w:r>
+        <w:rPr>
+          <w:rFonts w:hint="eastAsia"/>
+          <w:highlight w:val="none"/>
+        </w:rPr>
+        <w:t xml:space="preserve"> </w:t>
+      </w:r>
+      <w:r>
+        <w:rPr>
+          <w:rFonts w:hint="eastAsia" w:eastAsia="宋体"/>
+          <w:highlight w:val="none"/>
+          <w:lang w:val="en-US" w:eastAsia="zh-CN"/>
+        </w:rPr>
+        <w:t>w</w:t>
+      </w:r>
+      <w:r>
+        <w:rPr>
+          <w:rFonts w:hint="eastAsia"/>
+          <w:highlight w:val="none"/>
+        </w:rPr>
+        <w:t>as the strongest net sink (−0.211, 95% CI −0.260 to −0.139), whereas hyperactivity/inattention was the leading</w:t>
+      </w:r>
+      <w:r>
+        <w:rPr>
+          <w:rFonts w:hint="eastAsia" w:eastAsia="宋体"/>
+          <w:highlight w:val="none"/>
+          <w:lang w:val="en-US" w:eastAsia="zh-CN"/>
+        </w:rPr>
+        <w:t xml:space="preserve"> net </w:t>
+      </w:r>
+      <w:r>
+        <w:rPr>
+          <w:rFonts w:hint="eastAsia"/>
+          <w:highlight w:val="none"/>
+        </w:rPr>
+        <w:t xml:space="preserve">source. Static structural-control positions differed from CLPN net directionality. Bayesian net out-degree showed a positive but imprecise association with CLPN net directionality. </w:t>
+      </w:r>
+      <w:r>
+        <w:rPr>
+          <w:rFonts w:hint="eastAsia" w:eastAsia="宋体"/>
+          <w:highlight w:val="none"/>
+          <w:lang w:val="en-US" w:eastAsia="zh-CN"/>
+        </w:rPr>
+        <w:t>I</w:t>
+      </w:r>
+      <w:r>
+        <w:rPr>
+          <w:rFonts w:hint="eastAsia"/>
+          <w:highlight w:val="none"/>
+        </w:rPr>
+        <w:t>n the Global Mind Project (n=147,506), emotion had the highest cross-sectional network strength.</w:t>
+      </w:r>
+      <w:r>
+        <w:rPr>
+          <w:rFonts w:hint="eastAsia" w:eastAsia="宋体"/>
+          <w:highlight w:val="none"/>
+          <w:lang w:val="en-US" w:eastAsia="zh-CN"/>
+        </w:rPr>
+        <w:t xml:space="preserve"> A</w:t>
+      </w:r>
+      <w:r>
+        <w:rPr>
+          <w:rFonts w:hint="eastAsia"/>
+          <w:highlight w:val="none"/>
+        </w:rPr>
+        <w:t>cross longitudinal cohorts, psychological difficulties occupied leading net source positions, whereas screen-related measures did not.</w:t>
       </w:r>
     </w:p>
     <w:p>
@@ -419,10 +652,26 @@
       </w:pPr>
       <w:r>
         <w:rPr>
+          <w:rFonts w:hint="eastAsia" w:eastAsia="宋体"/>
+          <w:highlight w:val="none"/>
+          <w:lang w:val="en-US" w:eastAsia="zh-CN"/>
+        </w:rPr>
+        <w:t>M</w:t>
+      </w:r>
+      <w:r>
+        <w:rPr>
+          <w:rFonts w:hint="eastAsia" w:eastAsia="宋体"/>
+          <w:highlight w:val="none"/>
+          <w:lang w:eastAsia="zh-CN"/>
+        </w:rPr>
+        <w:t>ental health difficulties</w:t>
+      </w:r>
+      <w:r>
+        <w:rPr>
           <w:rFonts w:hint="eastAsia"/>
           <w:highlight w:val="none"/>
         </w:rPr>
-        <w:t>Mental-health difficulties are widespread among young people</w:t>
+        <w:t xml:space="preserve"> are widespread among young people</w:t>
       </w:r>
       <w:r>
         <w:rPr>
@@ -501,7 +750,7 @@
           <w:rFonts w:hint="eastAsia"/>
           <w:highlight w:val="none"/>
         </w:rPr>
-        <w:t>. The central question is therefore not simply whether digital use and mental health are associated, but which domains drive subsequent change across the wider system.</w:t>
+        <w:t>. The central question is which domains predict subsequent change across the wider mental health system.</w:t>
       </w:r>
     </w:p>
     <w:p>
@@ -565,7 +814,15 @@
           <w:rFonts w:hint="eastAsia"/>
           <w:highlight w:val="none"/>
         </w:rPr>
-        <w:t>. Connectedness alone, however, indicates neither structural leverage nor temporal priority. Structural-control methods address the static architecture of the system: minimum-dominating-set and module-control analyses identify nodes whose neighbourhoods cover the estimated network</w:t>
+        <w:t xml:space="preserve">. Connectedness alone does not indicate structural leverage or temporal priority. Structural-control methods address the static architecture of the system: </w:t>
+      </w:r>
+      <w:r>
+        <w:rPr>
+          <w:rFonts w:hint="eastAsia" w:eastAsia="宋体"/>
+          <w:highlight w:val="none"/>
+          <w:lang w:eastAsia="zh-CN"/>
+        </w:rPr>
+        <w:t>minimum dominating set (MDS) analysis identifies the smallest sets of nodes whose neighbourhoods cover the estimated network, whereas module-control analysis characterises inter-module structural coverage</w:t>
       </w:r>
       <w:r>
         <w:rPr>
@@ -597,7 +854,22 @@
           <w:rFonts w:hint="eastAsia"/>
           <w:highlight w:val="none"/>
         </w:rPr>
-        <w:t>. Cross-lagged panel networks instead quantify prospective prediction among domains, allowing static structural position to be compared with longitudinal directionality</w:t>
+        <w:t>. Cross-lagged panel networks</w:t>
+      </w:r>
+      <w:r>
+        <w:rPr>
+          <w:rFonts w:hint="eastAsia" w:eastAsia="宋体"/>
+          <w:highlight w:val="none"/>
+          <w:lang w:val="en-US" w:eastAsia="zh-CN"/>
+        </w:rPr>
+        <w:t xml:space="preserve"> </w:t>
+      </w:r>
+      <w:r>
+        <w:rPr>
+          <w:rFonts w:hint="eastAsia"/>
+          <w:highlight w:val="none"/>
+        </w:rPr>
+        <w:t>(CLPNs) instead quantify prospective prediction among domains, allowing static structural position to be compared with CLPN net directionality</w:t>
       </w:r>
       <w:r>
         <w:rPr>
@@ -638,7 +910,7 @@
           <w:highlight w:val="none"/>
           <w:lang w:val="en-US" w:eastAsia="zh-CN"/>
         </w:rPr>
-        <w:t>Establishing which domains lead change over time has direct implications for how adolescent problematic digital use is understood and addressed. If problematic digital use precedes broader difficulties, digital behaviour should become a central target for prevention and intervention. If emotional distress leads instead, problematic digital use may be better understood as a downstream expression of a broader affective process, shifting the priority towards emotional difficulties rather than screen behaviour alone.</w:t>
+        <w:t xml:space="preserve">Establishing which domains lead change over time has direct implications for how adolescent problematic digital use is understood and addressed. If problematic digital use predicts subsequent broader difficulties, early assessment and prevention should address digital behaviour directly. If emotional distress predicts later problematic digital use, problematic digital use should be understood within a broader pattern of emotional difficulties. </w:t>
       </w:r>
     </w:p>
     <w:p>
@@ -653,7 +925,7 @@
           <w:rFonts w:hint="eastAsia"/>
           <w:highlight w:val="none"/>
         </w:rPr>
-        <w:t>Against this background, we first tested longitudinal ordering in the School-based Evaluation Advancing Response for Child Health (SEARCH) cohort in Jiangsu, China</w:t>
+        <w:t>Against this background, we used a CLPN in the School-based Evaluation Advancing Response for Child Health (SEARCH) cohort in Jiangsu, China</w:t>
       </w:r>
       <w:r>
         <w:rPr>
@@ -662,14 +934,74 @@
           <w:vertAlign w:val="superscript"/>
           <w:lang w:val="en-US" w:eastAsia="zh-CN"/>
         </w:rPr>
-        <w:t>27</w:t>
+        <w:t xml:space="preserve">27 </w:t>
       </w:r>
       <w:r>
         <w:rPr>
           <w:rFonts w:hint="eastAsia"/>
           <w:highlight w:val="none"/>
         </w:rPr>
-        <w:t>. We mapped cross-lagged relations among generalised problematic digital use, emotional distress, broad Strengths and Difficulties Questionnaire (SDQ) difficulties, diet, insomnia and physical activity in 6,092 adolescents reassessed approximately one year later. We then examined whether the screen-related ordering extended to the UK Millennium Cohort Study (MCS), where social-media use and gaming were measured directly between ages 14 and 17</w:t>
+        <w:t>to identify the leading longitudinal predictors across six health domains, with particular focus on the relative positions of problematic digital use and emotional distress.</w:t>
+      </w:r>
+      <w:r>
+        <w:rPr>
+          <w:rFonts w:hint="eastAsia" w:eastAsia="宋体"/>
+          <w:highlight w:val="none"/>
+          <w:lang w:val="en-US" w:eastAsia="zh-CN"/>
+        </w:rPr>
+        <w:t xml:space="preserve"> </w:t>
+      </w:r>
+      <w:r>
+        <w:rPr>
+          <w:rFonts w:hint="eastAsia"/>
+          <w:highlight w:val="none"/>
+        </w:rPr>
+        <w:t>The model included generalised problematic digital use, emotional distress, broad Strengths and Difficulties Questionnaire (SDQ) difficulties, diet, insomnia and physical activity in 6,092 adolescents reassessed approximately one year later. We then examined whether</w:t>
+      </w:r>
+      <w:r>
+        <w:rPr>
+          <w:rFonts w:hint="eastAsia" w:eastAsia="宋体"/>
+          <w:highlight w:val="none"/>
+          <w:lang w:val="en-US" w:eastAsia="zh-CN"/>
+        </w:rPr>
+        <w:t xml:space="preserve"> </w:t>
+      </w:r>
+      <w:r>
+        <w:rPr>
+          <w:rFonts w:hint="eastAsia"/>
+          <w:highlight w:val="none"/>
+        </w:rPr>
+        <w:t>the longitudinal position of screen-related measures</w:t>
+      </w:r>
+      <w:r>
+        <w:rPr>
+          <w:rFonts w:hint="eastAsia" w:eastAsia="宋体"/>
+          <w:highlight w:val="none"/>
+          <w:lang w:val="en-US" w:eastAsia="zh-CN"/>
+        </w:rPr>
+        <w:t xml:space="preserve"> </w:t>
+      </w:r>
+      <w:r>
+        <w:rPr>
+          <w:rFonts w:hint="eastAsia"/>
+          <w:highlight w:val="none"/>
+        </w:rPr>
+        <w:t xml:space="preserve">extended to the UK Millennium Cohort Study (MCS), where </w:t>
+      </w:r>
+      <w:r>
+        <w:rPr>
+          <w:rFonts w:hint="eastAsia" w:eastAsia="宋体"/>
+          <w:highlight w:val="none"/>
+          <w:lang w:eastAsia="zh-CN"/>
+        </w:rPr>
+        <w:t>social media use</w:t>
+      </w:r>
+      <w:r>
+        <w:rPr>
+          <w:rFonts w:hint="eastAsia"/>
+          <w:highlight w:val="none"/>
+        </w:rPr>
+        <w:t xml:space="preserve"> and gaming were measured directly between ages 14 and 17</w:t>
       </w:r>
       <w:r>
         <w:rPr>
@@ -685,7 +1017,7 @@
           <w:rFonts w:hint="eastAsia"/>
           <w:highlight w:val="none"/>
         </w:rPr>
-        <w:t>. Next, we characterised the 104-item baseline SEARCH network in 10,356 adolescents and compared its structural-control nodes with the longitudinal predictors. An exploratory Bayesian graph assessed whether a distinct modelling framework converged on the same directional architecture within SEARCH. Finally, a pooled multinational young-adult sample from the Global Mind Project</w:t>
+        <w:t>. Next, we characterised the 104-item baseline SEARCH network in 10,356 adolescents and compared its structural-control nodes with the CLPN net source positions. Within SEARCH, an exploratory Bayesian graph was used to assess whether baseline net out-degree aligned with the longitudinal ordering observed in the CLPN. Finally, a pooled multinational young-adult sample from the Global Mind Project</w:t>
       </w:r>
       <w:r>
         <w:rPr>
@@ -709,7 +1041,22 @@
           <w:rFonts w:hint="eastAsia"/>
           <w:highlight w:val="none"/>
         </w:rPr>
-        <w:t>provided cross-sectional comparison of the relative network prominence of emotion and social-media use. Together, these analyses were designed to identify the principal temporal drivers of system-level change, test whether screen-related behaviours occupied a leading upstream position, and determine whether static structural control and longitudinal directionality identified the same parts of the symptom system.</w:t>
+        <w:t xml:space="preserve">provided a cross-sectional comparison of network strength of emotion and </w:t>
+      </w:r>
+      <w:r>
+        <w:rPr>
+          <w:rFonts w:hint="eastAsia" w:eastAsia="宋体"/>
+          <w:highlight w:val="none"/>
+          <w:lang w:eastAsia="zh-CN"/>
+        </w:rPr>
+        <w:t>social media use</w:t>
+      </w:r>
+      <w:r>
+        <w:rPr>
+          <w:rFonts w:hint="eastAsia"/>
+          <w:highlight w:val="none"/>
+        </w:rPr>
+        <w:t>. Across the longitudinal cohorts, we sought to identify the principal predictors of subsequent change across the broader mental health system, focusing on whether screen-related behaviours or psychological difficulties occupied the leading CLPN net source positions. Within SEARCH, we also examined whether these longitudinal positions corresponded to the parts of the symptom system identified by static structural-control analyses. The pooled GMP analysis provided a cross-sectional comparison of the relative network prominence of emotional and screen-related domains.</w:t>
       </w:r>
     </w:p>
     <w:p>
@@ -737,9 +1084,10 @@
       </w:pPr>
       <w:r>
         <w:rPr>
-          <w:highlight w:val="none"/>
-        </w:rPr>
-        <w:t>Emotional distress is the leading longitudinal source in SEARCH</w:t>
+          <w:rFonts w:hint="eastAsia"/>
+          <w:highlight w:val="none"/>
+        </w:rPr>
+        <w:t>Emotional distress is the strongest net source in SEARCH</w:t>
       </w:r>
     </w:p>
     <w:p>
@@ -769,37 +1117,23 @@
           <w:rFonts w:hint="eastAsia"/>
           <w:highlight w:val="none"/>
         </w:rPr>
-        <w:t>Compared with participants who could not be linked, the retained sample had lower baseline scores for CIAS (standardised mean difference, −0.35), DASS (−0.35), ISI (−0.31), DIET (−0.26) and SDQ (−0.18), and slightly higher physical activity (0.10; Supplementary Table S12). The longitudinal sample therefore had somewhat lower baseline symptom burden than the original cohort, which should be considered when interpreting the findings below.</w:t>
+        <w:t xml:space="preserve">Compared with participants who could not be linked, the retained sample had lower baseline scores for CIAS (standardised mean difference, −0.35), DASS (−0.35), ISI (−0.31), DIET (−0.26) and SDQ (−0.18), and slightly higher physical activity (0.10; Supplementary Table S12). </w:t>
       </w:r>
     </w:p>
     <w:p>
       <w:pPr>
         <w:rPr>
+          <w:rFonts w:hint="eastAsia" w:eastAsia="宋体"/>
+          <w:highlight w:val="none"/>
+          <w:lang w:val="en-US" w:eastAsia="zh-CN"/>
+        </w:rPr>
+      </w:pPr>
+      <w:r>
+        <w:rPr>
           <w:rFonts w:hint="eastAsia"/>
           <w:highlight w:val="none"/>
         </w:rPr>
-      </w:pPr>
-      <w:r>
-        <w:rPr>
-          <w:rFonts w:hint="eastAsia"/>
-          <w:highlight w:val="none"/>
-        </w:rPr>
-        <w:t>Within this retained sample, emotional distress showed the largest positive net cross-lagged directionality (+0.249, 95% CI 0.086 to 0.418; Fig.</w:t>
-      </w:r>
-      <w:r>
-        <w:rPr>
-          <w:rFonts w:hint="eastAsia" w:eastAsia="宋体"/>
-          <w:highlight w:val="none"/>
-          <w:lang w:val="en-US" w:eastAsia="zh-CN"/>
-        </w:rPr>
-        <w:t xml:space="preserve"> </w:t>
-      </w:r>
-      <w:r>
-        <w:rPr>
-          <w:rFonts w:hint="eastAsia"/>
-          <w:highlight w:val="none"/>
-        </w:rPr>
-        <w:t>1), representing the strongest balance of outgoing over incoming prospective prediction. Broad SDQ difficulties (−0.090, 95% CI −0.189 to −0.003) and physical activity (−0.145, 95% CI −0.218 to −0.060) were net sinks. By contrast, problematic digital use (CIAS; −0.061, 95% CI −0.161 to 0.051), diet (−0.014, 95% CI −0.137 to 0.108) and insomnia (+0.061, 95% CI −0.091 to 0.217) showed no significant net directionality because their confidence intervals included zero. At the domain level, the principal longitudinal signal therefore originated from emotional distress rather than problematic digital use.</w:t>
+        <w:t xml:space="preserve">Within this retained sample, emotional distress showed the largest positive CLPN net directionality (+0.249, 95% CI 0.086 to 0.418; Fig. 1), placing it in the strongest net source position. Broad SDQ difficulties (−0.090, 95% CI −0.189 to −0.003) and physical activity (−0.145, 95% CI −0.218 to −0.060) occupied net sink positions. By contrast, problematic digital use (CIAS; −0.061, 95% CI −0.161 to 0.051), diet (−0.014, 95% CI −0.137 to 0.108) and insomnia (+0.061, 95% CI −0.091 to 0.217) showed no significant net directionality because their confidence intervals included zero. </w:t>
       </w:r>
     </w:p>
     <w:p>
@@ -814,27 +1148,30 @@
           <w:rFonts w:hint="eastAsia"/>
           <w:highlight w:val="none"/>
         </w:rPr>
-        <w:t>Examination of the individual cross-domain paths reinforced this pattern. Emotional distress predicted later change in problematic digital use (DASS→CIAS, β=0.160), insomnia (DASS→ISI, β=0.151), broad SDQ difficulties (DASS→SDQ, β=0.120) and diet (DASS→DIET, β=0.108). The similarly strong reciprocal path from insomnia to emotional distress (ISI→DASS, β=0.150) indicated a feedback relationship between these two domains, although the broader outgoing pattern remained centred on emotional distress. This ranking remained unchanged in sensitivity analyses restricted to Bonferroni-significant cross-domain paths, adjusted for age, sex and grade, accounting for clustering within schools, and excluding diet (Supplementary Tables S11–S13). Taken together, emotional distress emerged as the principal temporal driver of change across the SEARCH symptom system, whereas problematic digital use did not occupy a significant upstream position.</w:t>
+        <w:t>This domain-level pattern was also evident in the individual cross-domain paths. Emotional distress predicted later change in problematic digital use (DASS→CIAS, β=0.160), insomnia (DASS→ISI, β=0.151), broad SDQ difficulties (DASS→SDQ, β=0.120) and diet (DASS→DIET, β=0.108). The similarly strong reciprocal path from insomnia to emotional distress (ISI→DASS, β=0.150) indicated reciprocal prospective prediction between these two domains, while emotional distress retained the strongest positive net directionality. Emotional distress retained the strongest net source position in sensitivity analyses restricted to Bonferroni-significant cross-domain paths, adjusted for age, sex and grade, accounting for clustering within schools, and excluding diet (Supplementary Tables S13). Across these analyses, emotional distress was the leading longitudinal predictor in SEARCH; problematic digital use showed no clear net directionality.</w:t>
       </w:r>
     </w:p>
     <w:p>
       <w:pPr>
         <w:rPr>
+          <w:rFonts w:hint="eastAsia" w:eastAsia="宋体"/>
           <w:b/>
           <w:highlight w:val="none"/>
+          <w:lang w:eastAsia="zh-CN"/>
         </w:rPr>
       </w:pPr>
       <w:r>
         <w:rPr>
           <w:rFonts w:hint="eastAsia" w:eastAsia="宋体"/>
+          <w:b/>
           <w:highlight w:val="none"/>
           <w:lang w:eastAsia="zh-CN"/>
         </w:rPr>
         <w:drawing>
           <wp:inline distT="0" distB="0" distL="114300" distR="114300">
-            <wp:extent cx="5684520" cy="3032760"/>
-            <wp:effectExtent l="0" t="0" r="0" b="0"/>
-            <wp:docPr id="1" name="图片 1" descr="Figure_1"/>
+            <wp:extent cx="5845810" cy="3188335"/>
+            <wp:effectExtent l="0" t="0" r="8890" b="12065"/>
+            <wp:docPr id="5" name="图片 5" descr="Figure_1"/>
             <wp:cNvGraphicFramePr>
               <a:graphicFrameLocks xmlns:a="http://schemas.openxmlformats.org/drawingml/2006/main" noChangeAspect="1"/>
             </wp:cNvGraphicFramePr>
@@ -842,7 +1179,7 @@
               <a:graphicData uri="http://schemas.openxmlformats.org/drawingml/2006/picture">
                 <pic:pic xmlns:pic="http://schemas.openxmlformats.org/drawingml/2006/picture">
                   <pic:nvPicPr>
-                    <pic:cNvPr id="1" name="图片 1" descr="Figure_1"/>
+                    <pic:cNvPr id="5" name="图片 5" descr="Figure_1"/>
                     <pic:cNvPicPr>
                       <a:picLocks noChangeAspect="1"/>
                     </pic:cNvPicPr>
@@ -856,7 +1193,7 @@
                   <pic:spPr>
                     <a:xfrm>
                       <a:off x="0" y="0"/>
-                      <a:ext cx="5684520" cy="3032760"/>
+                      <a:ext cx="5845810" cy="3188335"/>
                     </a:xfrm>
                     <a:prstGeom prst="rect">
                       <a:avLst/>
@@ -889,7 +1226,7 @@
           <w:rFonts w:hint="eastAsia"/>
           <w:highlight w:val="none"/>
         </w:rPr>
-        <w:t>Longitudinal cross-lagged network in SEARCH. (a) Standardised coefficients from each Wave-1 (baseline) domain (rows) to each Wave-3 (approximately one-year follow-up) domain (columns); diagonal entries are autoregressive effects, and asterisks denote Bonferroni-significant paths. (b) Directed network of significant cross-lagged effects. (c) Net temporal directionality, calculated as absolute cross-lagged out-strength minus in-strength, with 95% bootstrap confidence intervals. Positive values indicate greater outgoing than incoming prediction. CIAS, generalised problematic digital use; DASS, emotional distress; SDQ, broad SDQ difficulties; DIET, diet; ISI, insomnia; ACT, physical activity. N = 6,092.</w:t>
+        <w:t>Longitudinal cross-lagged network in SEARCH(a) Standardised coefficients from each Wave 1 domain to each Wave 3 domain; diagonal entries are autoregressive effects, and asterisks indicate nominal P &lt; 0.05 without multiplicity adjustment. (b) Directed network displaying cross-lagged paths with nominal P &lt; 0.05 and |β| ≥ 0.08. This display threshold was used for visual clarity. (c) CLPN net directionality, calculated as absolute cross-lagged out-strength minus in-strength, with 95% bootstrap confidence intervals. CIAS, generalised problematic digital use; DASS, emotional distress; SDQ, broad SDQ difficulties; DIET, diet; ISI, insomnia; ACT, physical activity. N = 6,092.</w:t>
       </w:r>
     </w:p>
     <w:p>
@@ -902,9 +1239,26 @@
       </w:pPr>
       <w:r>
         <w:rPr>
-          <w:highlight w:val="none"/>
-        </w:rPr>
-        <w:t>Social-media use and gaming are downstream in the UK cohort</w:t>
+          <w:rFonts w:hint="eastAsia" w:eastAsia="宋体"/>
+          <w:highlight w:val="none"/>
+          <w:lang w:val="en-US" w:eastAsia="zh-CN"/>
+        </w:rPr>
+        <w:t>S</w:t>
+      </w:r>
+      <w:r>
+        <w:rPr>
+          <w:rFonts w:hint="eastAsia" w:eastAsia="宋体"/>
+          <w:highlight w:val="none"/>
+          <w:lang w:eastAsia="zh-CN"/>
+        </w:rPr>
+        <w:t>ocial media use</w:t>
+      </w:r>
+      <w:r>
+        <w:rPr>
+          <w:rFonts w:hint="eastAsia"/>
+          <w:highlight w:val="none"/>
+        </w:rPr>
+        <w:t xml:space="preserve"> and gaming occupy net sink positions in the UK cohort</w:t>
       </w:r>
     </w:p>
     <w:p>
@@ -919,7 +1273,37 @@
           <w:rFonts w:hint="eastAsia"/>
           <w:highlight w:val="none"/>
         </w:rPr>
-        <w:t>SEARCH placed emotional distress, rather than problematic digital use, at the head of subsequent system-level change. We therefore tested whether screen-related behaviours likewise remained outside the leading upstream position in the independent UK Millennium Cohort Study (MCS), which followed adolescents from age 14 to 17 and directly measured social-media use and electronic gaming. Among 9,520 cohort members linked across the two ages, 7,838 had complete data across all six domains and entered the longitudinal network. The resulting pattern placed screen-related behaviours firmly on the receiving side of the system: social-media use was the strongest net sink (−0.211, 95% CI −0.260 to −0.139), gaming was also downstream (−0.089, 95% CI −0.149 to −0.020), and peer problems formed a further sink (−0.080, 95% CI −0.161 to −0.004; Fig. 2).</w:t>
+        <w:t>In SEARCH, emotional distress occupied the strongest net source position, whereas problematic digital use showed no significant net directionality. We next tested this longitudinal ordering in the independent UK Millennium Cohort Study (MCS), which followed adolescents from age 14 to 17 and directly measured social media use and electronic gaming.</w:t>
+      </w:r>
+      <w:r>
+        <w:rPr>
+          <w:rFonts w:hint="eastAsia" w:eastAsia="宋体"/>
+          <w:highlight w:val="none"/>
+          <w:lang w:val="en-US" w:eastAsia="zh-CN"/>
+        </w:rPr>
+        <w:t xml:space="preserve"> </w:t>
+      </w:r>
+      <w:r>
+        <w:rPr>
+          <w:rFonts w:hint="eastAsia"/>
+          <w:highlight w:val="none"/>
+        </w:rPr>
+        <w:t xml:space="preserve">Among 9,520 cohort members linked across the two ages, 7,838 had complete data across all six domains and entered the CLPN analysis. The resulting pattern placed screen-related behaviours in net sink positions: </w:t>
+      </w:r>
+      <w:r>
+        <w:rPr>
+          <w:rFonts w:hint="eastAsia" w:eastAsia="宋体"/>
+          <w:highlight w:val="none"/>
+          <w:lang w:eastAsia="zh-CN"/>
+        </w:rPr>
+        <w:t>social media use</w:t>
+      </w:r>
+      <w:r>
+        <w:rPr>
+          <w:rFonts w:hint="eastAsia"/>
+          <w:highlight w:val="none"/>
+        </w:rPr>
+        <w:t xml:space="preserve"> was the strongest net sink (−0.211, 95% CI −0.260 to −0.139), while gaming (−0.089, 95% CI −0.149 to −0.020) and peer problems (−0.080, 95% CI −0.161 to −0.004; Fig. 2) also occupied net sink positions.</w:t>
       </w:r>
     </w:p>
     <w:p>
@@ -934,8 +1318,70 @@
           <w:rFonts w:hint="eastAsia"/>
           <w:highlight w:val="none"/>
         </w:rPr>
-        <w:t>On the source side, hyperactivity/inattention was the leading temporal driver (+0.177, 95% CI 0.105 to 0.255), followed by self-reported internalising distress (+0.105, 95% CI 0.023 to 0.154) and conduct problems (+0.098, 95% CI 0.015 to 0.191). These broader difficulties drove the strongest paths into later screen-related behaviour: hyperactivity/inattention predicted gaming (β = 0.137) and social-media use (β = 0.112), while conduct problems predicted both social-media use (β = 0.080) and gaming (β = 0.060). The MCS findings therefore extended the SEARCH pattern rather than simply reproducing it. Emotional distress was the principal temporal driver in SEARCH; in MCS, the upstream position broadened to include both internalising and externalising difficulties, with hyperactivity/inattention leading. Across both cohorts, the core ordering was consistent: screen-related behaviours did not drive broader system-level change, remaining directionally neutral in SEARCH and moving downstream in MCS.</w:t>
-      </w:r>
+        <w:t>Among the net source positions, hyperactivity/inattention was the strongest (+0.177, 95% CI 0.105 to 0.255), followed by self-reported internalising distress (+0.105, 95% CI 0.023 to 0.154) and conduct problems (+0.098, 95% CI 0.015 to 0.191). The strongest prospective paths to later screen-related behaviour originated from these broader difficulties</w:t>
+      </w:r>
+      <w:r>
+        <w:rPr>
+          <w:rFonts w:hint="eastAsia" w:eastAsia="宋体"/>
+          <w:highlight w:val="none"/>
+          <w:lang w:val="en-US" w:eastAsia="zh-CN"/>
+        </w:rPr>
+        <w:t>:</w:t>
+      </w:r>
+      <w:r>
+        <w:rPr>
+          <w:rFonts w:hint="eastAsia"/>
+          <w:highlight w:val="none"/>
+        </w:rPr>
+        <w:t xml:space="preserve"> hyperactivity/inattention predicted gaming (β = 0.137) and </w:t>
+      </w:r>
+      <w:r>
+        <w:rPr>
+          <w:rFonts w:hint="eastAsia" w:eastAsia="宋体"/>
+          <w:highlight w:val="none"/>
+          <w:lang w:eastAsia="zh-CN"/>
+        </w:rPr>
+        <w:t>social media use</w:t>
+      </w:r>
+      <w:r>
+        <w:rPr>
+          <w:rFonts w:hint="eastAsia"/>
+          <w:highlight w:val="none"/>
+        </w:rPr>
+        <w:t xml:space="preserve"> (β = 0.112), while conduct problems predicted both </w:t>
+      </w:r>
+      <w:r>
+        <w:rPr>
+          <w:rFonts w:hint="eastAsia" w:eastAsia="宋体"/>
+          <w:highlight w:val="none"/>
+          <w:lang w:eastAsia="zh-CN"/>
+        </w:rPr>
+        <w:t>social media use</w:t>
+      </w:r>
+      <w:r>
+        <w:rPr>
+          <w:rFonts w:hint="eastAsia"/>
+          <w:highlight w:val="none"/>
+        </w:rPr>
+        <w:t xml:space="preserve"> (β = 0.080) and gaming (β = 0.060). The MCS results broadened the SEARCH pattern: emotional distress was the strongest net source in SEARCH, while MCS identified both internalising and externalising net source positions, led by hyperactivity/inattention. Across both cohorts, the core ordering was consistent: screen-related behaviours did not occupy leading net source positions, with problematic digital use showing no significant net directionality in SEARCH and </w:t>
+      </w:r>
+      <w:r>
+        <w:rPr>
+          <w:rFonts w:hint="eastAsia" w:eastAsia="宋体"/>
+          <w:highlight w:val="none"/>
+          <w:lang w:eastAsia="zh-CN"/>
+        </w:rPr>
+        <w:t>social media use</w:t>
+      </w:r>
+      <w:r>
+        <w:rPr>
+          <w:rFonts w:hint="eastAsia"/>
+          <w:highlight w:val="none"/>
+        </w:rPr>
+        <w:t xml:space="preserve"> and gaming occupying net sink positions in MCS.</w:t>
+      </w:r>
+      <w:bookmarkStart w:id="0" w:name="_GoBack"/>
+      <w:bookmarkEnd w:id="0"/>
     </w:p>
     <w:p>
       <w:pPr>
@@ -953,9 +1399,9 @@
         </w:rPr>
         <w:drawing>
           <wp:inline distT="0" distB="0" distL="114300" distR="114300">
-            <wp:extent cx="5970905" cy="2724785"/>
-            <wp:effectExtent l="0" t="0" r="3175" b="3175"/>
-            <wp:docPr id="2" name="图片 2" descr="D:/ALLpostgraduate/research/A/npj_MHR_submission_revised/npj_MHR_submission_revised/03_Figures/Main/PNG/Figure_2.pngFigure_2"/>
+            <wp:extent cx="5843270" cy="2715895"/>
+            <wp:effectExtent l="0" t="0" r="11430" b="1905"/>
+            <wp:docPr id="1" name="图片 1" descr="Figure_2"/>
             <wp:cNvGraphicFramePr>
               <a:graphicFrameLocks xmlns:a="http://schemas.openxmlformats.org/drawingml/2006/main" noChangeAspect="1"/>
             </wp:cNvGraphicFramePr>
@@ -963,14 +1409,13 @@
               <a:graphicData uri="http://schemas.openxmlformats.org/drawingml/2006/picture">
                 <pic:pic xmlns:pic="http://schemas.openxmlformats.org/drawingml/2006/picture">
                   <pic:nvPicPr>
-                    <pic:cNvPr id="2" name="图片 2" descr="D:/ALLpostgraduate/research/A/npj_MHR_submission_revised/npj_MHR_submission_revised/03_Figures/Main/PNG/Figure_2.pngFigure_2"/>
+                    <pic:cNvPr id="1" name="图片 1" descr="Figure_2"/>
                     <pic:cNvPicPr>
                       <a:picLocks noChangeAspect="1"/>
                     </pic:cNvPicPr>
                   </pic:nvPicPr>
                   <pic:blipFill>
                     <a:blip r:embed="rId9"/>
-                    <a:srcRect t="909" b="909"/>
                     <a:stretch>
                       <a:fillRect/>
                     </a:stretch>
@@ -978,7 +1423,7 @@
                   <pic:spPr>
                     <a:xfrm>
                       <a:off x="0" y="0"/>
-                      <a:ext cx="5970905" cy="2724785"/>
+                      <a:ext cx="5843270" cy="2715895"/>
                     </a:xfrm>
                     <a:prstGeom prst="rect">
                       <a:avLst/>
@@ -1015,7 +1460,52 @@
           <w:rFonts w:hint="eastAsia"/>
           <w:highlight w:val="none"/>
         </w:rPr>
-        <w:t xml:space="preserve"> | Longitudinal directionality in the UK Millennium Cohort Study. (a) Net temporal directionality from age 14 to age 17, calculated as absolute cross-lagged out-strength minus in-strength, with 95% bootstrap confidence intervals. Positive values indicate a stronger balance of outgoing over incoming prediction. (b) Directed temporal network showing cross-lagged paths with |β| ≥ 0.05; this display threshold was used for visual clarity and does not denote statistical significance. Red and blue edges indicate positive and negative coefficients, respectively. (c) Cross-cohort comparison of temporal source and screen-related positions. SEARCH uses DASS-21 for emotional distress and CIAS-R for generalised problematic digital use; MCS uses self-reported internalising distress and direct measures of social-media use and gaming. The comparison concerns directional position across corresponding constructs rather than measurement equivalence. N = 9,520 linked across ages 14 and 17; n = 7,838 complete cases included in the cross-lagged analysis.</w:t>
+        <w:t xml:space="preserve"> | Longitudinal directionality in the UK Millennium Cohort Study. (a) </w:t>
+      </w:r>
+      <w:r>
+        <w:rPr>
+          <w:rFonts w:hint="eastAsia" w:eastAsia="宋体"/>
+          <w:highlight w:val="none"/>
+          <w:lang w:eastAsia="zh-CN"/>
+        </w:rPr>
+        <w:t>CLPN net directionality</w:t>
+      </w:r>
+      <w:r>
+        <w:rPr>
+          <w:rFonts w:hint="eastAsia"/>
+          <w:highlight w:val="none"/>
+        </w:rPr>
+        <w:t xml:space="preserve"> from age 14 to age 17, calculated as absolute cross-lagged out-strength minus in-strength, with 95% bootstrap confidence intervals. Positive values indicate a stronger balance of outgoing over incoming prediction. (b) Directed temporal network showing cross-lagged paths with |β| ≥ 0.05; this display threshold was used for visual clarity and does not denote statistical significance. Red and blue edges indicate positive and negative coefficients, respectively. (c) Cross-cohort comparison of CLPN net directionality for psychological and screen-related domains. SEARCH uses DASS-21 for emotional distress and CIAS-R for generalised problematic digital use; MCS uses self-reported internalising distress and direct measures of </w:t>
+      </w:r>
+      <w:r>
+        <w:rPr>
+          <w:rFonts w:hint="eastAsia" w:eastAsia="宋体"/>
+          <w:highlight w:val="none"/>
+          <w:lang w:eastAsia="zh-CN"/>
+        </w:rPr>
+        <w:t>social media use</w:t>
+      </w:r>
+      <w:r>
+        <w:rPr>
+          <w:rFonts w:hint="eastAsia"/>
+          <w:highlight w:val="none"/>
+        </w:rPr>
+        <w:t xml:space="preserve"> and gaming.</w:t>
+      </w:r>
+      <w:r>
+        <w:rPr>
+          <w:rFonts w:hint="eastAsia" w:eastAsia="宋体"/>
+          <w:highlight w:val="none"/>
+          <w:lang w:val="en-US" w:eastAsia="zh-CN"/>
+        </w:rPr>
+        <w:t xml:space="preserve"> </w:t>
+      </w:r>
+      <w:r>
+        <w:rPr>
+          <w:rFonts w:hint="eastAsia"/>
+          <w:highlight w:val="none"/>
+        </w:rPr>
+        <w:t>N = 9,520 linked across ages 14 and 17; n = 7,838 complete cases included in the cross-lagged analysis.</w:t>
       </w:r>
     </w:p>
     <w:p>
@@ -1045,7 +1535,37 @@
           <w:rFonts w:hint="eastAsia"/>
           <w:highlight w:val="none"/>
         </w:rPr>
-        <w:t>The longitudinal analyses in SEARCH and MCS placed screen-related behaviours outside the leading upstream position. We therefore returned to the baseline SEARCH network to determine where structural leverage lay at the item level. The network contained 104 items connected by 2,777 non-zero edges (density = 0.518, modularity = 0.443, global efficiency = 0.759). Despite this dense interconnection, its structural coverage was concentrated in a remarkably compact set: ten equivalent minimum dominating sets were identified, each containing only three nodes capable of covering the remaining network through their immediate neighbourhoods. Across these solutions, the most recurrent control nodes were DIET22 (worry about eating too much; control frequency = 0.60), SDQ18 (often lies or cheats; 0.50) and DASS14 (intolerance of interruption; 0.40; Fig. 3). The leading control positions therefore arose from diet, behavioural and emotional symptoms, whereas no CIAS item ranked among the three highest-frequency control nodes. These structural-control nodes were not simply the most highly connected symptoms: control frequency correlated only weakly with node strength (Spearman ρ = 0.061) and loaded on a separate component from conventional centrality measures (Supplementary Fig. S15 and Table S10). Structural coverage and network connectedness therefore identified distinct symptom roles.</w:t>
+        <w:t>The longitudinal analyses in SEARCH and MCS placed screen-related behaviours outside the leading CLPN net source positions. We next examined the baseline SEARCH network to identify item-level structural-control positions. The network contained 104 items connected by 2,777 non-zero edges (density = 0.518, modularity = 0.443, global efficiency = 0.759). Despite the dense interconnection, ten equivalent MDS solutions were identified, each comprising three nodes whose immediate neighbourhoods covered the remaining network. Across these solutions, the most recurrent control nodes were DIET22 (worry about eating too much; control frequency = 0.60), SDQ18 (often lies or cheats; 0.50) and DASS14 (intolerance of interruption; 0.40; Fig. 3). The leading control positions arose from diet, behavioural and emotional symptoms. No CIAS item ranked among the three highest-frequency control nodes.</w:t>
+      </w:r>
+      <w:r>
+        <w:rPr>
+          <w:rFonts w:hint="eastAsia" w:eastAsia="宋体"/>
+          <w:highlight w:val="none"/>
+          <w:lang w:val="en-US" w:eastAsia="zh-CN"/>
+        </w:rPr>
+        <w:t xml:space="preserve"> </w:t>
+      </w:r>
+      <w:r>
+        <w:rPr>
+          <w:rFonts w:hint="eastAsia"/>
+          <w:highlight w:val="none"/>
+        </w:rPr>
+        <w:t>These structural-control nodes were not the most highly connected symptoms</w:t>
+      </w:r>
+      <w:r>
+        <w:rPr>
+          <w:rFonts w:hint="eastAsia" w:eastAsia="宋体"/>
+          <w:highlight w:val="none"/>
+          <w:lang w:val="en-US" w:eastAsia="zh-CN"/>
+        </w:rPr>
+        <w:t>:</w:t>
+      </w:r>
+      <w:r>
+        <w:rPr>
+          <w:rFonts w:hint="eastAsia"/>
+          <w:highlight w:val="none"/>
+        </w:rPr>
+        <w:t xml:space="preserve"> control frequency correlated only weakly with node strength (Spearman ρ = 0.061) and loaded on a separate component from conventional centrality measures (Supplementary Fig. S15 and Table S10). Structural coverage and network connectedness identified distinct symptom roles.</w:t>
       </w:r>
     </w:p>
     <w:p>
@@ -1060,7 +1580,37 @@
           <w:rFonts w:hint="eastAsia"/>
           <w:highlight w:val="none"/>
         </w:rPr>
-        <w:t>Null-model analyses clarified that the distinctive finding lay in the identities of the control nodes rather than simply in the small size of the dominating set. A three-node minimum set was compatible with the network’s degree sequence and was not itself exceptional. DIET22, SDQ18 and DASS14 nevertheless entered the observed solutions more frequently than expected from their node-specific null domination frequencies of 0.186, 0.252 and 0.246, respectively (Supplementary Fig. S19). The exact solution remained sensitive to network estimation: sparser EBIC graphical-lasso networks produced minimum dominating sets containing five or six nodes and altered their membership rankings, whereas the primary cross-validated network retained the three-node solution (Supplementary Table S17 and Fig. S20).</w:t>
+        <w:t>Null-model analyses showed that the distinctive finding concerned control-node identity, not MDS size. A three-node minimum set was compatible with the network</w:t>
+      </w:r>
+      <w:r>
+        <w:rPr>
+          <w:rFonts w:hint="default" w:eastAsia="宋体"/>
+          <w:highlight w:val="none"/>
+          <w:lang w:val="en-US" w:eastAsia="zh-CN"/>
+        </w:rPr>
+        <w:t>’</w:t>
+      </w:r>
+      <w:r>
+        <w:rPr>
+          <w:rFonts w:hint="eastAsia"/>
+          <w:highlight w:val="none"/>
+        </w:rPr>
+        <w:t>s degree sequence and was not itself exceptional. DIET22, SDQ18 and DASS14 nevertheless entered the observed solutions more frequently than expected from their node-specific null domination frequencies of 0.186, 0.252 and 0.246, respectively (Supplementary Fig. S19). The exact solution remained sensitive to network estimation. Sparser EBIC graphical lasso networks produced five- or six-node MDS solutions and altered membership rankings. The primary cross-validated network retained the three-node solution</w:t>
+      </w:r>
+      <w:r>
+        <w:rPr>
+          <w:rFonts w:hint="eastAsia" w:eastAsia="宋体"/>
+          <w:highlight w:val="none"/>
+          <w:lang w:val="en-US" w:eastAsia="zh-CN"/>
+        </w:rPr>
+        <w:t xml:space="preserve"> </w:t>
+      </w:r>
+      <w:r>
+        <w:rPr>
+          <w:rFonts w:hint="eastAsia"/>
+          <w:highlight w:val="none"/>
+        </w:rPr>
+        <w:t>(Supplementary Table S17 and Fig. S20).</w:t>
       </w:r>
     </w:p>
     <w:p>
@@ -1075,7 +1625,22 @@
           <w:rFonts w:hint="eastAsia"/>
           <w:highlight w:val="none"/>
         </w:rPr>
-        <w:t>At the broader domain level, diet and broad SDQ difficulties occupied the strongest structural source-side positions, emotional distress and problematic digital use formed an intermediate layer, and physical activity and insomnia occupied the weakest positions. This static architecture did not reproduce the longitudinal hierarchy. Emotional distress held only an intermediate structural position but emerged as the leading temporal source, whereas problematic digital use remained intermediate in the static network and showed no significant net temporal directionality. Structural leverage and temporal driving therefore captured different dimensions of the symptom system.</w:t>
+        <w:t>At the broader domain level, diet and broad SDQ difficulties occupied the strongest structural-control positions, emotional distress and problematic digital use formed an intermediate layer, and physical activity and insomnia occupied the weakest positions. This static architecture did not reproduce the longitudinal hierarchy. Emotional distress held an intermediate structural position but occupied the strongest CLPN net source position. Problematic digital use remained intermediate in the static network and showed no significant CLPN net directionality</w:t>
+      </w:r>
+      <w:r>
+        <w:rPr>
+          <w:rFonts w:hint="eastAsia" w:eastAsia="宋体"/>
+          <w:highlight w:val="none"/>
+          <w:lang w:val="en-US" w:eastAsia="zh-CN"/>
+        </w:rPr>
+        <w:t>.</w:t>
+      </w:r>
+      <w:r>
+        <w:rPr>
+          <w:rFonts w:hint="eastAsia"/>
+          <w:highlight w:val="none"/>
+        </w:rPr>
+        <w:t xml:space="preserve"> Static structural leverage and CLPN net directionality captured different dimensions of the symptom system.</w:t>
       </w:r>
     </w:p>
     <w:p>
@@ -1122,7 +1687,7 @@
           <w:rFonts w:hint="eastAsia"/>
           <w:highlight w:val="none"/>
         </w:rPr>
-        <w:t>, reinforcing the distinction between symptoms that connect domains and those that govern coverage of the wider network. Together, these findings establish the six-domain architecture and its distinct structural-control dimension as reproducible features of the SEARCH symptom system, while localising estimator sensitivity to the membership of the specific minimum-dominating-set solution.</w:t>
+        <w:t>, reinforcing the distinction between symptoms that connect domains and those that govern coverage of the wider network. Together, these findings support the stability of the six-domain architecture and its distinct structural-control dimension, while localising estimator sensitivity to the membership of individual MDS solutions.</w:t>
       </w:r>
     </w:p>
     <w:p>
@@ -1142,9 +1707,9 @@
         </w:rPr>
         <w:drawing>
           <wp:inline distT="0" distB="0" distL="114300" distR="114300">
-            <wp:extent cx="5193665" cy="2371725"/>
-            <wp:effectExtent l="0" t="0" r="3175" b="5715"/>
-            <wp:docPr id="3" name="图片 3" descr="Figure_3"/>
+            <wp:extent cx="5626735" cy="2569210"/>
+            <wp:effectExtent l="0" t="0" r="12065" b="8890"/>
+            <wp:docPr id="8" name="图片 8" descr="Figure_3"/>
             <wp:cNvGraphicFramePr>
               <a:graphicFrameLocks xmlns:a="http://schemas.openxmlformats.org/drawingml/2006/main" noChangeAspect="1"/>
             </wp:cNvGraphicFramePr>
@@ -1152,7 +1717,7 @@
               <a:graphicData uri="http://schemas.openxmlformats.org/drawingml/2006/picture">
                 <pic:pic xmlns:pic="http://schemas.openxmlformats.org/drawingml/2006/picture">
                   <pic:nvPicPr>
-                    <pic:cNvPr id="3" name="图片 3" descr="Figure_3"/>
+                    <pic:cNvPr id="8" name="图片 8" descr="Figure_3"/>
                     <pic:cNvPicPr>
                       <a:picLocks noChangeAspect="1"/>
                     </pic:cNvPicPr>
@@ -1166,7 +1731,7 @@
                   <pic:spPr>
                     <a:xfrm>
                       <a:off x="0" y="0"/>
-                      <a:ext cx="5193665" cy="2371725"/>
+                      <a:ext cx="5626735" cy="2569210"/>
                     </a:xfrm>
                     <a:prstGeom prst="rect">
                       <a:avLst/>
@@ -1200,7 +1765,33 @@
         <w:rPr>
           <w:highlight w:val="none"/>
         </w:rPr>
-        <w:t>Baseline structural network and structural-control profile in SEARCH. (a) Gaussian graphical model showing the 500 largest edges; node colour denotes domain, node size denotes strength and rings identify the three highest control-frequency nodes. (b) Node strength versus control frequency. (c) Average module control out-strength. Structural-control quantities describe graph topology and are not temporal or causal effects. N = 10,356.</w:t>
+        <w:t xml:space="preserve">Baseline structural network and structural-control profile in SEARCH. (a) Gaussian graphical model showing the 500 largest edges; node colour denotes domain, node size denotes strength and rings identify the three highest control-frequency nodes. (b) Node strength versus control frequency. (c) </w:t>
+      </w:r>
+      <w:r>
+        <w:rPr>
+          <w:rFonts w:hint="eastAsia"/>
+          <w:highlight w:val="none"/>
+        </w:rPr>
+        <w:t>Average module control strength (AMCS) across the six domains</w:t>
+      </w:r>
+      <w:r>
+        <w:rPr>
+          <w:highlight w:val="none"/>
+        </w:rPr>
+        <w:t xml:space="preserve">. </w:t>
+      </w:r>
+      <w:r>
+        <w:rPr>
+          <w:rFonts w:hint="eastAsia"/>
+          <w:highlight w:val="none"/>
+        </w:rPr>
+        <w:t>Structural-control quantities describe the topology of the baseline undirected graph.</w:t>
+      </w:r>
+      <w:r>
+        <w:rPr>
+          <w:highlight w:val="none"/>
+        </w:rPr>
+        <w:t xml:space="preserve"> N = 10,356.</w:t>
       </w:r>
       <w:r>
         <w:rPr>
@@ -1226,15 +1817,7 @@
           <w:rFonts w:hint="eastAsia"/>
           <w:highlight w:val="none"/>
         </w:rPr>
-        <w:t>Bayesian directionality converges with the longitudinal ordering in SEAR</w:t>
-      </w:r>
-      <w:r>
-        <w:rPr>
-          <w:rFonts w:hint="eastAsia" w:eastAsia="宋体"/>
-          <w:highlight w:val="none"/>
-          <w:lang w:val="en-US" w:eastAsia="zh-CN"/>
-        </w:rPr>
-        <w:t>CH</w:t>
+        <w:t>Bayesian and CLPN rankings partially align</w:t>
       </w:r>
     </w:p>
     <w:p>
@@ -1249,7 +1832,7 @@
           <w:rFonts w:hint="eastAsia"/>
           <w:highlight w:val="none"/>
         </w:rPr>
-        <w:t>An exploratory Bayesian directed acyclic graph fitted to the six Wave 1 SEARCH domain scores converged on the DASS-outgoing ordering identified in the longitudinal analysis. DASS had the highest net out-degree (+2), with outgoing edges to SDQ, CIAS and DIET. By contrast, CIAS had balanced in- and out-degree, while DIET occupied the strongest receiving position, with the most negative net out-degree (−2; Fig. 4). The most stable directed edges were CIAS→ACT (bootstrap frequency = 0.970), DASS→SDQ (0.910), CIAS→DIET (0.905), DASS→DIET (0.855) and DASS→CIAS (0.850). Three of these five leading edges originated from DASS, reinforcing the source-side position of emotional distress.</w:t>
+        <w:t>An exploratory Bayesian directed acyclic graph fitted to the six Wave 1 SEARCH domain scores was used to compare Bayesian net out-degree with CLPN ordering. DASS had the highest net out-degree (+2), with outgoing edges to SDQ, CIAS and DIET. By contrast, CIAS had balanced in- and out-degree, while DIET had the most negative Bayesian net out-degree (−2; Fig. 4). The most stable directed edges were CIAS→ACT (bootstrap frequency = 0.970), DASS→SDQ (0.910), CIAS→DIET (0.905), DASS→DIET (0.855) and DASS→CIAS (0.850). Three of these five leading edges originated from DASS.</w:t>
       </w:r>
     </w:p>
     <w:p>
@@ -1264,7 +1847,22 @@
           <w:rFonts w:hint="eastAsia"/>
           <w:highlight w:val="none"/>
         </w:rPr>
-        <w:t>Across the six domains, Bayesian net out-degree was positively correlated with longitudinal net directionality, although the estimate was imprecise (Pearson r = 0.750, two-sided P = 0.086; bootstrap 95% CI −0.604 to 0.995). DASS was on the source side in both models. All seven skeleton edges were reversible in the CPDAG (Supplementary Tables S15–S16). This analysis therefore provides within-sample descriptive agreement rather than independent evidence about causal direction.</w:t>
+        <w:t>Across the six domains, Bayesian net out-degree was positively correlated with CLPN net directionality, although the estimate was imprecise (Pearson r = 0.750, two-sided P = 0.086; bootstrap 95% CI −0.604 to 0.995). DASS had</w:t>
+      </w:r>
+      <w:r>
+        <w:rPr>
+          <w:rFonts w:hint="eastAsia" w:eastAsia="宋体"/>
+          <w:highlight w:val="none"/>
+          <w:lang w:val="en-US" w:eastAsia="zh-CN"/>
+        </w:rPr>
+        <w:t xml:space="preserve"> a</w:t>
+      </w:r>
+      <w:r>
+        <w:rPr>
+          <w:rFonts w:hint="eastAsia"/>
+          <w:highlight w:val="none"/>
+        </w:rPr>
+        <w:t xml:space="preserve"> positive Bayesian net out-degree and occupied the strongest CLPN net source position. All seven skeleton edges were reversible in the CPDAG (Supplementary Tables S15–S16). These results show partial correspondence in domain ordering between the Bayesian and CLPN models.</w:t>
       </w:r>
     </w:p>
     <w:p>
@@ -1283,9 +1881,9 @@
         </w:rPr>
         <w:drawing>
           <wp:inline distT="0" distB="0" distL="114300" distR="114300">
-            <wp:extent cx="5972810" cy="2787650"/>
-            <wp:effectExtent l="0" t="0" r="1270" b="1270"/>
-            <wp:docPr id="4" name="图片 4" descr="D:/ALLpostgraduate/research/A/npj_MHR_submission_revised/npj_MHR_submission_revised/03_Figures/Main/PNG/Figure_4.pngFigure_4"/>
+            <wp:extent cx="5797550" cy="2825750"/>
+            <wp:effectExtent l="0" t="0" r="6350" b="6350"/>
+            <wp:docPr id="9" name="图片 9" descr="Figure_4"/>
             <wp:cNvGraphicFramePr>
               <a:graphicFrameLocks xmlns:a="http://schemas.openxmlformats.org/drawingml/2006/main" noChangeAspect="1"/>
             </wp:cNvGraphicFramePr>
@@ -1293,14 +1891,13 @@
               <a:graphicData uri="http://schemas.openxmlformats.org/drawingml/2006/picture">
                 <pic:pic xmlns:pic="http://schemas.openxmlformats.org/drawingml/2006/picture">
                   <pic:nvPicPr>
-                    <pic:cNvPr id="4" name="图片 4" descr="D:/ALLpostgraduate/research/A/npj_MHR_submission_revised/npj_MHR_submission_revised/03_Figures/Main/PNG/Figure_4.pngFigure_4"/>
+                    <pic:cNvPr id="9" name="图片 9" descr="Figure_4"/>
                     <pic:cNvPicPr>
                       <a:picLocks noChangeAspect="1"/>
                     </pic:cNvPicPr>
                   </pic:nvPicPr>
                   <pic:blipFill>
                     <a:blip r:embed="rId11"/>
-                    <a:srcRect t="973" b="973"/>
                     <a:stretch>
                       <a:fillRect/>
                     </a:stretch>
@@ -1308,7 +1905,7 @@
                   <pic:spPr>
                     <a:xfrm>
                       <a:off x="0" y="0"/>
-                      <a:ext cx="5972810" cy="2787650"/>
+                      <a:ext cx="5797550" cy="2825750"/>
                     </a:xfrm>
                     <a:prstGeom prst="rect">
                       <a:avLst/>
@@ -1343,7 +1940,7 @@
           <w:rFonts w:hint="eastAsia"/>
           <w:highlight w:val="none"/>
         </w:rPr>
-        <w:t xml:space="preserve"> | Bayesian directionality converges with the longitudinal ordering in SEARCH. (a) Exploratory Bayesian directed acyclic graph learned from tertile-discretised baseline domain scores; edge width denotes bootstrap stability. (b) Bootstrap frequencies of the eight most stable directed edges. (c) Alignment between Bayesian net out-degree and longitudinal cross-lagged panel network net directionality across the six domains. The Bayesian graph and longitudinal network use distinct model structures and partially overlapping SEARCH samples, providing within-SEARCH convergence across modelling frameworks rather than an independent replication. CIAS, generalised problematic digital use; DASS, emotional distress; SDQ, broad difficulties; DIET, diet; ISI, insomnia; ACT, physical activity; DAG, directed acyclic graph; CLPN, cross-lagged panel network. N = 10,356 for the baseline DAG; n = 6,092 for the longitudinal CLPN; panel c contains six paired domain-level estimates.</w:t>
+        <w:t xml:space="preserve"> | Exploratory Bayesian net out-degree and CLPN net directionality in SEARCH. (a) Exploratory Bayesian directed acyclic graph learned from tertile-discretised baseline domain scores; edge width denotes bootstrap stability. (b) Bootstrap frequencies of the eight most stable directed edges. (c) Association between Bayesian net out-degree and longitudinal cross-lagged panel network net directionality across the six SEARCH domains. CIAS, generalised problematic digital use; DASS, emotional distress; SDQ, broad difficulties; DIET, diet; ISI, insomnia; ACT, physical activity; DAG, directed acyclic graph; CLPN, cross-lagged panel network. N = 10,356 for the baseline DAG; n = 6,092 for the longitudinal CLPN; panel c contains six paired domain-level estimates.</w:t>
       </w:r>
     </w:p>
     <w:p>
@@ -1356,9 +1953,25 @@
       </w:pPr>
       <w:r>
         <w:rPr>
-          <w:highlight w:val="none"/>
-        </w:rPr>
-        <w:t>Emotion is the strongest hub in a pooled multinational sample</w:t>
+          <w:rFonts w:hint="eastAsia"/>
+          <w:highlight w:val="none"/>
+        </w:rPr>
+        <w:t>Emotion ranks highest in network strength</w:t>
+      </w:r>
+      <w:r>
+        <w:rPr>
+          <w:rFonts w:hint="eastAsia" w:eastAsia="宋体"/>
+          <w:highlight w:val="none"/>
+          <w:lang w:val="en-US" w:eastAsia="zh-CN"/>
+        </w:rPr>
+        <w:t xml:space="preserve"> </w:t>
+      </w:r>
+      <w:r>
+        <w:rPr>
+          <w:rFonts w:hint="eastAsia"/>
+          <w:highlight w:val="none"/>
+        </w:rPr>
+        <w:t>in GMP</w:t>
       </w:r>
     </w:p>
     <w:p>
@@ -1371,10 +1984,18 @@
       </w:pPr>
       <w:r>
         <w:rPr>
+          <w:rFonts w:hint="eastAsia" w:eastAsia="宋体"/>
+          <w:highlight w:val="none"/>
+          <w:lang w:val="en-US" w:eastAsia="zh-CN"/>
+        </w:rPr>
+        <w:t>W</w:t>
+      </w:r>
+      <w:r>
+        <w:rPr>
           <w:rFonts w:hint="eastAsia"/>
           <w:highlight w:val="none"/>
         </w:rPr>
-        <w:t>Finally, we examined whether the emotional prominence identified in SEARCH recurred under a different measurement system and across a much broader population. The Global Mind Project (GMP) analysis included 147,506 participants aged 18–24 years with complete data across six mapped domains, drawn from a pooled sample spanning 240 countries. Emotion emerged as the dominant hub, with the highest undirected strength (0.726, 95% CI 0.714 to 0.738). It was followed by diet (0.504, 95% CI 0.493 to 0.515), activity (0.444, 95% CI 0.434 to 0.455), broad behavioural difficulties (0.409, 95% CI 0.396 to 0.424) and sleep (0.409, 95% CI 0.401 to 0.420). At the opposite end of the network, the social-media-frequency proxy had the lowest strength (0.075, 95% CI 0.065 to 0.085; Fig. 5), placing social-media frequency at the periphery of the mapped health system.</w:t>
+        <w:t>e examined whether the emotional prominence identified in SEARCH held under a different measurement system and across a much broader population. The Global Mind Project (GMP) analysis included 147,506 participants aged 18–24 years with complete data across six mapped domains from a pooled multinational sample. Emotion had the highest undirected network strength (0.726, 95% CI 0.714 to 0.738). It was followed by diet (0.504, 95% CI 0.493 to 0.515), activity (0.444, 95% CI 0.434 to 0.455), broad behavioural difficulties (0.409, 95% CI 0.396 to 0.424) and sleep (0.409, 95% CI 0.401 to 0.420). At the opposite end of the network, the social-media-frequency proxy had the lowest strength (0.075, 95% CI 0.065 to 0.085; Fig. 5), placing social-media frequency at the periphery of the mapped health system.</w:t>
       </w:r>
       <w:r>
         <w:rPr>
@@ -1382,27 +2003,45 @@
           <w:highlight w:val="none"/>
           <w:lang w:val="en-US" w:eastAsia="zh-CN"/>
         </w:rPr>
-        <w:t xml:space="preserve"> For the construct-level comparison, a corresponding six-domain SEARCH network was derived from the baseline domain scores. After conventional undirected strength was normalised within each of these separate six-domain comparison networks, emotion ranked first in both SEARCH and GMP. In SEARCH, emotion was followed by generalised problematic digital use, insomnia, broad SDQ difficulties, diet and physical activity, whereas social-media frequency remained the weakest domain in GMP (Fig. 5b). This descriptive strength comparison was distinct from the item-level structural-control analysis reported above.</w:t>
+        <w:t xml:space="preserve"> </w:t>
       </w:r>
     </w:p>
     <w:p>
       <w:pPr>
         <w:rPr>
-          <w:rFonts w:hint="eastAsia"/>
-          <w:highlight w:val="none"/>
-        </w:rPr>
-      </w:pPr>
-      <w:r>
-        <w:rPr>
-          <w:rFonts w:hint="eastAsia"/>
-          <w:highlight w:val="none"/>
-        </w:rPr>
-        <w:t>Although cross-sectional and based on social-media frequency rather than problematic-use symptoms, the GMP analysis provided cross-cultural, construct-level triangulation: emotion dominated the network under a distinct population and measurement framework, whereas social-media frequency remained peripheral. Together with the longitudinal findings from SEARCH and MCS, this multinational pattern reinforces an emotion-centred architecture in which screen-related behaviours form part of broader mental-health processes but do not occupy their principal organising position.</w:t>
+          <w:rFonts w:hint="eastAsia" w:eastAsia="宋体"/>
+          <w:highlight w:val="none"/>
+          <w:lang w:val="en-US" w:eastAsia="zh-CN"/>
+        </w:rPr>
+      </w:pPr>
+      <w:r>
+        <w:rPr>
+          <w:rFonts w:hint="eastAsia" w:eastAsia="宋体"/>
+          <w:highlight w:val="none"/>
+          <w:lang w:val="en-US" w:eastAsia="zh-CN"/>
+        </w:rPr>
+        <w:t>For the construct-level comparison, a corresponding six-domain SEARCH network was derived from the baseline domain scores. After conventional undirected strength was normalised within each of these separate six-domain comparison networks, emotion ranked first in both SEARCH and GMP. In SEARCH, emotion was followed by generalised problematic digital use, insomnia, broad SDQ difficulties, diet and physical activity. Social media frequency was the weakest domain in GMP (Fig. 5b). This descriptive strength comparison was distinct from the item-level structural-control analysis reported above.</w:t>
       </w:r>
     </w:p>
     <w:p>
       <w:pPr>
         <w:rPr>
+          <w:rFonts w:hint="eastAsia"/>
+          <w:highlight w:val="none"/>
+        </w:rPr>
+      </w:pPr>
+      <w:r>
+        <w:rPr>
+          <w:rFonts w:hint="eastAsia"/>
+          <w:highlight w:val="none"/>
+        </w:rPr>
+        <w:t>Across these distinct populations and analytical frameworks, emotional difficulties remained prominent, while screen-related measures occupied less prominent positions.</w:t>
+      </w:r>
+    </w:p>
+    <w:p>
+      <w:pPr>
+        <w:jc w:val="center"/>
+        <w:rPr>
           <w:rFonts w:hint="eastAsia" w:eastAsia="宋体"/>
           <w:highlight w:val="none"/>
           <w:lang w:eastAsia="zh-CN"/>
@@ -1416,9 +2055,9 @@
         </w:rPr>
         <w:drawing>
           <wp:inline distT="0" distB="0" distL="114300" distR="114300">
-            <wp:extent cx="5762625" cy="3033395"/>
-            <wp:effectExtent l="0" t="0" r="13335" b="14605"/>
-            <wp:docPr id="6" name="图片 6" descr="Figure_5"/>
+            <wp:extent cx="5507990" cy="2944495"/>
+            <wp:effectExtent l="0" t="0" r="3810" b="1905"/>
+            <wp:docPr id="10" name="图片 10" descr="Figure_5"/>
             <wp:cNvGraphicFramePr>
               <a:graphicFrameLocks xmlns:a="http://schemas.openxmlformats.org/drawingml/2006/main" noChangeAspect="1"/>
             </wp:cNvGraphicFramePr>
@@ -1426,7 +2065,7 @@
               <a:graphicData uri="http://schemas.openxmlformats.org/drawingml/2006/picture">
                 <pic:pic xmlns:pic="http://schemas.openxmlformats.org/drawingml/2006/picture">
                   <pic:nvPicPr>
-                    <pic:cNvPr id="6" name="图片 6" descr="Figure_5"/>
+                    <pic:cNvPr id="10" name="图片 10" descr="Figure_5"/>
                     <pic:cNvPicPr>
                       <a:picLocks noChangeAspect="1"/>
                     </pic:cNvPicPr>
@@ -1440,7 +2079,7 @@
                   <pic:spPr>
                     <a:xfrm>
                       <a:off x="0" y="0"/>
-                      <a:ext cx="5762625" cy="3033395"/>
+                      <a:ext cx="5507990" cy="2944495"/>
                     </a:xfrm>
                     <a:prstGeom prst="rect">
                       <a:avLst/>
@@ -1475,7 +2114,52 @@
           <w:rFonts w:hint="eastAsia"/>
           <w:highlight w:val="none"/>
         </w:rPr>
-        <w:t>Construct-level triangulation in the Global Mind Project. (a) Six-domain Gaussian graphical model in young adults; node size denotes domain strength. (b) Within-cohort normalised domain strength in the six-domain GMP network and a corresponding six-domain network derived from aggregated baseline SEARCH scores. Domain strengths were divided by the maximum strength within each cohort, so that the strongest domain was assigned a value of 1. Constructs were aligned for comparison, although the measures and network-estimation procedures were not identical across cohorts. (c) GMP domain strength with 95% bootstrap confidence intervals. The digital-use node in GMP represents social-media frequency rather than problematic-use symptoms. N = 147,506 participants aged 18–24 years from a pooled sample spanning 240 countries.</w:t>
+        <w:t xml:space="preserve">Cross-sectional construct-level comparison in </w:t>
+      </w:r>
+      <w:r>
+        <w:rPr>
+          <w:rFonts w:hint="eastAsia" w:eastAsia="宋体"/>
+          <w:highlight w:val="none"/>
+          <w:lang w:val="en-US" w:eastAsia="zh-CN"/>
+        </w:rPr>
+        <w:t>GMP</w:t>
+      </w:r>
+      <w:r>
+        <w:rPr>
+          <w:rFonts w:hint="eastAsia"/>
+          <w:highlight w:val="none"/>
+        </w:rPr>
+        <w:t>. (a) Six-domain Gaussian graphical model in young adults; node size denotes domain strength. (b) Within-cohort normalised domain strength in the six-domain GMP network and a corresponding six-domain network derived from aggregated baseline SEARCH scores. Domain strengths were divided by the maximum strength within each cohort, so that the strongest domain was assigned a value of 1. (c) GMP domain strength with 95% bootstrap confidence intervals. In GMP, the screen-related domain was represented by social media frequency.</w:t>
+      </w:r>
+      <w:r>
+        <w:rPr>
+          <w:rFonts w:hint="eastAsia" w:eastAsia="宋体"/>
+          <w:highlight w:val="none"/>
+          <w:lang w:val="en-US" w:eastAsia="zh-CN"/>
+        </w:rPr>
+        <w:t xml:space="preserve"> </w:t>
+      </w:r>
+      <w:r>
+        <w:rPr>
+          <w:rFonts w:hint="eastAsia"/>
+          <w:highlight w:val="none"/>
+        </w:rPr>
+        <w:t>Emotion had the highest network strength in GMP. N = 147,506 participants aged 18–24 years</w:t>
+      </w:r>
+      <w:r>
+        <w:rPr>
+          <w:rFonts w:hint="eastAsia" w:eastAsia="宋体"/>
+          <w:highlight w:val="none"/>
+          <w:lang w:val="en-US" w:eastAsia="zh-CN"/>
+        </w:rPr>
+        <w:t xml:space="preserve"> </w:t>
+      </w:r>
+      <w:r>
+        <w:rPr>
+          <w:rFonts w:hint="eastAsia"/>
+          <w:highlight w:val="none"/>
+        </w:rPr>
+        <w:t>in the pooled multinational GMP sample.</w:t>
       </w:r>
       <w:r>
         <w:rPr>
@@ -1513,7 +2197,22 @@
           <w:rFonts w:hint="eastAsia"/>
           <w:highlight w:val="none"/>
         </w:rPr>
-        <w:t>The longitudinal analyses placed broader emotional and behavioural difficulties, rather than screen-related behaviour, at the leading upstream position. In SEARCH, emotional distress had the largest net cross-lagged out-prediction and drove later change in generalised problematic digital use, insomnia, broad SDQ difficulties and diet; problematic digital use itself had no significant net directionality. In MCS, directly measured social-media use was the strongest sink and gaming was also downstream, while the upstream side included hyperactivity/inattention, internalising distress and conduct problems rather than emotional distress alone. Across cohorts, the shared pattern placed broader psychopathology upstream, although the identity of that upstream psychopathology differed. Problematic digital use, social-media use and gaming did not emerge as primary temporal sources when analysed within broader psychopathological systems.</w:t>
+        <w:t xml:space="preserve">Across both cohorts, broader emotional and behavioural difficulties were the leading longitudinal predictors; screen-related measures did not occupy leading net source positions. In SEARCH, emotional distress had the largest positive CLPN net directionality and predicted later change in generalised problematic digital use, insomnia, broad SDQ difficulties and diet; problematic digital use itself had no significant net directionality. In MCS, directly measured social media use was the strongest net sink and gaming also occupied a net sink position. The net source positions included hyperactivity/inattention, internalising distress and conduct problems, extending beyond emotional distress alone. Across cohorts, broader psychological difficulties occupied the leading net source positions, although the specific domains differed. Problematic digital use, </w:t>
+      </w:r>
+      <w:r>
+        <w:rPr>
+          <w:rFonts w:hint="eastAsia" w:eastAsia="宋体"/>
+          <w:highlight w:val="none"/>
+          <w:lang w:eastAsia="zh-CN"/>
+        </w:rPr>
+        <w:t>social media use</w:t>
+      </w:r>
+      <w:r>
+        <w:rPr>
+          <w:rFonts w:hint="eastAsia"/>
+          <w:highlight w:val="none"/>
+        </w:rPr>
+        <w:t xml:space="preserve"> and gaming did not occupy leading CLPN net source positions when analysed within broader psychological systems.</w:t>
       </w:r>
     </w:p>
     <w:p>
@@ -1528,7 +2227,7 @@
           <w:rFonts w:hint="eastAsia"/>
           <w:highlight w:val="none"/>
         </w:rPr>
-        <w:t>This distinction changes how associations between digital use and mental health should be interpreted. Elevated problematic digital-use scores mark clinically relevant functional impairment and warrant assessment in their own right, but their network position identifies digital use as part of the accompanying symptom burden rather than its initiating force. In SEARCH, the most prominent outgoing domain was emotional distress; in MCS, externalising difficulties, especially hyperactivity/inattention, drove later screen-related behaviour. Clinical and preventive assessment should therefore prioritise the emotional, attentional and conduct context of escalating digital engagement rather than treating screen exposure as an isolated upstream cause. These observational estimates establish prospective ordering rather than intervention effects, defining relations that can be tested in intervention and intensive longitudinal designs</w:t>
+        <w:t>This distinction changes how associations between digital use and mental health should be interpreted. Elevated problematic digital-use scores mark clinically relevant functional impairment and warrant assessment in their own right. Their network position also places digital use within the accompanying symptom burden, outside the leading predictive position. In SEARCH, emotional distress occupied the strongest net source position; in MCS, externalising difficulties, especially hyperactivity/inattention, predicted later screen-related behaviour. Clinical and preventive assessment should therefore prioritise the emotional, attentional and conduct context of escalating digital engagement rather than assessing screen exposure in isolation. These estimates define prospective relations that can be tested in intervention and intensive longitudinal designs</w:t>
       </w:r>
       <w:r>
         <w:rPr>
@@ -1559,7 +2258,37 @@
           <w:rFonts w:hint="eastAsia"/>
           <w:highlight w:val="none"/>
         </w:rPr>
-        <w:t>The comparison of static and temporal models provides a second contribution. Minimum-dominating-set analysis identified diet, SDQ and emotional items whose neighbourhoods covered the baseline graph, whereas cross-lagged analysis identified DASS as the leading domain-level prospective source. Control frequency was only weakly related to node strength, and module structural out-strength did not reproduce net temporal directionality. Graph topology and longitudinal prediction identified different dimensions of the symptom system. Structural-control nodes should consequently be interpreted as features of an estimated cross-sectional graph, not as causal intervention targets. Their value lies in describing sparse coverage and architecture; temporal or causal prioritisation requires longitudinal or experimental evidence</w:t>
+        <w:t xml:space="preserve">The comparison of static and temporal models provides a second contribution. </w:t>
+      </w:r>
+      <w:r>
+        <w:rPr>
+          <w:rFonts w:hint="eastAsia" w:eastAsia="宋体"/>
+          <w:highlight w:val="none"/>
+          <w:lang w:eastAsia="zh-CN"/>
+        </w:rPr>
+        <w:t>MDS analysis identified diet, SDQ and emotional items whose neighbourhoods covered the baseline graph; the CLPN placed DASS in the strongest domain-level net source position.</w:t>
+      </w:r>
+      <w:r>
+        <w:rPr>
+          <w:rFonts w:hint="eastAsia"/>
+          <w:highlight w:val="none"/>
+        </w:rPr>
+        <w:t xml:space="preserve"> Control frequency was only weakly related to node strength, and average module control strength did not reproduce </w:t>
+      </w:r>
+      <w:r>
+        <w:rPr>
+          <w:rFonts w:hint="eastAsia" w:eastAsia="宋体"/>
+          <w:highlight w:val="none"/>
+          <w:lang w:eastAsia="zh-CN"/>
+        </w:rPr>
+        <w:t>CLPN net directionality</w:t>
+      </w:r>
+      <w:r>
+        <w:rPr>
+          <w:rFonts w:hint="eastAsia"/>
+          <w:highlight w:val="none"/>
+        </w:rPr>
+        <w:t>. Graph topology and longitudinal prediction identified different dimensions of the symptom system. Structural-control nodes should consequently be interpreted as features of an estimated cross-sectional graph, not as causal intervention targets. Their value lies in describing sparse coverage and architecture; temporal or causal prioritisation requires longitudinal or experimental evidence</w:t>
       </w:r>
       <w:r>
         <w:rPr>
@@ -1575,7 +2304,7 @@
           <w:rFonts w:hint="eastAsia"/>
           <w:highlight w:val="none"/>
         </w:rPr>
-        <w:t>. The exploratory Bayesian graph further reinforced the DASS-outgoing architecture, demonstrating convergence across distinct modelling frameworks within SEARCH.</w:t>
+        <w:t>. In the exploratory Bayesian graph, DASS had the highest net out-degree, which was positively but imprecisely associated with CLPN net directionality across domains.</w:t>
       </w:r>
     </w:p>
     <w:p>
@@ -1590,7 +2319,52 @@
           <w:rFonts w:hint="eastAsia"/>
           <w:highlight w:val="none"/>
         </w:rPr>
-        <w:t>The external analyses sharpen the construct boundary. SEARCH assessed generalised problematic internet and digital-media use through the CIAS-R, whereas MCS measured hours of social-media use and gaming, and the Global Mind Project used social-media frequency. These measures test convergence across related digital-use constructs rather than instrument-level replication. The MCS variables provided the longitudinal exposure-based test: both social-media use and gaming were sinks. The Global Mind Project provided cross-cultural, construct-level triangulation: emotion was the dominant hub across a broad multinational sample, whereas social-media frequency was weakly embedded in the wider health network. Taken together, the findings distinguish impairment-oriented problematic use from exposure-oriented frequency and consistently place screen-related measures outside a dominant upstream or organising position.</w:t>
+        <w:t xml:space="preserve">The external analyses sharpen the construct boundary. SEARCH assessed generalised problematic internet and digital-media use through the CIAS-R, whereas MCS measured hours of </w:t>
+      </w:r>
+      <w:r>
+        <w:rPr>
+          <w:rFonts w:hint="eastAsia" w:eastAsia="宋体"/>
+          <w:highlight w:val="none"/>
+          <w:lang w:eastAsia="zh-CN"/>
+        </w:rPr>
+        <w:t>social media use</w:t>
+      </w:r>
+      <w:r>
+        <w:rPr>
+          <w:rFonts w:hint="eastAsia"/>
+          <w:highlight w:val="none"/>
+        </w:rPr>
+        <w:t xml:space="preserve"> and gaming, and the Global Mind Project used social-media frequency. These measures provide construct-level convergence across related forms of digital use without implying instrument-level replication.</w:t>
+      </w:r>
+      <w:r>
+        <w:rPr>
+          <w:rFonts w:hint="eastAsia" w:eastAsia="宋体"/>
+          <w:highlight w:val="none"/>
+          <w:lang w:val="en-US" w:eastAsia="zh-CN"/>
+        </w:rPr>
+        <w:t xml:space="preserve"> </w:t>
+      </w:r>
+      <w:r>
+        <w:rPr>
+          <w:rFonts w:hint="eastAsia"/>
+          <w:highlight w:val="none"/>
+        </w:rPr>
+        <w:t xml:space="preserve">The MCS variables provided the longitudinal exposure-based comparison: both </w:t>
+      </w:r>
+      <w:r>
+        <w:rPr>
+          <w:rFonts w:hint="eastAsia" w:eastAsia="宋体"/>
+          <w:highlight w:val="none"/>
+          <w:lang w:eastAsia="zh-CN"/>
+        </w:rPr>
+        <w:t>social media use</w:t>
+      </w:r>
+      <w:r>
+        <w:rPr>
+          <w:rFonts w:hint="eastAsia"/>
+          <w:highlight w:val="none"/>
+        </w:rPr>
+        <w:t xml:space="preserve"> and gaming occupied net sink positions. The Global Mind Project provided a pooled multinational cross-sectional comparison: emotion had the highest network strength, whereas social-media frequency had the lowest. These findings distinguish impairment-oriented problematic use from exposure-oriented frequency: screen-related measures did not occupy leading CLPN net source positions and had relatively low cross-sectional network strength in GMP.</w:t>
       </w:r>
     </w:p>
     <w:p>
@@ -1605,7 +2379,7 @@
           <w:rFonts w:hint="eastAsia"/>
           <w:highlight w:val="none"/>
         </w:rPr>
-        <w:t>Several properties of the data define the scope of inference. The SEARCH model used two waves and estimated between-person lagged prediction; it therefore cannot separate stable person differences from within-person dynamics</w:t>
+        <w:t>Several properties of the data define the scope of inference. Because the SEARCH model used two waves and estimated between-person lagged prediction, it cannot separate stable person differences from within-person dynamics</w:t>
       </w:r>
       <w:r>
         <w:rPr>
@@ -1614,9 +2388,87 @@
           <w:vertAlign w:val="superscript"/>
           <w:lang w:val="en-US" w:eastAsia="zh-CN"/>
         </w:rPr>
-        <w:t xml:space="preserve">36, </w:t>
-      </w:r>
-      <w:bookmarkStart w:id="0" w:name="_GoBack"/>
+        <w:t>36, 37</w:t>
+      </w:r>
+      <w:r>
+        <w:rPr>
+          <w:rFonts w:hint="eastAsia"/>
+          <w:highlight w:val="none"/>
+        </w:rPr>
+        <w:t>. Linkage retained 6,092 of 10,356 baseline participants, and the retained sample had lower baseline symptom burden, which may attenuate or alter longitudinal estimates. The broad SDQ domain included emotional, conduct, hyperactivity, peer and reverse-scored prosocial items; DASS→SDQ paths therefore represent prediction of broad difficulties rather than conduct-specific change and partly span overlapping affective content. Diet response options changed between waves; wave-standardised domain scores and a five-domain sensitivity analysis addressed this change. MCS used different internalising instruments at ages 14 and 17, precluding scale-level invariance testing. Finally, the pooled Global Mind Project analysis does not estimate country-specific networks and remains cross-sectional.</w:t>
+      </w:r>
+    </w:p>
+    <w:p>
+      <w:pPr>
+        <w:rPr>
+          <w:highlight w:val="none"/>
+        </w:rPr>
+      </w:pPr>
+      <w:r>
+        <w:rPr>
+          <w:rFonts w:hint="eastAsia"/>
+          <w:highlight w:val="none"/>
+        </w:rPr>
+        <w:t xml:space="preserve">The evidence supports a predictive reframing of adolescent digital-use research. Screen-related measures remained outside the leading CLPN net source positions: problematic digital use showed no significant net directionality in SEARCH, while </w:t>
+      </w:r>
+      <w:r>
+        <w:rPr>
+          <w:rFonts w:hint="eastAsia" w:eastAsia="宋体"/>
+          <w:highlight w:val="none"/>
+          <w:lang w:eastAsia="zh-CN"/>
+        </w:rPr>
+        <w:t>social media use</w:t>
+      </w:r>
+      <w:r>
+        <w:rPr>
+          <w:rFonts w:hint="eastAsia"/>
+          <w:highlight w:val="none"/>
+        </w:rPr>
+        <w:t xml:space="preserve"> and gaming occupied net sink positions in MCS. Emotional distress occupied the strongest net source position in SEARCH, while internalising and externalising difficulties occupied net source positions in MCS. Static network control identified a different set of topological features. Together, these findings position screen-related behaviours within the broader psychological context of adolescent mental health and support integrated assessment of digital engagement alongside emotional and behavioural difficulties.</w:t>
+      </w:r>
+    </w:p>
+    <w:p>
+      <w:pPr>
+        <w:pStyle w:val="3"/>
+        <w:keepNext/>
+        <w:rPr>
+          <w:highlight w:val="none"/>
+        </w:rPr>
+      </w:pPr>
+      <w:r>
+        <w:rPr>
+          <w:highlight w:val="none"/>
+        </w:rPr>
+        <w:t>Methods</w:t>
+      </w:r>
+    </w:p>
+    <w:p>
+      <w:pPr>
+        <w:pStyle w:val="5"/>
+        <w:keepNext/>
+        <w:rPr>
+          <w:highlight w:val="none"/>
+        </w:rPr>
+      </w:pPr>
+      <w:r>
+        <w:rPr>
+          <w:highlight w:val="none"/>
+        </w:rPr>
+        <w:t>Participants and study design</w:t>
+      </w:r>
+    </w:p>
+    <w:p>
+      <w:pPr>
+        <w:rPr>
+          <w:highlight w:val="none"/>
+        </w:rPr>
+      </w:pPr>
+      <w:r>
+        <w:rPr>
+          <w:highlight w:val="none"/>
+        </w:rPr>
+        <w:t>Data came from the School-based Evaluation Advancing Response for Child Health (SEARCH), a mixed longitudinal school-based cohort conducted across 11 schools in three cities of Jiangsu Province, China</w:t>
+      </w:r>
       <w:r>
         <w:rPr>
           <w:rFonts w:hint="eastAsia" w:eastAsia="宋体"/>
@@ -1624,48 +2476,258 @@
           <w:vertAlign w:val="superscript"/>
           <w:lang w:val="en-US" w:eastAsia="zh-CN"/>
         </w:rPr>
-        <w:t>37</w:t>
-      </w:r>
-      <w:bookmarkEnd w:id="0"/>
+        <w:t>27</w:t>
+      </w:r>
+      <w:r>
+        <w:rPr>
+          <w:highlight w:val="none"/>
+        </w:rPr>
+        <w:t>. The baseline wave</w:t>
+      </w:r>
+      <w:r>
+        <w:rPr>
+          <w:rFonts w:hint="eastAsia" w:eastAsia="宋体"/>
+          <w:highlight w:val="none"/>
+          <w:lang w:val="en-US" w:eastAsia="zh-CN"/>
+        </w:rPr>
+        <w:t xml:space="preserve"> (Wave 1)</w:t>
+      </w:r>
+      <w:r>
+        <w:rPr>
+          <w:highlight w:val="none"/>
+        </w:rPr>
+        <w:t xml:space="preserve"> was collected from September 2022 to February 2023. Of 11,640 unique records in the analytic export, 1,284 (11.0%) were excluded because either the participant-level median item-response time or the within-participant standard deviation across the 104 analysed </w:t>
+      </w:r>
       <w:r>
         <w:rPr>
           <w:rFonts w:hint="eastAsia"/>
           <w:highlight w:val="none"/>
         </w:rPr>
-        <w:t>. Linkage retained 6,092 of 10,356 baseline participants, and the retained sample had lower baseline symptom burden, which may attenuate or alter longitudinal estimates. The longitudinal estimates therefore apply to the linked sample. The broad SDQ domain included emotional, conduct, hyperactivity, peer and reverse-scored prosocial items; DASS→SDQ paths therefore represent prediction of broad difficulties rather than conduct-specific change and partly span overlapping affective content. Diet response options changed between waves; wave-standardised domain scores and a five-domain sensitivity analysis addressed this change. MCS used different internalising instruments at ages 14 and 17, precluding scale-level invariance testing. Finally, the pooled Global Mind Project analysis does not estimate country-specific networks and remains cross-sectional.</w:t>
+        <w:t>item scores</w:t>
+      </w:r>
+      <w:r>
+        <w:rPr>
+          <w:highlight w:val="none"/>
+        </w:rPr>
+        <w:t xml:space="preserve"> fell outside </w:t>
+      </w:r>
+      <w:r>
+        <w:rPr>
+          <w:rFonts w:hint="eastAsia"/>
+          <w:highlight w:val="none"/>
+        </w:rPr>
+        <w:t>sample-derived bounds of 1.5 × the interquartile range.</w:t>
+      </w:r>
+      <w:r>
+        <w:rPr>
+          <w:highlight w:val="none"/>
+        </w:rPr>
+        <w:t xml:space="preserve"> The baseline sample comprised 10,356 adolescents (52.2% male; mean age 13.96 years, SD 2.42). </w:t>
+      </w:r>
+      <w:r>
+        <w:rPr>
+          <w:rFonts w:hint="eastAsia"/>
+          <w:highlight w:val="none"/>
+        </w:rPr>
+        <w:t>The follow-up wave used in the longitudinal analysis (Wave 3) was exported in April 2024, approximately one year after baseline.</w:t>
+      </w:r>
+      <w:r>
+        <w:rPr>
+          <w:highlight w:val="none"/>
+        </w:rPr>
+        <w:t xml:space="preserve"> The study was approved by the Ethics Committee of the Affiliated Brain Hospital of Nanjing Medical University (approval 2022-KY095-02), was conducted in accordance with the Declaration of Helsinki, and obtained written informed consent from participating adolescents and their legal guardians.</w:t>
       </w:r>
     </w:p>
     <w:p>
       <w:pPr>
-        <w:rPr>
-          <w:highlight w:val="none"/>
-        </w:rPr>
-      </w:pPr>
-      <w:r>
-        <w:rPr>
-          <w:rFonts w:hint="eastAsia"/>
-          <w:highlight w:val="none"/>
-        </w:rPr>
-        <w:t>The evidence supports a directional reframing of adolescent digital-use research. Screen-related measures occupied neutral or downstream positions within broader psychopathological dynamics rather than leading prospective change. Emotional distress was the principal source in SEARCH, while internalising and externalising difficulties jointly occupied the source side in MCS. Static network control identified a different set of topological features. Distinguishing these levels of analysis yields a more precise account of when digital behaviour is a marker, a downstream expression or a structural component of adolescent mental-health systems.</w:t>
+        <w:pStyle w:val="5"/>
+        <w:keepNext/>
+        <w:rPr>
+          <w:highlight w:val="none"/>
+        </w:rPr>
+      </w:pPr>
+      <w:r>
+        <w:rPr>
+          <w:highlight w:val="none"/>
+        </w:rPr>
+        <w:t>SEARCH measures</w:t>
       </w:r>
     </w:p>
     <w:p>
       <w:pPr>
-        <w:pStyle w:val="3"/>
-        <w:keepNext/>
-        <w:rPr>
-          <w:highlight w:val="none"/>
-        </w:rPr>
-      </w:pPr>
-      <w:r>
-        <w:rPr>
-          <w:highlight w:val="none"/>
-        </w:rPr>
-        <w:t>Methods</w:t>
+        <w:rPr>
+          <w:highlight w:val="none"/>
+        </w:rPr>
+      </w:pPr>
+      <w:r>
+        <w:rPr>
+          <w:rFonts w:hint="eastAsia"/>
+          <w:highlight w:val="none"/>
+        </w:rPr>
+        <w:t>We assessed six domains with 113 items. Problematic digital use was measured with the 26-item Chen Internet Addiction Scale-Revised (CIAS-R; response range 1–4), which assesses impairment across internet and digital-media use rather than smartphone-specific behaviour</w:t>
+      </w:r>
+      <w:r>
+        <w:rPr>
+          <w:rFonts w:hint="eastAsia"/>
+          <w:highlight w:val="none"/>
+          <w:vertAlign w:val="superscript"/>
+        </w:rPr>
+        <w:t>38</w:t>
+      </w:r>
+      <w:r>
+        <w:rPr>
+          <w:rFonts w:hint="eastAsia"/>
+          <w:highlight w:val="none"/>
+        </w:rPr>
+        <w:t>. Emotional distress was measured with the 21-item Depression Anxiety Stress Scales (DASS-21; range 0–3)</w:t>
+      </w:r>
+      <w:r>
+        <w:rPr>
+          <w:rFonts w:hint="eastAsia"/>
+          <w:highlight w:val="none"/>
+          <w:vertAlign w:val="superscript"/>
+        </w:rPr>
+        <w:t>39</w:t>
+      </w:r>
+      <w:r>
+        <w:rPr>
+          <w:rFonts w:hint="eastAsia"/>
+          <w:highlight w:val="none"/>
+        </w:rPr>
+        <w:t>. Broad difficulties were assessed with the 25 core SDQ items; six impact-supplement items were recorded separately</w:t>
+      </w:r>
+      <w:r>
+        <w:rPr>
+          <w:rFonts w:hint="eastAsia"/>
+          <w:highlight w:val="none"/>
+          <w:vertAlign w:val="superscript"/>
+        </w:rPr>
+        <w:t>40</w:t>
+      </w:r>
+      <w:r>
+        <w:rPr>
+          <w:rFonts w:hint="eastAsia"/>
+          <w:highlight w:val="none"/>
+        </w:rPr>
+        <w:t>. Insomnia was measured with the seven-item Insomnia Severity Index (ISI; range 0–4)</w:t>
+      </w:r>
+      <w:r>
+        <w:rPr>
+          <w:rFonts w:hint="eastAsia"/>
+          <w:highlight w:val="none"/>
+          <w:vertAlign w:val="superscript"/>
+        </w:rPr>
+        <w:t>41</w:t>
+      </w:r>
+      <w:r>
+        <w:rPr>
+          <w:rFonts w:hint="eastAsia"/>
+          <w:highlight w:val="none"/>
+        </w:rPr>
+        <w:t>. Diet was assessed using nine cohort-specific dietary-behaviour items and 13 items from the Chinese modified Yale Food Addiction Scale 2.0</w:t>
+      </w:r>
+      <w:r>
+        <w:rPr>
+          <w:rFonts w:hint="eastAsia"/>
+          <w:highlight w:val="none"/>
+          <w:vertAlign w:val="superscript"/>
+        </w:rPr>
+        <w:t>42, 43</w:t>
+      </w:r>
+      <w:r>
+        <w:rPr>
+          <w:rFonts w:hint="eastAsia"/>
+          <w:highlight w:val="none"/>
+        </w:rPr>
+        <w:t>. Physical activity was assessed with six items; items 1–4 were adapted from the International Physical Activity Questionnaire-Short Form</w:t>
+      </w:r>
+      <w:r>
+        <w:rPr>
+          <w:rFonts w:hint="eastAsia"/>
+          <w:highlight w:val="none"/>
+          <w:vertAlign w:val="superscript"/>
+        </w:rPr>
+        <w:t>44, 45</w:t>
+      </w:r>
+      <w:r>
+        <w:rPr>
+          <w:rFonts w:hint="eastAsia"/>
+          <w:highlight w:val="none"/>
+        </w:rPr>
+        <w:t>, and items 5–6 assessed recreational screen time. The exclusions used to construct the 104-item network are described below.</w:t>
       </w:r>
     </w:p>
     <w:p>
       <w:pPr>
+        <w:rPr>
+          <w:rFonts w:hint="eastAsia" w:eastAsia="宋体"/>
+          <w:highlight w:val="none"/>
+          <w:lang w:val="en-US" w:eastAsia="zh-CN"/>
+        </w:rPr>
+      </w:pPr>
+      <w:r>
+        <w:rPr>
+          <w:highlight w:val="none"/>
+        </w:rPr>
+        <w:t xml:space="preserve">Nine items were excluded before item-level network estimation. </w:t>
+      </w:r>
+      <w:r>
+        <w:rPr>
+          <w:rFonts w:hint="eastAsia"/>
+          <w:highlight w:val="none"/>
+        </w:rPr>
+        <w:t>The six SDQ impact-supplement items (items 26–31) were excluded because they assess the duration, distress and functional impact of overall difficulties and do not represent individual symptoms.</w:t>
+      </w:r>
+      <w:r>
+        <w:rPr>
+          <w:highlight w:val="none"/>
+        </w:rPr>
+        <w:t xml:space="preserve"> DIET item 3 was a multiple-response item and was not comparable with scalar items. </w:t>
+      </w:r>
+      <w:r>
+        <w:rPr>
+          <w:rFonts w:hint="eastAsia"/>
+          <w:highlight w:val="none"/>
+        </w:rPr>
+        <w:t>ACT items 5 and 6 assessed recreational screen time and were excluded from the physical-activity domain.</w:t>
+      </w:r>
+      <w:r>
+        <w:rPr>
+          <w:highlight w:val="none"/>
+        </w:rPr>
+        <w:t xml:space="preserve"> </w:t>
+      </w:r>
+      <w:r>
+        <w:rPr>
+          <w:rFonts w:hint="eastAsia"/>
+          <w:highlight w:val="none"/>
+        </w:rPr>
+        <w:t>After these exclusions, the final baseline network contained 104 items</w:t>
+      </w:r>
+      <w:r>
+        <w:rPr>
+          <w:highlight w:val="none"/>
+        </w:rPr>
+        <w:t xml:space="preserve">: 26 CIAS-R, 21 DASS-21, 25 SDQ, 7 ISI, 21 DIET and 4 ACT items. SDQ items 7, 11, 14, 21 and 25 were reverse-scored so that higher values indicated greater difficulty. </w:t>
+      </w:r>
+      <w:r>
+        <w:rPr>
+          <w:rFonts w:hint="eastAsia"/>
+          <w:highlight w:val="none"/>
+        </w:rPr>
+        <w:t>Because all 25 core SDQ items were retained, including emotional and reverse-scored prosocial content, we describe this domain as broad SDQ difficulties.</w:t>
+      </w:r>
+      <w:r>
+        <w:rPr>
+          <w:rFonts w:hint="eastAsia" w:eastAsia="宋体"/>
+          <w:highlight w:val="none"/>
+          <w:lang w:val="en-US" w:eastAsia="zh-CN"/>
+        </w:rPr>
+        <w:t xml:space="preserve"> The CIAS-R, DASS-21, SDQ and ISI have established psychometric properties.</w:t>
+      </w:r>
+    </w:p>
+    <w:p>
+      <w:pPr>
         <w:pStyle w:val="5"/>
         <w:keepNext/>
         <w:rPr>
@@ -1676,7 +2738,7 @@
         <w:rPr>
           <w:highlight w:val="none"/>
         </w:rPr>
-        <w:t>Participants and study design</w:t>
+        <w:t>SEARCH longitudinal linkage and domain scores</w:t>
       </w:r>
     </w:p>
     <w:p>
@@ -1689,7 +2751,61 @@
         <w:rPr>
           <w:highlight w:val="none"/>
         </w:rPr>
-        <w:t>Data came from the School-based Evaluation Advancing Response for Child Health (SEARCH), a mixed longitudinal school-based cohort conducted across 11 schools in three cities of Jiangsu Province, China</w:t>
+        <w:t>The two SEARCH waves used independent record identifiers. Participants were linked deterministically using a SHA-1 digest of name, date of birth and recorded sex, truncated to 16 hexadecimal characters. Composite keys that were non-unique within a wave were excluded before linkage; three within-wave duplicate records in baseline and one at follow-up were removed. This procedure produced 6,092 participants with complete six-domain data at both waves. Non-unique baseline linkage keys involved 0.052% of candidate records.</w:t>
+      </w:r>
+    </w:p>
+    <w:p>
+      <w:pPr>
+        <w:rPr>
+          <w:highlight w:val="none"/>
+        </w:rPr>
+      </w:pPr>
+      <w:r>
+        <w:rPr>
+          <w:highlight w:val="none"/>
+        </w:rPr>
+        <w:t xml:space="preserve">Diet items 10-22 changed from binary response options at baseline to an eight-point scale at follow-up. </w:t>
+      </w:r>
+      <w:r>
+        <w:rPr>
+          <w:rFonts w:hint="eastAsia"/>
+          <w:highlight w:val="none"/>
+        </w:rPr>
+        <w:t>Accordingly, the primary longitudinal analysis used six domain scores; item-level diet comparisons were not performed.</w:t>
+      </w:r>
+      <w:r>
+        <w:rPr>
+          <w:highlight w:val="none"/>
+        </w:rPr>
+        <w:t xml:space="preserve"> Each domain score was z-standardised within wave. Cross-wave correlations were 0.58 for CIAS-R, 0.63 for DASS, 0.43 for SDQ, 0.34 for diet, 0.57 for ISI and 0.31 for physical activity. Baseline differences between linked and unlinked participants were quantified with standardised mean differences.</w:t>
+      </w:r>
+    </w:p>
+    <w:p>
+      <w:pPr>
+        <w:pStyle w:val="5"/>
+        <w:keepNext/>
+        <w:rPr>
+          <w:highlight w:val="none"/>
+        </w:rPr>
+      </w:pPr>
+      <w:r>
+        <w:rPr>
+          <w:highlight w:val="none"/>
+        </w:rPr>
+        <w:t>SEARCH cross-lagged panel network</w:t>
+      </w:r>
+    </w:p>
+    <w:p>
+      <w:pPr>
+        <w:rPr>
+          <w:highlight w:val="none"/>
+        </w:rPr>
+      </w:pPr>
+      <w:r>
+        <w:rPr>
+          <w:highlight w:val="none"/>
+        </w:rPr>
+        <w:t>For each follow-up domain, we fitted an ordinary least-squares regression containing all six baseline domain scores, including the corresponding autoregressive predictor. Coefficients were standardised and HC3 heteroskedasticity-robust standard errors were used</w:t>
       </w:r>
       <w:r>
         <w:rPr>
@@ -1698,57 +2814,117 @@
           <w:vertAlign w:val="superscript"/>
           <w:lang w:val="en-US" w:eastAsia="zh-CN"/>
         </w:rPr>
-        <w:t>27</w:t>
-      </w:r>
-      <w:r>
-        <w:rPr>
-          <w:highlight w:val="none"/>
-        </w:rPr>
-        <w:t>. The baseline wave</w:t>
+        <w:t>26, 36</w:t>
+      </w:r>
+      <w:r>
+        <w:rPr>
+          <w:highlight w:val="none"/>
+        </w:rPr>
+        <w:t xml:space="preserve">. </w:t>
+      </w:r>
+      <w:r>
+        <w:rPr>
+          <w:rFonts w:hint="eastAsia"/>
+          <w:highlight w:val="none"/>
+        </w:rPr>
+        <w:t>The 30 cross-domain paths were evaluated using a Bonferroni-adjusted threshold of α = 0.0017</w:t>
       </w:r>
       <w:r>
         <w:rPr>
           <w:rFonts w:hint="eastAsia" w:eastAsia="宋体"/>
           <w:highlight w:val="none"/>
+          <w:vertAlign w:val="baseline"/>
           <w:lang w:val="en-US" w:eastAsia="zh-CN"/>
         </w:rPr>
-        <w:t xml:space="preserve"> (Wave 1)</w:t>
-      </w:r>
-      <w:r>
-        <w:rPr>
-          <w:highlight w:val="none"/>
-        </w:rPr>
-        <w:t xml:space="preserve"> was collected from September 2022 to February 2023. Of 11,640 unique records in the analytic export, 1,284 (11.0%) were excluded because either the participant-level median item-response time or the within-participant standard deviation across the 104 analysed </w:t>
+        <w:t>.</w:t>
+      </w:r>
+      <w:r>
+        <w:rPr>
+          <w:highlight w:val="none"/>
+        </w:rPr>
+        <w:t xml:space="preserve"> </w:t>
       </w:r>
       <w:r>
         <w:rPr>
           <w:rFonts w:hint="eastAsia"/>
           <w:highlight w:val="none"/>
         </w:rPr>
-        <w:t>item scores</w:t>
-      </w:r>
-      <w:r>
-        <w:rPr>
-          <w:highlight w:val="none"/>
-        </w:rPr>
-        <w:t xml:space="preserve"> fell outside sample-derived 1.5 x interquartile-range bounds. The baseline sample comprised 10,356 adolescents (52.2% male; mean age 13.96 years, SD 2.42). </w:t>
+        <w:t>For visualisation, Fig. 1a marks paths with nominal P &lt; 0.05, and Fig. 1b displays paths with nominal P &lt; 0.05 and |β| ≥ 0.08. Formal inference was based on the Bonferroni-adjusted threshold.</w:t>
+      </w:r>
+      <w:r>
+        <w:rPr>
+          <w:rFonts w:hint="eastAsia" w:eastAsia="宋体"/>
+          <w:highlight w:val="none"/>
+          <w:lang w:val="en-US" w:eastAsia="zh-CN"/>
+        </w:rPr>
+        <w:t xml:space="preserve"> </w:t>
+      </w:r>
+      <w:r>
+        <w:rPr>
+          <w:rFonts w:hint="eastAsia" w:eastAsia="宋体"/>
+          <w:highlight w:val="none"/>
+          <w:lang w:eastAsia="zh-CN"/>
+        </w:rPr>
+        <w:t>CLPN net directionality</w:t>
+      </w:r>
+      <w:r>
+        <w:rPr>
+          <w:highlight w:val="none"/>
+        </w:rPr>
+        <w:t xml:space="preserve"> was calculated for each domain as the sum of absolute cross-lagged outgoing coefficients minus the sum of absolute incoming coefficients; autoregressive coefficients were excluded.</w:t>
+      </w:r>
+      <w:r>
+        <w:rPr>
+          <w:rFonts w:hint="eastAsia" w:eastAsia="宋体"/>
+          <w:highlight w:val="none"/>
+          <w:lang w:val="en-US" w:eastAsia="zh-CN"/>
+        </w:rPr>
+        <w:t xml:space="preserve"> </w:t>
       </w:r>
       <w:r>
         <w:rPr>
           <w:rFonts w:hint="eastAsia"/>
           <w:highlight w:val="none"/>
         </w:rPr>
-        <w:t>The follow-up wave used in the longitudinal analysis (Wave 3) was exported in April 2024, approximately one year after baseline.</w:t>
-      </w:r>
-      <w:r>
-        <w:rPr>
-          <w:highlight w:val="none"/>
-        </w:rPr>
-        <w:t xml:space="preserve"> The study was approved by the Ethics Committee of the Affiliated Brain Hospital of Nanjing Medical University (approval 2022-KY095-02), was conducted in accordance with the Declaration of Helsinki, and obtained written informed consent from participating adolescents and their legal guardians.</w:t>
+        <w:t>Positive values indicate a net source position and negative values a net sink position. Because the calculation uses absolute coefficients, both positive and negative cross-lagged paths contribute to net directionality.</w:t>
+      </w:r>
+      <w:r>
+        <w:rPr>
+          <w:rFonts w:hint="eastAsia" w:eastAsia="宋体"/>
+          <w:highlight w:val="none"/>
+          <w:lang w:val="en-US" w:eastAsia="zh-CN"/>
+        </w:rPr>
+        <w:t xml:space="preserve"> </w:t>
+      </w:r>
+      <w:r>
+        <w:rPr>
+          <w:highlight w:val="none"/>
+        </w:rPr>
+        <w:t>Percentile 95% confidence intervals were estimated with 1,000 nonparametric bootstrap resamples.</w:t>
       </w:r>
     </w:p>
     <w:p>
       <w:pPr>
+        <w:rPr>
+          <w:highlight w:val="none"/>
+        </w:rPr>
+      </w:pPr>
+      <w:r>
+        <w:rPr>
+          <w:highlight w:val="none"/>
+        </w:rPr>
+        <w:t xml:space="preserve">Sensitivity analyses recalculated directionality using only Bonferroni-significant paths, adjusted the regressions for age, sex and grade, used school-cluster-robust inference, and fitted a five-domain model excluding diet. </w:t>
+      </w:r>
+      <w:r>
+        <w:rPr>
+          <w:rFonts w:hint="eastAsia"/>
+          <w:highlight w:val="none"/>
+        </w:rPr>
+        <w:t>These analyses tested the robustness of the net source–sink ranking and directionality sign under alternative specifications.</w:t>
+      </w:r>
+    </w:p>
+    <w:p>
+      <w:pPr>
         <w:pStyle w:val="5"/>
         <w:keepNext/>
         <w:rPr>
@@ -1759,7 +2935,7 @@
         <w:rPr>
           <w:highlight w:val="none"/>
         </w:rPr>
-        <w:t>SEARCH measures</w:t>
+        <w:t>Millennium Cohort Study longitudinal analysis</w:t>
       </w:r>
     </w:p>
     <w:p>
@@ -1770,123 +2946,147 @@
       </w:pPr>
       <w:r>
         <w:rPr>
-          <w:rFonts w:hint="eastAsia"/>
-          <w:highlight w:val="none"/>
-        </w:rPr>
-        <w:t>We assessed six domains with 113 items. Problematic digital use was measured with the 26-item Chen Internet Addiction Scale-Revised (CIAS-R; response range 1–4), which assesses impairment across internet and digital-media use rather than smartphone-specific behaviour</w:t>
-      </w:r>
-      <w:r>
-        <w:rPr>
-          <w:rFonts w:hint="eastAsia"/>
+          <w:highlight w:val="none"/>
+        </w:rPr>
+        <w:t>The UK Millennium Cohort Study (MCS) was used for an external longitudinal analysis</w:t>
+      </w:r>
+      <w:r>
+        <w:rPr>
           <w:highlight w:val="none"/>
           <w:vertAlign w:val="superscript"/>
         </w:rPr>
-        <w:t>38</w:t>
-      </w:r>
-      <w:r>
-        <w:rPr>
-          <w:rFonts w:hint="eastAsia"/>
-          <w:highlight w:val="none"/>
-        </w:rPr>
-        <w:t>. Emotional distress was measured with the 21-item Depression Anxiety Stress Scales (DASS-21; range 0–3)</w:t>
-      </w:r>
-      <w:r>
-        <w:rPr>
-          <w:rFonts w:hint="eastAsia"/>
+        <w:t>2</w:t>
+      </w:r>
+      <w:r>
+        <w:rPr>
+          <w:rFonts w:hint="eastAsia" w:eastAsia="宋体"/>
           <w:highlight w:val="none"/>
           <w:vertAlign w:val="superscript"/>
-        </w:rPr>
-        <w:t>39</w:t>
-      </w:r>
-      <w:r>
-        <w:rPr>
-          <w:rFonts w:hint="eastAsia"/>
-          <w:highlight w:val="none"/>
-        </w:rPr>
-        <w:t>. Broad difficulties were assessed with the 25 core SDQ items; six impact-supplement items were recorded separately</w:t>
-      </w:r>
-      <w:r>
-        <w:rPr>
-          <w:rFonts w:hint="eastAsia"/>
+          <w:lang w:val="en-US" w:eastAsia="zh-CN"/>
+        </w:rPr>
+        <w:t>8</w:t>
+      </w:r>
+      <w:r>
+        <w:rPr>
+          <w:highlight w:val="none"/>
+        </w:rPr>
+        <w:t>. Sweep 6 at age 14 (N = 11,852)</w:t>
+      </w:r>
+      <w:r>
+        <w:rPr>
           <w:highlight w:val="none"/>
           <w:vertAlign w:val="superscript"/>
         </w:rPr>
-        <w:t>40</w:t>
-      </w:r>
-      <w:r>
-        <w:rPr>
-          <w:rFonts w:hint="eastAsia"/>
-          <w:highlight w:val="none"/>
-        </w:rPr>
-        <w:t>. Insomnia was measured with the seven-item Insomnia Severity Index (ISI; range 0–4)</w:t>
-      </w:r>
-      <w:r>
-        <w:rPr>
-          <w:rFonts w:hint="eastAsia"/>
+        <w:t>4</w:t>
+      </w:r>
+      <w:r>
+        <w:rPr>
+          <w:rFonts w:hint="eastAsia" w:eastAsia="宋体"/>
           <w:highlight w:val="none"/>
           <w:vertAlign w:val="superscript"/>
-        </w:rPr>
-        <w:t>41</w:t>
-      </w:r>
-      <w:r>
-        <w:rPr>
-          <w:rFonts w:hint="eastAsia"/>
-          <w:highlight w:val="none"/>
-        </w:rPr>
-        <w:t>. Diet was assessed using nine cohort-specific dietary-behaviour items and 13 items from the Chinese modified Yale Food Addiction Scale 2.0</w:t>
-      </w:r>
-      <w:r>
-        <w:rPr>
-          <w:rFonts w:hint="eastAsia"/>
+          <w:lang w:val="en-US" w:eastAsia="zh-CN"/>
+        </w:rPr>
+        <w:t>6</w:t>
+      </w:r>
+      <w:r>
+        <w:rPr>
+          <w:highlight w:val="none"/>
+        </w:rPr>
+        <w:t xml:space="preserve"> and Sweep 7 at age 17 (N = 10,343)</w:t>
+      </w:r>
+      <w:r>
+        <w:rPr>
           <w:highlight w:val="none"/>
           <w:vertAlign w:val="superscript"/>
         </w:rPr>
-        <w:t>42, 43</w:t>
-      </w:r>
-      <w:r>
-        <w:rPr>
-          <w:rFonts w:hint="eastAsia"/>
-          <w:highlight w:val="none"/>
-        </w:rPr>
-        <w:t>. Physical activity was assessed with six items; items 1–4 were adapted from the International Physical Activity Questionnaire-Short Form</w:t>
-      </w:r>
-      <w:r>
-        <w:rPr>
-          <w:rFonts w:hint="eastAsia"/>
+        <w:t>4</w:t>
+      </w:r>
+      <w:r>
+        <w:rPr>
+          <w:rFonts w:hint="eastAsia" w:eastAsia="宋体"/>
           <w:highlight w:val="none"/>
           <w:vertAlign w:val="superscript"/>
-        </w:rPr>
-        <w:t>44, 45</w:t>
-      </w:r>
-      <w:r>
-        <w:rPr>
-          <w:rFonts w:hint="eastAsia"/>
-          <w:highlight w:val="none"/>
-        </w:rPr>
-        <w:t>, and items 5–6 assessed recreational screen time. The exclusions used to construct the 104-item network are described below.</w:t>
+          <w:lang w:val="en-US" w:eastAsia="zh-CN"/>
+        </w:rPr>
+        <w:t>7</w:t>
+      </w:r>
+      <w:r>
+        <w:rPr>
+          <w:highlight w:val="none"/>
+        </w:rPr>
+        <w:t xml:space="preserve"> were obtained under licence from the UK Data Service. De-identified family and cohort-member identifiers linked 9,520 adolescents across sweeps. Six nodes were available at both ages: self-reported </w:t>
+      </w:r>
+      <w:r>
+        <w:rPr>
+          <w:rFonts w:hint="eastAsia" w:eastAsia="宋体"/>
+          <w:highlight w:val="none"/>
+          <w:lang w:eastAsia="zh-CN"/>
+        </w:rPr>
+        <w:t>internalising</w:t>
+      </w:r>
+      <w:r>
+        <w:rPr>
+          <w:highlight w:val="none"/>
+        </w:rPr>
+        <w:t xml:space="preserve"> distress, assessed with the 13-item Short Mood and Feelings Questionnaire at age 14</w:t>
+      </w:r>
+      <w:r>
+        <w:rPr>
+          <w:rFonts w:hint="eastAsia" w:eastAsia="宋体"/>
+          <w:highlight w:val="none"/>
+          <w:vertAlign w:val="superscript"/>
+          <w:lang w:val="en-US" w:eastAsia="zh-CN"/>
+        </w:rPr>
+        <w:t>48</w:t>
+      </w:r>
+      <w:r>
+        <w:rPr>
+          <w:highlight w:val="none"/>
+        </w:rPr>
+        <w:t xml:space="preserve"> and the Kessler K6 at age 17</w:t>
+      </w:r>
+      <w:r>
+        <w:rPr>
+          <w:rFonts w:hint="eastAsia" w:eastAsia="宋体"/>
+          <w:highlight w:val="none"/>
+          <w:vertAlign w:val="superscript"/>
+          <w:lang w:val="en-US" w:eastAsia="zh-CN"/>
+        </w:rPr>
+        <w:t>49</w:t>
+      </w:r>
+      <w:r>
+        <w:rPr>
+          <w:highlight w:val="none"/>
+        </w:rPr>
+        <w:t xml:space="preserve">; SDQ conduct, hyperactivity/inattention and peer-problem subscales; self-reported hours of </w:t>
+      </w:r>
+      <w:r>
+        <w:rPr>
+          <w:rFonts w:hint="eastAsia" w:eastAsia="宋体"/>
+          <w:highlight w:val="none"/>
+          <w:lang w:eastAsia="zh-CN"/>
+        </w:rPr>
+        <w:t>social media use</w:t>
+      </w:r>
+      <w:r>
+        <w:rPr>
+          <w:highlight w:val="none"/>
+        </w:rPr>
+        <w:t>; and self-reported hours of electronic gaming. Scores were z-standardised within wave.</w:t>
       </w:r>
     </w:p>
     <w:p>
       <w:pPr>
         <w:rPr>
-          <w:rFonts w:hint="eastAsia" w:eastAsia="宋体"/>
-          <w:highlight w:val="none"/>
-          <w:lang w:val="en-US" w:eastAsia="zh-CN"/>
-        </w:rPr>
-      </w:pPr>
-      <w:r>
-        <w:rPr>
-          <w:highlight w:val="none"/>
-        </w:rPr>
-        <w:t>Nine items were excluded before item-level network estimation. The six SDQ impact-supplement items (items 26-31) were excluded because they assess duration, distress and functional impact of overall difficulties rather than individual symptoms. DIET item 3 was a multiple-response item and was not comparable with scalar items. ACT items 5 and 6 measured recreational screen time rather than physical activity. The final baseline network therefore contained 104 items: 26 CIAS-R, 21 DASS-21, 25 SDQ, 7 ISI, 21 DIET and 4 ACT items. SDQ items 7, 11, 14, 21 and 25 were reverse-scored so that higher values indicated greater difficulty. Because all 25 core SDQ items were retained, including emotional and reverse-scored prosocial content, this domain is described as broad SDQ difficulties rather than as a conduct-specific scale.</w:t>
-      </w:r>
-      <w:r>
-        <w:rPr>
-          <w:rFonts w:hint="eastAsia" w:eastAsia="宋体"/>
-          <w:highlight w:val="none"/>
-          <w:lang w:val="en-US" w:eastAsia="zh-CN"/>
-        </w:rPr>
-        <w:t xml:space="preserve"> The CIAS-R, DASS-21, SDQ and ISI have established psychometric properties.</w:t>
+          <w:highlight w:val="none"/>
+        </w:rPr>
+      </w:pPr>
+      <w:r>
+        <w:rPr>
+          <w:rFonts w:hint="eastAsia"/>
+          <w:highlight w:val="none"/>
+        </w:rPr>
+        <w:t>The MCS CLPN used the six constructs available at both sweeps and followed the same regression specification and net-directionality definition as SEARCH, with 500 nonparametric bootstrap resamples. The complete-case analysis included 7,838 participants. Because internalising distress was measured using different instruments at ages 14 and 17, this node was interpreted at the construct level.</w:t>
       </w:r>
     </w:p>
     <w:p>
@@ -1901,7 +3101,7 @@
         <w:rPr>
           <w:highlight w:val="none"/>
         </w:rPr>
-        <w:t>SEARCH longitudinal linkage and domain scores</w:t>
+        <w:t>Baseline SEARCH network reconstruction</w:t>
       </w:r>
     </w:p>
     <w:p>
@@ -1914,24 +3114,284 @@
         <w:rPr>
           <w:highlight w:val="none"/>
         </w:rPr>
-        <w:t>The two SEARCH waves used independent record identifiers. Participants were linked deterministically using a SHA-1 digest of name, date of birth and recorded sex, truncated to 16 hexadecimal characters. Composite keys that were non-unique within a wave were excluded before linkage; three within-wave duplicate records in baseline and one at follow-up were removed. This procedure produced 6,092 participants with complete six-domain data at both waves. Non-unique baseline linkage keys involved 0.052% of candidate records.</w:t>
+        <w:t xml:space="preserve">Item responses were transformed to normal marginals with a nonparanormal Gaussian-copula transformation. A Gaussian graphical model was estimated with graphical </w:t>
+      </w:r>
+      <w:r>
+        <w:rPr>
+          <w:rFonts w:hint="eastAsia" w:eastAsia="宋体"/>
+          <w:highlight w:val="none"/>
+          <w:lang w:val="en-US" w:eastAsia="zh-CN"/>
+        </w:rPr>
+        <w:t>l</w:t>
+      </w:r>
+      <w:r>
+        <w:rPr>
+          <w:highlight w:val="none"/>
+        </w:rPr>
+        <w:t>asso</w:t>
+      </w:r>
+      <w:r>
+        <w:rPr>
+          <w:highlight w:val="none"/>
+          <w:vertAlign w:val="superscript"/>
+        </w:rPr>
+        <w:t>18,</w:t>
+      </w:r>
+      <w:r>
+        <w:rPr>
+          <w:rFonts w:hint="eastAsia" w:eastAsia="宋体"/>
+          <w:highlight w:val="none"/>
+          <w:vertAlign w:val="superscript"/>
+          <w:lang w:val="en-US" w:eastAsia="zh-CN"/>
+        </w:rPr>
+        <w:t xml:space="preserve"> </w:t>
+      </w:r>
+      <w:r>
+        <w:rPr>
+          <w:highlight w:val="none"/>
+          <w:vertAlign w:val="superscript"/>
+        </w:rPr>
+        <w:t>19</w:t>
+      </w:r>
+      <w:r>
+        <w:rPr>
+          <w:highlight w:val="none"/>
+        </w:rPr>
+        <w:t>. The regularisation parameter was selected by likelihood-based K-fold cross-validation over a 100-point geometric grid from lambda-max = 0.824 to 1% of that value, yielding lambda = 0.0581. Partial correlations were derived from the precision matrix. Cross-sectional network reporting followed current methodological standards</w:t>
+      </w:r>
+      <w:r>
+        <w:rPr>
+          <w:highlight w:val="none"/>
+          <w:vertAlign w:val="superscript"/>
+        </w:rPr>
+        <w:t>23</w:t>
+      </w:r>
+      <w:r>
+        <w:rPr>
+          <w:highlight w:val="none"/>
+        </w:rPr>
+        <w:t>.</w:t>
       </w:r>
     </w:p>
     <w:p>
       <w:pPr>
-        <w:rPr>
-          <w:highlight w:val="none"/>
-        </w:rPr>
-      </w:pPr>
-      <w:r>
-        <w:rPr>
-          <w:highlight w:val="none"/>
-        </w:rPr>
-        <w:t>Diet items 10-22 changed from binary response options at baseline to an eight-point scale at follow-up. The primary longitudinal analysis therefore used six domain scores rather than item-level diet comparisons. Each domain score was z-standardised within wave. Cross-wave correlations were 0.58 for CIAS-R, 0.63 for DASS, 0.43 for SDQ, 0.34 for diet, 0.57 for ISI and 0.31 for physical activity. Baseline differences between linked and unlinked participants were quantified with standardised mean differences.</w:t>
+        <w:pStyle w:val="5"/>
+        <w:keepNext/>
+        <w:rPr>
+          <w:highlight w:val="none"/>
+        </w:rPr>
+      </w:pPr>
+      <w:r>
+        <w:rPr>
+          <w:highlight w:val="none"/>
+        </w:rPr>
+        <w:t>Structural-control and robustness analyses</w:t>
       </w:r>
     </w:p>
     <w:p>
       <w:pPr>
+        <w:rPr>
+          <w:highlight w:val="none"/>
+        </w:rPr>
+      </w:pPr>
+      <w:r>
+        <w:rPr>
+          <w:rFonts w:hint="eastAsia" w:eastAsia="宋体"/>
+          <w:highlight w:val="none"/>
+          <w:lang w:eastAsia="zh-CN"/>
+        </w:rPr>
+        <w:t>MDS solutions</w:t>
+      </w:r>
+      <w:r>
+        <w:rPr>
+          <w:highlight w:val="none"/>
+        </w:rPr>
+        <w:t xml:space="preserve"> were enumerated exhaustively</w:t>
+      </w:r>
+      <w:r>
+        <w:rPr>
+          <w:highlight w:val="none"/>
+          <w:vertAlign w:val="superscript"/>
+        </w:rPr>
+        <w:t>20,</w:t>
+      </w:r>
+      <w:r>
+        <w:rPr>
+          <w:rFonts w:hint="eastAsia" w:eastAsia="宋体"/>
+          <w:highlight w:val="none"/>
+          <w:vertAlign w:val="superscript"/>
+          <w:lang w:val="en-US" w:eastAsia="zh-CN"/>
+        </w:rPr>
+        <w:t xml:space="preserve"> </w:t>
+      </w:r>
+      <w:r>
+        <w:rPr>
+          <w:highlight w:val="none"/>
+          <w:vertAlign w:val="superscript"/>
+        </w:rPr>
+        <w:t>21</w:t>
+      </w:r>
+      <w:r>
+        <w:rPr>
+          <w:highlight w:val="none"/>
+        </w:rPr>
+        <w:t xml:space="preserve">. A dominating set is a group of nodes such that every node in the graph either belongs to the set or is adjacent to a member. Control frequency was defined as the proportion of </w:t>
+      </w:r>
+      <w:r>
+        <w:rPr>
+          <w:rFonts w:hint="eastAsia"/>
+          <w:highlight w:val="none"/>
+        </w:rPr>
+        <w:t>MDS solutions</w:t>
+      </w:r>
+      <w:r>
+        <w:rPr>
+          <w:highlight w:val="none"/>
+        </w:rPr>
+        <w:t xml:space="preserve"> containing a node. The module control network summarised inter-module structural coverage using average module control strength</w:t>
+      </w:r>
+      <w:r>
+        <w:rPr>
+          <w:rFonts w:hint="eastAsia" w:eastAsia="宋体"/>
+          <w:highlight w:val="none"/>
+          <w:lang w:val="en-US" w:eastAsia="zh-CN"/>
+        </w:rPr>
+        <w:t xml:space="preserve"> (AMCS)</w:t>
+      </w:r>
+      <w:r>
+        <w:rPr>
+          <w:highlight w:val="none"/>
+          <w:vertAlign w:val="superscript"/>
+        </w:rPr>
+        <w:t>22</w:t>
+      </w:r>
+      <w:r>
+        <w:rPr>
+          <w:highlight w:val="none"/>
+        </w:rPr>
+        <w:t>. These quantities refer to the topology of the estimated undirected graph; they do not represent intervention effects, dynamical controllability or temporal precedence.</w:t>
+      </w:r>
+    </w:p>
+    <w:p>
+      <w:pPr>
+        <w:rPr>
+          <w:highlight w:val="none"/>
+        </w:rPr>
+      </w:pPr>
+      <w:r>
+        <w:rPr>
+          <w:highlight w:val="none"/>
+        </w:rPr>
+        <w:t>To separate minimum-set size from node identity, 500 degree-preserving null networks were generated by double-edge-swap randomisation and each node's observed control frequency was compared with its node-specific null domination frequency. Estimator sensitivity was examined with EBIC graphical</w:t>
+      </w:r>
+      <w:r>
+        <w:rPr>
+          <w:rFonts w:hint="eastAsia" w:eastAsia="宋体"/>
+          <w:highlight w:val="none"/>
+          <w:lang w:val="en-US" w:eastAsia="zh-CN"/>
+        </w:rPr>
+        <w:t xml:space="preserve"> l</w:t>
+      </w:r>
+      <w:r>
+        <w:rPr>
+          <w:highlight w:val="none"/>
+        </w:rPr>
+        <w:t>asso networks at gamma values of 0, 0.25 and 0.5, the primary cross-validated network, and a positive-edges-only version. Six community-detection algorithms (Louvain, Leiden, Walktrap, Spinglass, Fast-Greedy and Infomap) were compared with the six prespecified domains using adjusted Rand index and normalised mutual information</w:t>
+      </w:r>
+      <w:r>
+        <w:rPr>
+          <w:rFonts w:hint="eastAsia" w:eastAsia="宋体"/>
+          <w:highlight w:val="none"/>
+          <w:vertAlign w:val="superscript"/>
+          <w:lang w:val="en-US" w:eastAsia="zh-CN"/>
+        </w:rPr>
+        <w:t>31</w:t>
+      </w:r>
+      <w:r>
+        <w:rPr>
+          <w:highlight w:val="none"/>
+        </w:rPr>
+        <w:t>. Community assignments were also compared across waves.</w:t>
+      </w:r>
+    </w:p>
+    <w:p>
+      <w:pPr>
+        <w:rPr>
+          <w:rFonts w:hint="eastAsia" w:eastAsia="宋体"/>
+          <w:highlight w:val="none"/>
+          <w:lang w:val="en-US" w:eastAsia="zh-CN"/>
+        </w:rPr>
+      </w:pPr>
+      <w:r>
+        <w:rPr>
+          <w:highlight w:val="none"/>
+        </w:rPr>
+        <w:t>We additionally calculated node strength, closeness, betweenness, eigenvector centrality, signed expected influence, bridge strength, bridge expected influence, bridge betweenness, participation coefficient, average controllability, modal controllability and control energy</w:t>
+      </w:r>
+      <w:r>
+        <w:rPr>
+          <w:rFonts w:hint="eastAsia" w:eastAsia="宋体"/>
+          <w:highlight w:val="none"/>
+          <w:vertAlign w:val="superscript"/>
+          <w:lang w:val="en-US" w:eastAsia="zh-CN"/>
+        </w:rPr>
+        <w:t>32</w:t>
+      </w:r>
+      <w:r>
+        <w:rPr>
+          <w:highlight w:val="none"/>
+        </w:rPr>
+        <w:t xml:space="preserve">. </w:t>
+      </w:r>
+      <w:r>
+        <w:rPr>
+          <w:rFonts w:hint="eastAsia"/>
+          <w:highlight w:val="none"/>
+        </w:rPr>
+        <w:t>Average and modal controllability, together with the control energy associated with state transitions in the ISI and ACT modules, were derived from the discrete-time linear controllability Gramian applied to the absolute-weight adjacency matrix.</w:t>
+      </w:r>
+      <w:r>
+        <w:rPr>
+          <w:rFonts w:hint="eastAsia" w:eastAsia="宋体"/>
+          <w:highlight w:val="none"/>
+          <w:lang w:val="en-US" w:eastAsia="zh-CN"/>
+        </w:rPr>
+        <w:t xml:space="preserve"> </w:t>
+      </w:r>
+      <w:r>
+        <w:rPr>
+          <w:highlight w:val="none"/>
+        </w:rPr>
+        <w:t>Spearman correlations and principal-component analysis assessed overlap among node metrics. Node-knockout analyses and sustained nonlinear propagation simulations were retained as supplementary robustness analyses. The propagation model applied a hyperbolic-tangent activation with gain g = 0.9 to the row-normalised absolute adjacency matrix under sustained module input.</w:t>
+      </w:r>
+      <w:r>
+        <w:rPr>
+          <w:rFonts w:hint="eastAsia" w:eastAsia="宋体"/>
+          <w:highlight w:val="none"/>
+          <w:lang w:val="en-US" w:eastAsia="zh-CN"/>
+        </w:rPr>
+        <w:t xml:space="preserve"> Group-level network structures were compared using a permutation-based network comparison test</w:t>
+      </w:r>
+      <w:r>
+        <w:rPr>
+          <w:rFonts w:hint="eastAsia" w:eastAsia="宋体"/>
+          <w:highlight w:val="none"/>
+          <w:vertAlign w:val="superscript"/>
+          <w:lang w:val="en-US" w:eastAsia="zh-CN"/>
+        </w:rPr>
+        <w:t>50</w:t>
+      </w:r>
+      <w:r>
+        <w:rPr>
+          <w:rFonts w:hint="eastAsia" w:eastAsia="宋体"/>
+          <w:highlight w:val="none"/>
+          <w:lang w:val="en-US" w:eastAsia="zh-CN"/>
+        </w:rPr>
+        <w:t>.</w:t>
+      </w:r>
+    </w:p>
+    <w:p>
+      <w:pPr>
         <w:pStyle w:val="5"/>
         <w:keepNext/>
         <w:rPr>
@@ -1942,7 +3402,7 @@
         <w:rPr>
           <w:highlight w:val="none"/>
         </w:rPr>
-        <w:t>SEARCH cross-lagged panel network</w:t>
+        <w:t>Exploratory Bayesian graph</w:t>
       </w:r>
     </w:p>
     <w:p>
@@ -1955,14 +3415,42 @@
         <w:rPr>
           <w:highlight w:val="none"/>
         </w:rPr>
-        <w:t>For each follow-up domain, we fitted an ordinary least-squares regression containing all six baseline domain scores, including the corresponding autoregressive predictor. Coefficients were standardised and HC3 heteroskedasticity-robust standard errors were used. The 30 cross-domain paths were evaluated with a Bonferroni-adjusted alpha of 0.05/30 = 0.0017</w:t>
-      </w:r>
-      <w:r>
-        <w:rPr>
-          <w:highlight w:val="none"/>
-          <w:vertAlign w:val="superscript"/>
-        </w:rPr>
-        <w:t>26,</w:t>
+        <w:t xml:space="preserve">The six baseline SEARCH domain scores were discretised into tertiles and a directed acyclic graph was learned by hill-climb search with the Bayesian information criterion in pgmpy. Directed-edge stability was estimated across 200 bootstrap resamples. We also examined the completed partially directed acyclic graph, quartile discretisation, a continuous Gaussian Bayesian network and leave-one-domain-out correlations. </w:t>
+      </w:r>
+      <w:r>
+        <w:rPr>
+          <w:rFonts w:hint="eastAsia"/>
+          <w:highlight w:val="none"/>
+        </w:rPr>
+        <w:t>Because observational Bayesian graphs identify an equivalence class and may be affected by unmeasured confounding, this analysis was interpreted as an exploratory comparison with CLPN ordering rather than causal identification.</w:t>
+      </w:r>
+    </w:p>
+    <w:p>
+      <w:pPr>
+        <w:pStyle w:val="5"/>
+        <w:keepNext/>
+        <w:rPr>
+          <w:highlight w:val="none"/>
+        </w:rPr>
+      </w:pPr>
+      <w:r>
+        <w:rPr>
+          <w:highlight w:val="none"/>
+        </w:rPr>
+        <w:t>Global Mind Project analysis</w:t>
+      </w:r>
+    </w:p>
+    <w:p>
+      <w:pPr>
+        <w:rPr>
+          <w:highlight w:val="none"/>
+        </w:rPr>
+      </w:pPr>
+      <w:r>
+        <w:rPr>
+          <w:highlight w:val="none"/>
+        </w:rPr>
+        <w:t>The Global Mind Project/Mental Health Million dataset contains adult self-report records collected internationally</w:t>
       </w:r>
       <w:r>
         <w:rPr>
@@ -1971,30 +3459,105 @@
           <w:vertAlign w:val="superscript"/>
           <w:lang w:val="en-US" w:eastAsia="zh-CN"/>
         </w:rPr>
-        <w:t xml:space="preserve"> 36</w:t>
-      </w:r>
-      <w:r>
-        <w:rPr>
-          <w:highlight w:val="none"/>
-        </w:rPr>
-        <w:t>. Net temporal directionality was calculated for each domain as the sum of absolute cross-lagged outgoing coefficients minus the sum of absolute incoming coefficients; autoregressive coefficients were excluded. Percentile 95% confidence intervals were estimated with 1,000 nonparametric bootstrap resamples.</w:t>
+        <w:t>29</w:t>
+      </w:r>
+      <w:r>
+        <w:rPr>
+          <w:highlight w:val="none"/>
+          <w:vertAlign w:val="superscript"/>
+        </w:rPr>
+        <w:t>,</w:t>
+      </w:r>
+      <w:r>
+        <w:rPr>
+          <w:rFonts w:hint="eastAsia" w:eastAsia="宋体"/>
+          <w:highlight w:val="none"/>
+          <w:vertAlign w:val="superscript"/>
+          <w:lang w:val="en-US" w:eastAsia="zh-CN"/>
+        </w:rPr>
+        <w:t xml:space="preserve"> 30</w:t>
+      </w:r>
+      <w:r>
+        <w:rPr>
+          <w:highlight w:val="none"/>
+        </w:rPr>
+        <w:t xml:space="preserve">. </w:t>
+      </w:r>
+      <w:r>
+        <w:rPr>
+          <w:rFonts w:hint="eastAsia"/>
+          <w:highlight w:val="none"/>
+        </w:rPr>
+        <w:t>We selected participants aged 18–24 years; 147,506 had complete data for six mapped constructs and were included in the pooled multinational analysis.</w:t>
+      </w:r>
+      <w:r>
+        <w:rPr>
+          <w:highlight w:val="none"/>
+        </w:rPr>
+        <w:t xml:space="preserve"> Emotion was represented by fear/anxiety, sadness/hopelessness, mood swings and anger; broad behaviour by restlessness/hyperactivity, aggression and impulsivity; sleep by sleep frequency and quality; diet by ultra-processed food, fruit/vegetable and sugary-food frequency and appetite; activity by exercise frequency; and digital exposure by social-media frequency.</w:t>
       </w:r>
     </w:p>
     <w:p>
       <w:pPr>
         <w:rPr>
-          <w:highlight w:val="none"/>
-        </w:rPr>
-      </w:pPr>
-      <w:r>
-        <w:rPr>
-          <w:highlight w:val="none"/>
-        </w:rPr>
-        <w:t>Sensitivity analyses recalculated directionality using only Bonferroni-significant paths, adjusted the regressions for age, sex and grade, used school-cluster-robust inference, and fitted a five-domain model excluding diet. These analyses tested robustness of the directionality ranking and sign under alternative specifications.</w:t>
+          <w:rFonts w:hint="eastAsia"/>
+          <w:highlight w:val="none"/>
+        </w:rPr>
+      </w:pPr>
+      <w:r>
+        <w:rPr>
+          <w:rFonts w:hint="eastAsia"/>
+          <w:highlight w:val="none"/>
+        </w:rPr>
+        <w:t xml:space="preserve">Within each mapped GMP domain, component items were z-standardised and averaged to form a domain score. The six domain scores were transformed to normal marginals, and a Gaussian graphical model was estimated using cross-validated graphical </w:t>
+      </w:r>
+      <w:r>
+        <w:rPr>
+          <w:rFonts w:hint="eastAsia" w:eastAsia="宋体"/>
+          <w:highlight w:val="none"/>
+          <w:lang w:val="en-US" w:eastAsia="zh-CN"/>
+        </w:rPr>
+        <w:t>l</w:t>
+      </w:r>
+      <w:r>
+        <w:rPr>
+          <w:rFonts w:hint="eastAsia"/>
+          <w:highlight w:val="none"/>
+        </w:rPr>
+        <w:t xml:space="preserve">asso. Domain strength was calculated as the sum of absolute partial correlations, with 95% confidence intervals obtained from 300 </w:t>
+      </w:r>
+      <w:r>
+        <w:rPr>
+          <w:rFonts w:hint="eastAsia" w:eastAsia="宋体"/>
+          <w:highlight w:val="none"/>
+          <w:lang w:eastAsia="zh-CN"/>
+        </w:rPr>
+        <w:t>nonparametric</w:t>
+      </w:r>
+      <w:r>
+        <w:rPr>
+          <w:rFonts w:hint="eastAsia"/>
+          <w:highlight w:val="none"/>
+        </w:rPr>
+        <w:t xml:space="preserve"> bootstrap resamples.  </w:t>
       </w:r>
     </w:p>
     <w:p>
       <w:pPr>
+        <w:rPr>
+          <w:highlight w:val="none"/>
+        </w:rPr>
+      </w:pPr>
+      <w:r>
+        <w:rPr>
+          <w:rFonts w:hint="eastAsia"/>
+          <w:highlight w:val="none"/>
+        </w:rPr>
+        <w:t>For the descriptive comparison in Fig. 5b, the 104 baseline SEARCH items were summed within six corresponding domains, and the resulting domain scores were z-standardised. A six-domain partial-correlation network was derived from the inverse correlation matrix, with domain strength calculated in the same way. Strengths were normalised separately within each cohort by dividing each value by the maximum domain strength, so that the strongest domain was assigned a value of 1. This comparison was descriptive and did not test differences between cohorts.</w:t>
+      </w:r>
+    </w:p>
+    <w:p>
+      <w:pPr>
         <w:pStyle w:val="5"/>
         <w:keepNext/>
         <w:rPr>
@@ -2005,7 +3568,7 @@
         <w:rPr>
           <w:highlight w:val="none"/>
         </w:rPr>
-        <w:t>Millennium Cohort Study longitudinal analysis</w:t>
+        <w:t>Statistics and reproducibility</w:t>
       </w:r>
     </w:p>
     <w:p>
@@ -2018,546 +3581,7 @@
         <w:rPr>
           <w:highlight w:val="none"/>
         </w:rPr>
-        <w:t>The UK Millennium Cohort Study (MCS) was used for an external longitudinal analysis</w:t>
-      </w:r>
-      <w:r>
-        <w:rPr>
-          <w:highlight w:val="none"/>
-          <w:vertAlign w:val="superscript"/>
-        </w:rPr>
-        <w:t>2</w:t>
-      </w:r>
-      <w:r>
-        <w:rPr>
-          <w:rFonts w:hint="eastAsia" w:eastAsia="宋体"/>
-          <w:highlight w:val="none"/>
-          <w:vertAlign w:val="superscript"/>
-          <w:lang w:val="en-US" w:eastAsia="zh-CN"/>
-        </w:rPr>
-        <w:t>8</w:t>
-      </w:r>
-      <w:r>
-        <w:rPr>
-          <w:highlight w:val="none"/>
-        </w:rPr>
-        <w:t>. Sweep 6 at age 14 (N = 11,852)</w:t>
-      </w:r>
-      <w:r>
-        <w:rPr>
-          <w:highlight w:val="none"/>
-          <w:vertAlign w:val="superscript"/>
-        </w:rPr>
-        <w:t>4</w:t>
-      </w:r>
-      <w:r>
-        <w:rPr>
-          <w:rFonts w:hint="eastAsia" w:eastAsia="宋体"/>
-          <w:highlight w:val="none"/>
-          <w:vertAlign w:val="superscript"/>
-          <w:lang w:val="en-US" w:eastAsia="zh-CN"/>
-        </w:rPr>
-        <w:t>6</w:t>
-      </w:r>
-      <w:r>
-        <w:rPr>
-          <w:highlight w:val="none"/>
-        </w:rPr>
-        <w:t xml:space="preserve"> and Sweep 7 at age 17 (N = 10,343)</w:t>
-      </w:r>
-      <w:r>
-        <w:rPr>
-          <w:highlight w:val="none"/>
-          <w:vertAlign w:val="superscript"/>
-        </w:rPr>
-        <w:t>4</w:t>
-      </w:r>
-      <w:r>
-        <w:rPr>
-          <w:rFonts w:hint="eastAsia" w:eastAsia="宋体"/>
-          <w:highlight w:val="none"/>
-          <w:vertAlign w:val="superscript"/>
-          <w:lang w:val="en-US" w:eastAsia="zh-CN"/>
-        </w:rPr>
-        <w:t>7</w:t>
-      </w:r>
-      <w:r>
-        <w:rPr>
-          <w:highlight w:val="none"/>
-        </w:rPr>
-        <w:t xml:space="preserve"> were obtained under licence from the UK Data Service. De-identified family and cohort-member identifiers linked 9,520 adolescents across sweeps. Six nodes were available at both ages: self-reported </w:t>
-      </w:r>
-      <w:r>
-        <w:rPr>
-          <w:rFonts w:hint="eastAsia" w:eastAsia="宋体"/>
-          <w:highlight w:val="none"/>
-          <w:lang w:eastAsia="zh-CN"/>
-        </w:rPr>
-        <w:t>internalising</w:t>
-      </w:r>
-      <w:r>
-        <w:rPr>
-          <w:highlight w:val="none"/>
-        </w:rPr>
-        <w:t xml:space="preserve"> distress, assessed with the 13-item Short Mood and Feelings Questionnaire at age 14</w:t>
-      </w:r>
-      <w:r>
-        <w:rPr>
-          <w:rFonts w:hint="eastAsia" w:eastAsia="宋体"/>
-          <w:highlight w:val="none"/>
-          <w:vertAlign w:val="superscript"/>
-          <w:lang w:val="en-US" w:eastAsia="zh-CN"/>
-        </w:rPr>
-        <w:t>48</w:t>
-      </w:r>
-      <w:r>
-        <w:rPr>
-          <w:highlight w:val="none"/>
-        </w:rPr>
-        <w:t xml:space="preserve"> and the Kessler K6 at age 17</w:t>
-      </w:r>
-      <w:r>
-        <w:rPr>
-          <w:rFonts w:hint="eastAsia" w:eastAsia="宋体"/>
-          <w:highlight w:val="none"/>
-          <w:vertAlign w:val="superscript"/>
-          <w:lang w:val="en-US" w:eastAsia="zh-CN"/>
-        </w:rPr>
-        <w:t>49</w:t>
-      </w:r>
-      <w:r>
-        <w:rPr>
-          <w:highlight w:val="none"/>
-        </w:rPr>
-        <w:t>; SDQ conduct, hyperactivity/inattention and peer-problem subscales; self-reported hours of social-media use; and self-reported hours of electronic gaming. Scores were z-standardised within wave.</w:t>
-      </w:r>
-    </w:p>
-    <w:p>
-      <w:pPr>
-        <w:rPr>
-          <w:highlight w:val="none"/>
-        </w:rPr>
-      </w:pPr>
-      <w:r>
-        <w:rPr>
-          <w:highlight w:val="none"/>
-        </w:rPr>
-        <w:t xml:space="preserve">The MCS cross-lagged model used the same regression and directionality definitions as SEARCH, with 500 nonparametric bootstrap resamples. The complete-case analysis included 7,838 participants. MCS does not contain the CIAS-R or a directly comparable diet measure; it therefore tests the temporal position of </w:t>
-      </w:r>
-      <w:r>
-        <w:rPr>
-          <w:rFonts w:hint="eastAsia" w:eastAsia="宋体"/>
-          <w:highlight w:val="none"/>
-          <w:lang w:eastAsia="zh-CN"/>
-        </w:rPr>
-        <w:t>internalising</w:t>
-      </w:r>
-      <w:r>
-        <w:rPr>
-          <w:highlight w:val="none"/>
-        </w:rPr>
-        <w:t xml:space="preserve"> distress and direct screen-related exposure rather than replicating the complete SEARCH measurement system. The </w:t>
-      </w:r>
-      <w:r>
-        <w:rPr>
-          <w:rFonts w:hint="eastAsia" w:eastAsia="宋体"/>
-          <w:highlight w:val="none"/>
-          <w:lang w:eastAsia="zh-CN"/>
-        </w:rPr>
-        <w:t>internalising</w:t>
-      </w:r>
-      <w:r>
-        <w:rPr>
-          <w:highlight w:val="none"/>
-        </w:rPr>
-        <w:t xml:space="preserve"> instruments also differed by sweep, so the analysis is interpreted at the construct level.</w:t>
-      </w:r>
-    </w:p>
-    <w:p>
-      <w:pPr>
-        <w:pStyle w:val="5"/>
-        <w:keepNext/>
-        <w:rPr>
-          <w:highlight w:val="none"/>
-        </w:rPr>
-      </w:pPr>
-      <w:r>
-        <w:rPr>
-          <w:highlight w:val="none"/>
-        </w:rPr>
-        <w:t>Baseline SEARCH network reconstruction</w:t>
-      </w:r>
-    </w:p>
-    <w:p>
-      <w:pPr>
-        <w:rPr>
-          <w:highlight w:val="none"/>
-        </w:rPr>
-      </w:pPr>
-      <w:r>
-        <w:rPr>
-          <w:highlight w:val="none"/>
-        </w:rPr>
-        <w:t>Item responses were transformed to normal marginals with a nonparanormal Gaussian-copula transformation. A Gaussian graphical model was estimated with graphical Lasso</w:t>
-      </w:r>
-      <w:r>
-        <w:rPr>
-          <w:highlight w:val="none"/>
-          <w:vertAlign w:val="superscript"/>
-        </w:rPr>
-        <w:t>18,</w:t>
-      </w:r>
-      <w:r>
-        <w:rPr>
-          <w:rFonts w:hint="eastAsia" w:eastAsia="宋体"/>
-          <w:highlight w:val="none"/>
-          <w:vertAlign w:val="superscript"/>
-          <w:lang w:val="en-US" w:eastAsia="zh-CN"/>
-        </w:rPr>
-        <w:t xml:space="preserve"> </w:t>
-      </w:r>
-      <w:r>
-        <w:rPr>
-          <w:highlight w:val="none"/>
-          <w:vertAlign w:val="superscript"/>
-        </w:rPr>
-        <w:t>19</w:t>
-      </w:r>
-      <w:r>
-        <w:rPr>
-          <w:highlight w:val="none"/>
-        </w:rPr>
-        <w:t>. The regularisation parameter was selected by likelihood-based K-fold cross-validation over a 100-point geometric grid from lambda-max = 0.824 to 1% of that value, yielding lambda = 0.0581. Partial correlations were derived from the precision matrix. Cross-sectional network reporting followed current methodological standards</w:t>
-      </w:r>
-      <w:r>
-        <w:rPr>
-          <w:highlight w:val="none"/>
-          <w:vertAlign w:val="superscript"/>
-        </w:rPr>
-        <w:t>23</w:t>
-      </w:r>
-      <w:r>
-        <w:rPr>
-          <w:highlight w:val="none"/>
-        </w:rPr>
-        <w:t>.</w:t>
-      </w:r>
-    </w:p>
-    <w:p>
-      <w:pPr>
-        <w:pStyle w:val="5"/>
-        <w:keepNext/>
-        <w:rPr>
-          <w:highlight w:val="none"/>
-        </w:rPr>
-      </w:pPr>
-      <w:r>
-        <w:rPr>
-          <w:highlight w:val="none"/>
-        </w:rPr>
-        <w:t>Structural-control and robustness analyses</w:t>
-      </w:r>
-    </w:p>
-    <w:p>
-      <w:pPr>
-        <w:rPr>
-          <w:highlight w:val="none"/>
-        </w:rPr>
-      </w:pPr>
-      <w:r>
-        <w:rPr>
-          <w:highlight w:val="none"/>
-        </w:rPr>
-        <w:t>Minimum dominating sets were enumerated exhaustively</w:t>
-      </w:r>
-      <w:r>
-        <w:rPr>
-          <w:highlight w:val="none"/>
-          <w:vertAlign w:val="superscript"/>
-        </w:rPr>
-        <w:t>20,</w:t>
-      </w:r>
-      <w:r>
-        <w:rPr>
-          <w:rFonts w:hint="eastAsia" w:eastAsia="宋体"/>
-          <w:highlight w:val="none"/>
-          <w:vertAlign w:val="superscript"/>
-          <w:lang w:val="en-US" w:eastAsia="zh-CN"/>
-        </w:rPr>
-        <w:t xml:space="preserve"> </w:t>
-      </w:r>
-      <w:r>
-        <w:rPr>
-          <w:highlight w:val="none"/>
-          <w:vertAlign w:val="superscript"/>
-        </w:rPr>
-        <w:t>21</w:t>
-      </w:r>
-      <w:r>
-        <w:rPr>
-          <w:highlight w:val="none"/>
-        </w:rPr>
-        <w:t>. A dominating set is a group of nodes such that every node in the graph either belongs to the set or is adjacent to a member. Control frequency was defined as the proportion of minimum dominating-set solutions containing a node. The module control network summarised inter-module structural coverage using average module control strength</w:t>
-      </w:r>
-      <w:r>
-        <w:rPr>
-          <w:highlight w:val="none"/>
-          <w:vertAlign w:val="superscript"/>
-        </w:rPr>
-        <w:t>22</w:t>
-      </w:r>
-      <w:r>
-        <w:rPr>
-          <w:highlight w:val="none"/>
-        </w:rPr>
-        <w:t>. These quantities refer to the topology of the estimated undirected graph; they do not represent intervention effects, dynamical controllability or temporal precedence.</w:t>
-      </w:r>
-    </w:p>
-    <w:p>
-      <w:pPr>
-        <w:rPr>
-          <w:highlight w:val="none"/>
-        </w:rPr>
-      </w:pPr>
-      <w:r>
-        <w:rPr>
-          <w:highlight w:val="none"/>
-        </w:rPr>
-        <w:t>To separate minimum-set size from node identity, 500 degree-preserving null networks were generated by double-edge-swap randomisation and each node's observed control frequency was compared with its node-specific null domination frequency. Estimator sensitivity was examined with EBIC graphical-Lasso networks at gamma values of 0, 0.25 and 0.5, the primary cross-validated network, and a positive-edges-only version. Six community-detection algorithms (Louvain, Leiden, Walktrap, Spinglass, Fast-Greedy and Infomap) were compared with the six prespecified domains using adjusted Rand index and normalised mutual information</w:t>
-      </w:r>
-      <w:r>
-        <w:rPr>
-          <w:rFonts w:hint="eastAsia" w:eastAsia="宋体"/>
-          <w:highlight w:val="none"/>
-          <w:vertAlign w:val="superscript"/>
-          <w:lang w:val="en-US" w:eastAsia="zh-CN"/>
-        </w:rPr>
-        <w:t>31</w:t>
-      </w:r>
-      <w:r>
-        <w:rPr>
-          <w:highlight w:val="none"/>
-        </w:rPr>
-        <w:t>. Community assignments were also compared across waves.</w:t>
-      </w:r>
-    </w:p>
-    <w:p>
-      <w:pPr>
-        <w:rPr>
-          <w:rFonts w:hint="eastAsia" w:eastAsia="宋体"/>
-          <w:highlight w:val="none"/>
-          <w:lang w:val="en-US" w:eastAsia="zh-CN"/>
-        </w:rPr>
-      </w:pPr>
-      <w:r>
-        <w:rPr>
-          <w:highlight w:val="none"/>
-        </w:rPr>
-        <w:t>We additionally calculated node strength, closeness, betweenness, eigenvector centrality, signed expected influence, bridge strength, bridge expected influence, bridge betweenness, participation coefficient, average controllability, modal controllability and control energy</w:t>
-      </w:r>
-      <w:r>
-        <w:rPr>
-          <w:rFonts w:hint="eastAsia" w:eastAsia="宋体"/>
-          <w:highlight w:val="none"/>
-          <w:vertAlign w:val="superscript"/>
-          <w:lang w:val="en-US" w:eastAsia="zh-CN"/>
-        </w:rPr>
-        <w:t>32</w:t>
-      </w:r>
-      <w:r>
-        <w:rPr>
-          <w:highlight w:val="none"/>
-        </w:rPr>
-        <w:t xml:space="preserve">. </w:t>
-      </w:r>
-      <w:r>
-        <w:rPr>
-          <w:rFonts w:hint="eastAsia"/>
-          <w:highlight w:val="none"/>
-        </w:rPr>
-        <w:t>Average and modal controllability and the control energy required to drive the sink modules were derived from the discrete-time linear controllability Gramian applied to the absolute-weight adjacency matrix.</w:t>
-      </w:r>
-      <w:r>
-        <w:rPr>
-          <w:rFonts w:hint="eastAsia" w:eastAsia="宋体"/>
-          <w:highlight w:val="none"/>
-          <w:lang w:val="en-US" w:eastAsia="zh-CN"/>
-        </w:rPr>
-        <w:t xml:space="preserve"> </w:t>
-      </w:r>
-      <w:r>
-        <w:rPr>
-          <w:highlight w:val="none"/>
-        </w:rPr>
-        <w:t>Spearman correlations and principal-component analysis assessed overlap among node metrics. Node-knockout analyses and sustained nonlinear propagation simulations were retained as supplementary robustness analyses. The propagation model applied a hyperbolic-tangent activation with gain g = 0.9 to the row-normalised absolute adjacency matrix under sustained module input.</w:t>
-      </w:r>
-      <w:r>
-        <w:rPr>
-          <w:rFonts w:hint="eastAsia" w:eastAsia="宋体"/>
-          <w:highlight w:val="none"/>
-          <w:lang w:val="en-US" w:eastAsia="zh-CN"/>
-        </w:rPr>
-        <w:t xml:space="preserve"> Group-level network structures were compared using a permutation-based network comparison test</w:t>
-      </w:r>
-      <w:r>
-        <w:rPr>
-          <w:rFonts w:hint="eastAsia" w:eastAsia="宋体"/>
-          <w:highlight w:val="none"/>
-          <w:vertAlign w:val="superscript"/>
-          <w:lang w:val="en-US" w:eastAsia="zh-CN"/>
-        </w:rPr>
-        <w:t>50</w:t>
-      </w:r>
-      <w:r>
-        <w:rPr>
-          <w:rFonts w:hint="eastAsia" w:eastAsia="宋体"/>
-          <w:highlight w:val="none"/>
-          <w:lang w:val="en-US" w:eastAsia="zh-CN"/>
-        </w:rPr>
-        <w:t>.</w:t>
-      </w:r>
-    </w:p>
-    <w:p>
-      <w:pPr>
-        <w:pStyle w:val="5"/>
-        <w:keepNext/>
-        <w:rPr>
-          <w:highlight w:val="none"/>
-        </w:rPr>
-      </w:pPr>
-      <w:r>
-        <w:rPr>
-          <w:highlight w:val="none"/>
-        </w:rPr>
-        <w:t>Exploratory Bayesian graph</w:t>
-      </w:r>
-    </w:p>
-    <w:p>
-      <w:pPr>
-        <w:rPr>
-          <w:highlight w:val="none"/>
-        </w:rPr>
-      </w:pPr>
-      <w:r>
-        <w:rPr>
-          <w:highlight w:val="none"/>
-        </w:rPr>
-        <w:t>The six baseline SEARCH domain scores were discretised into tertiles and a directed acyclic graph was learned by hill-climb search with the Bayesian information criterion in pgmpy. Directed-edge stability was estimated across 200 bootstrap resamples. We also examined the completed partially directed acyclic graph, quartile discretisation, a continuous Gaussian Bayesian network and leave-one-domain-out correlations. Observational Bayesian graphs identify an equivalence class and can be altered by unmeasured confounding. The analysis was therefore interpreted as an exploratory method-level directional comparison rather than causal identification.</w:t>
-      </w:r>
-    </w:p>
-    <w:p>
-      <w:pPr>
-        <w:pStyle w:val="5"/>
-        <w:keepNext/>
-        <w:rPr>
-          <w:highlight w:val="none"/>
-        </w:rPr>
-      </w:pPr>
-      <w:r>
-        <w:rPr>
-          <w:highlight w:val="none"/>
-        </w:rPr>
-        <w:t>Global Mind Project analysis</w:t>
-      </w:r>
-    </w:p>
-    <w:p>
-      <w:pPr>
-        <w:rPr>
-          <w:highlight w:val="none"/>
-        </w:rPr>
-      </w:pPr>
-      <w:r>
-        <w:rPr>
-          <w:highlight w:val="none"/>
-        </w:rPr>
-        <w:t>The Global Mind Project/Mental Health Million dataset contains adult self-report records collected internationally</w:t>
-      </w:r>
-      <w:r>
-        <w:rPr>
-          <w:rFonts w:hint="eastAsia" w:eastAsia="宋体"/>
-          <w:highlight w:val="none"/>
-          <w:vertAlign w:val="superscript"/>
-          <w:lang w:val="en-US" w:eastAsia="zh-CN"/>
-        </w:rPr>
-        <w:t>29</w:t>
-      </w:r>
-      <w:r>
-        <w:rPr>
-          <w:highlight w:val="none"/>
-          <w:vertAlign w:val="superscript"/>
-        </w:rPr>
-        <w:t>,</w:t>
-      </w:r>
-      <w:r>
-        <w:rPr>
-          <w:rFonts w:hint="eastAsia" w:eastAsia="宋体"/>
-          <w:highlight w:val="none"/>
-          <w:vertAlign w:val="superscript"/>
-          <w:lang w:val="en-US" w:eastAsia="zh-CN"/>
-        </w:rPr>
-        <w:t xml:space="preserve"> 30</w:t>
-      </w:r>
-      <w:r>
-        <w:rPr>
-          <w:highlight w:val="none"/>
-        </w:rPr>
-        <w:t>. We selected participants aged 18-24 years; 147,506 had complete data for six mapped constructs in a pooled sample spanning 240 countries. Emotion was represented by fear/anxiety, sadness/hopelessness, mood swings and anger; broad behaviour by restlessness/hyperactivity, aggression and impulsivity; sleep by sleep frequency and quality; diet by ultra-processed food, fruit/vegetable and sugary-food frequency and appetite; activity by exercise frequency; and digital exposure by social-media frequency.</w:t>
-      </w:r>
-    </w:p>
-    <w:p>
-      <w:pPr>
-        <w:rPr>
-          <w:rFonts w:hint="eastAsia"/>
-          <w:highlight w:val="none"/>
-        </w:rPr>
-      </w:pPr>
-      <w:r>
-        <w:rPr>
-          <w:rFonts w:hint="eastAsia"/>
-          <w:highlight w:val="none"/>
-        </w:rPr>
-        <w:t xml:space="preserve">Within each mapped GMP domain, component items were z-standardised and averaged to form a domain score. The six domain scores were transformed to normal marginals, and a Gaussian graphical model was estimated using cross-validated graphical Lasso. Domain strength was calculated as the sum of absolute partial correlations, with 95% confidence intervals obtained from 300 non-parametric bootstrap resamples.  </w:t>
-      </w:r>
-    </w:p>
-    <w:p>
-      <w:pPr>
-        <w:rPr>
-          <w:highlight w:val="none"/>
-        </w:rPr>
-      </w:pPr>
-      <w:r>
-        <w:rPr>
-          <w:rFonts w:hint="eastAsia"/>
-          <w:highlight w:val="none"/>
-        </w:rPr>
-        <w:t>For the descriptive comparison in Fig. 5b, the 104 baseline SEARCH items were summed within six corresponding domains, and the resulting domain scores were z-standardised. A six-domain partial-correlation network was derived from the inverse correlation matrix, with domain strength calculated in the same way. Strengths were normalised separately within each cohort by dividing each value by the maximum domain strength, so that the strongest domain was assigned a value of 1. This comparison was descriptive and did not test differences between cohorts.</w:t>
-      </w:r>
-    </w:p>
-    <w:p>
-      <w:pPr>
-        <w:pStyle w:val="5"/>
-        <w:keepNext/>
-        <w:rPr>
-          <w:highlight w:val="none"/>
-        </w:rPr>
-      </w:pPr>
-      <w:r>
-        <w:rPr>
-          <w:highlight w:val="none"/>
-        </w:rPr>
-        <w:t>Statistics and reproducibility</w:t>
-      </w:r>
-    </w:p>
-    <w:p>
-      <w:pPr>
-        <w:rPr>
-          <w:highlight w:val="none"/>
-        </w:rPr>
-      </w:pPr>
-      <w:r>
-        <w:rPr>
-          <w:highlight w:val="none"/>
-        </w:rPr>
-        <w:t>All available eligible records were analysed and no a priori sample-size calculation was performed. No missing-data imputation was used. The SEARCH cross-lagged model included 6,092 linked complete cases, the MCS model included 7,838 complete cases, the secondary baseline SEARCH network included 10,356 participants, and the Global Mind Project analysis included 147,506 complete cases. All tests were two-sided. Bootstrap counts were 1,000 for SEARCH directionality, 500 for MCS directionality, 300 for Global Mind Project strength, 200 for Bayesian edge stability and 500 for degree-preserving network nulls. Random seed 42 was used throughout.</w:t>
+        <w:t xml:space="preserve">All available eligible records were analysed and no a priori sample-size calculation was performed. No missing-data imputation was used. The SEARCH cross-lagged model included 6,092 linked complete cases, the MCS model included 7,838 complete cases, the secondary baseline SEARCH network included 10,356 participants, and the Global Mind Project analysis included 147,506 complete cases. All tests were two-sided. Bootstrap counts were 1,000 for SEARCH directionality, 500 for MCS directionality, 300 for Global Mind Project strength, 200 for Bayesian edge stability and 500 for degree-preserving network nulls. </w:t>
       </w:r>
     </w:p>
     <w:p>
@@ -4268,7 +5292,26 @@
           <w:szCs w:val="18"/>
           <w:highlight w:val="none"/>
         </w:rPr>
-        <w:t>21. Nacher, J. C. &amp; Akutsu, T. Minimum dominating set-based methods for analyzing biological networks.</w:t>
+        <w:t xml:space="preserve">21. Nacher, J. C. &amp; Akutsu, T. </w:t>
+      </w:r>
+      <w:r>
+        <w:rPr>
+          <w:rFonts w:hint="eastAsia" w:eastAsia="宋体" w:cs="Times New Roman"/>
+          <w:sz w:val="18"/>
+          <w:szCs w:val="18"/>
+          <w:highlight w:val="none"/>
+          <w:lang w:eastAsia="zh-CN"/>
+        </w:rPr>
+        <w:t>Minimum dominating set</w:t>
+      </w:r>
+      <w:r>
+        <w:rPr>
+          <w:rFonts w:hint="default" w:ascii="Times New Roman" w:hAnsi="Times New Roman" w:cs="Times New Roman"/>
+          <w:sz w:val="18"/>
+          <w:szCs w:val="18"/>
+          <w:highlight w:val="none"/>
+        </w:rPr>
+        <w:t>-based methods for analyzing biological networks.</w:t>
       </w:r>
       <w:r>
         <w:rPr>
@@ -6378,7 +7421,41 @@
           <w:szCs w:val="18"/>
           <w:highlight w:val="none"/>
         </w:rPr>
-        <w:t>Age 14, Sweep 6, 2015.</w:t>
+        <w:t>Age 14, Sweep 6, 2015</w:t>
+      </w:r>
+      <w:r>
+        <w:rPr>
+          <w:rFonts w:hint="eastAsia" w:eastAsia="宋体" w:cs="Times New Roman"/>
+          <w:i w:val="0"/>
+          <w:iCs w:val="0"/>
+          <w:sz w:val="18"/>
+          <w:szCs w:val="18"/>
+          <w:highlight w:val="none"/>
+          <w:lang w:val="en-US" w:eastAsia="zh-CN"/>
+        </w:rPr>
+        <w:t xml:space="preserve"> </w:t>
+      </w:r>
+      <w:r>
+        <w:rPr>
+          <w:rFonts w:hint="default" w:ascii="Times New Roman" w:hAnsi="Times New Roman" w:cs="Times New Roman"/>
+          <w:i w:val="0"/>
+          <w:iCs w:val="0"/>
+          <w:sz w:val="18"/>
+          <w:szCs w:val="18"/>
+          <w:highlight w:val="none"/>
+        </w:rPr>
+        <w:t>[data collection]</w:t>
+      </w:r>
+      <w:r>
+        <w:rPr>
+          <w:rFonts w:hint="default" w:ascii="Times New Roman" w:hAnsi="Times New Roman" w:cs="Times New Roman"/>
+          <w:i/>
+          <w:iCs/>
+          <w:sz w:val="18"/>
+          <w:szCs w:val="18"/>
+          <w:highlight w:val="none"/>
+        </w:rPr>
+        <w:t>.</w:t>
       </w:r>
       <w:r>
         <w:rPr>
@@ -6439,7 +7516,41 @@
           <w:szCs w:val="18"/>
           <w:highlight w:val="none"/>
         </w:rPr>
-        <w:t>Age 17, Sweep 7, 2018.</w:t>
+        <w:t>Age 17, Sweep 7, 2018</w:t>
+      </w:r>
+      <w:r>
+        <w:rPr>
+          <w:rFonts w:hint="eastAsia" w:eastAsia="宋体" w:cs="Times New Roman"/>
+          <w:i/>
+          <w:iCs/>
+          <w:sz w:val="18"/>
+          <w:szCs w:val="18"/>
+          <w:highlight w:val="none"/>
+          <w:lang w:val="en-US" w:eastAsia="zh-CN"/>
+        </w:rPr>
+        <w:t xml:space="preserve"> </w:t>
+      </w:r>
+      <w:r>
+        <w:rPr>
+          <w:rFonts w:hint="default" w:ascii="Times New Roman" w:hAnsi="Times New Roman" w:cs="Times New Roman"/>
+          <w:i w:val="0"/>
+          <w:iCs w:val="0"/>
+          <w:sz w:val="18"/>
+          <w:szCs w:val="18"/>
+          <w:highlight w:val="none"/>
+        </w:rPr>
+        <w:t>[data collection]</w:t>
+      </w:r>
+      <w:r>
+        <w:rPr>
+          <w:rFonts w:hint="default" w:ascii="Times New Roman" w:hAnsi="Times New Roman" w:cs="Times New Roman"/>
+          <w:i/>
+          <w:iCs/>
+          <w:sz w:val="18"/>
+          <w:szCs w:val="18"/>
+          <w:highlight w:val="none"/>
+        </w:rPr>
+        <w:t>.</w:t>
       </w:r>
       <w:r>
         <w:rPr>
@@ -7077,7 +8188,7 @@
     <w:lsdException w:qFormat="1" w:uiPriority="99" w:semiHidden="0" w:name="Body Text"/>
     <w:lsdException w:uiPriority="99" w:name="Body Text Indent"/>
     <w:lsdException w:qFormat="1" w:uiPriority="99" w:semiHidden="0" w:name="List Continue"/>
-    <w:lsdException w:uiPriority="99" w:semiHidden="0" w:name="List Continue 2"/>
+    <w:lsdException w:qFormat="1" w:uiPriority="99" w:semiHidden="0" w:name="List Continue 2"/>
     <w:lsdException w:qFormat="1" w:uiPriority="99" w:semiHidden="0" w:name="List Continue 3"/>
     <w:lsdException w:uiPriority="99" w:name="List Continue 4"/>
     <w:lsdException w:uiPriority="99" w:name="List Continue 5"/>
@@ -7167,9 +8278,9 @@
     <w:lsdException w:qFormat="1" w:unhideWhenUsed="0" w:uiPriority="65" w:semiHidden="0" w:name="Medium List 1"/>
     <w:lsdException w:qFormat="1" w:unhideWhenUsed="0" w:uiPriority="66" w:semiHidden="0" w:name="Medium List 2"/>
     <w:lsdException w:qFormat="1" w:unhideWhenUsed="0" w:uiPriority="67" w:semiHidden="0" w:name="Medium Grid 1"/>
-    <w:lsdException w:unhideWhenUsed="0" w:uiPriority="68" w:semiHidden="0" w:name="Medium Grid 2"/>
-    <w:lsdException w:unhideWhenUsed="0" w:uiPriority="69" w:semiHidden="0" w:name="Medium Grid 3"/>
-    <w:lsdException w:unhideWhenUsed="0" w:uiPriority="70" w:semiHidden="0" w:name="Dark List"/>
+    <w:lsdException w:qFormat="1" w:unhideWhenUsed="0" w:uiPriority="68" w:semiHidden="0" w:name="Medium Grid 2"/>
+    <w:lsdException w:qFormat="1" w:unhideWhenUsed="0" w:uiPriority="69" w:semiHidden="0" w:name="Medium Grid 3"/>
+    <w:lsdException w:qFormat="1" w:unhideWhenUsed="0" w:uiPriority="70" w:semiHidden="0" w:name="Dark List"/>
     <w:lsdException w:unhideWhenUsed="0" w:uiPriority="71" w:semiHidden="0" w:name="Colorful Shading"/>
     <w:lsdException w:unhideWhenUsed="0" w:uiPriority="72" w:semiHidden="0" w:name="Colorful List"/>
     <w:lsdException w:unhideWhenUsed="0" w:uiPriority="73" w:semiHidden="0" w:name="Colorful Grid"/>
@@ -7184,9 +8295,9 @@
     <w:lsdException w:qFormat="1" w:unhideWhenUsed="0" w:uiPriority="30" w:semiHidden="0" w:name="Intense Quote"/>
     <w:lsdException w:qFormat="1" w:unhideWhenUsed="0" w:uiPriority="66" w:semiHidden="0" w:name="Medium List 2 Accent 1"/>
     <w:lsdException w:qFormat="1" w:unhideWhenUsed="0" w:uiPriority="67" w:semiHidden="0" w:name="Medium Grid 1 Accent 1"/>
-    <w:lsdException w:unhideWhenUsed="0" w:uiPriority="68" w:semiHidden="0" w:name="Medium Grid 2 Accent 1"/>
-    <w:lsdException w:unhideWhenUsed="0" w:uiPriority="69" w:semiHidden="0" w:name="Medium Grid 3 Accent 1"/>
-    <w:lsdException w:unhideWhenUsed="0" w:uiPriority="70" w:semiHidden="0" w:name="Dark List Accent 1"/>
+    <w:lsdException w:qFormat="1" w:unhideWhenUsed="0" w:uiPriority="68" w:semiHidden="0" w:name="Medium Grid 2 Accent 1"/>
+    <w:lsdException w:qFormat="1" w:unhideWhenUsed="0" w:uiPriority="69" w:semiHidden="0" w:name="Medium Grid 3 Accent 1"/>
+    <w:lsdException w:qFormat="1" w:unhideWhenUsed="0" w:uiPriority="70" w:semiHidden="0" w:name="Dark List Accent 1"/>
     <w:lsdException w:unhideWhenUsed="0" w:uiPriority="71" w:semiHidden="0" w:name="Colorful Shading Accent 1"/>
     <w:lsdException w:unhideWhenUsed="0" w:uiPriority="72" w:semiHidden="0" w:name="Colorful List Accent 1"/>
     <w:lsdException w:unhideWhenUsed="0" w:uiPriority="73" w:semiHidden="0" w:name="Colorful Grid Accent 1"/>
@@ -7198,8 +8309,8 @@
     <w:lsdException w:qFormat="1" w:unhideWhenUsed="0" w:uiPriority="65" w:semiHidden="0" w:name="Medium List 1 Accent 2"/>
     <w:lsdException w:qFormat="1" w:unhideWhenUsed="0" w:uiPriority="66" w:semiHidden="0" w:name="Medium List 2 Accent 2"/>
     <w:lsdException w:qFormat="1" w:unhideWhenUsed="0" w:uiPriority="67" w:semiHidden="0" w:name="Medium Grid 1 Accent 2"/>
-    <w:lsdException w:unhideWhenUsed="0" w:uiPriority="68" w:semiHidden="0" w:name="Medium Grid 2 Accent 2"/>
-    <w:lsdException w:unhideWhenUsed="0" w:uiPriority="69" w:semiHidden="0" w:name="Medium Grid 3 Accent 2"/>
+    <w:lsdException w:qFormat="1" w:unhideWhenUsed="0" w:uiPriority="68" w:semiHidden="0" w:name="Medium Grid 2 Accent 2"/>
+    <w:lsdException w:qFormat="1" w:unhideWhenUsed="0" w:uiPriority="69" w:semiHidden="0" w:name="Medium Grid 3 Accent 2"/>
     <w:lsdException w:unhideWhenUsed="0" w:uiPriority="70" w:semiHidden="0" w:name="Dark List Accent 2"/>
     <w:lsdException w:unhideWhenUsed="0" w:uiPriority="71" w:semiHidden="0" w:name="Colorful Shading Accent 2"/>
     <w:lsdException w:unhideWhenUsed="0" w:uiPriority="72" w:semiHidden="0" w:name="Colorful List Accent 2"/>
@@ -7212,8 +8323,8 @@
     <w:lsdException w:qFormat="1" w:unhideWhenUsed="0" w:uiPriority="65" w:semiHidden="0" w:name="Medium List 1 Accent 3"/>
     <w:lsdException w:qFormat="1" w:unhideWhenUsed="0" w:uiPriority="66" w:semiHidden="0" w:name="Medium List 2 Accent 3"/>
     <w:lsdException w:qFormat="1" w:unhideWhenUsed="0" w:uiPriority="67" w:semiHidden="0" w:name="Medium Grid 1 Accent 3"/>
-    <w:lsdException w:unhideWhenUsed="0" w:uiPriority="68" w:semiHidden="0" w:name="Medium Grid 2 Accent 3"/>
-    <w:lsdException w:unhideWhenUsed="0" w:uiPriority="69" w:semiHidden="0" w:name="Medium Grid 3 Accent 3"/>
+    <w:lsdException w:qFormat="1" w:unhideWhenUsed="0" w:uiPriority="68" w:semiHidden="0" w:name="Medium Grid 2 Accent 3"/>
+    <w:lsdException w:qFormat="1" w:unhideWhenUsed="0" w:uiPriority="69" w:semiHidden="0" w:name="Medium Grid 3 Accent 3"/>
     <w:lsdException w:unhideWhenUsed="0" w:uiPriority="70" w:semiHidden="0" w:name="Dark List Accent 3"/>
     <w:lsdException w:unhideWhenUsed="0" w:uiPriority="71" w:semiHidden="0" w:name="Colorful Shading Accent 3"/>
     <w:lsdException w:unhideWhenUsed="0" w:uiPriority="72" w:semiHidden="0" w:name="Colorful List Accent 3"/>
@@ -7224,10 +8335,10 @@
     <w:lsdException w:qFormat="1" w:unhideWhenUsed="0" w:uiPriority="63" w:semiHidden="0" w:name="Medium Shading 1 Accent 4"/>
     <w:lsdException w:qFormat="1" w:unhideWhenUsed="0" w:uiPriority="64" w:semiHidden="0" w:name="Medium Shading 2 Accent 4"/>
     <w:lsdException w:qFormat="1" w:unhideWhenUsed="0" w:uiPriority="65" w:semiHidden="0" w:name="Medium List 1 Accent 4"/>
-    <w:lsdException w:unhideWhenUsed="0" w:uiPriority="66" w:semiHidden="0" w:name="Medium List 2 Accent 4"/>
+    <w:lsdException w:qFormat="1" w:unhideWhenUsed="0" w:uiPriority="66" w:semiHidden="0" w:name="Medium List 2 Accent 4"/>
     <w:lsdException w:qFormat="1" w:unhideWhenUsed="0" w:uiPriority="67" w:semiHidden="0" w:name="Medium Grid 1 Accent 4"/>
-    <w:lsdException w:unhideWhenUsed="0" w:uiPriority="68" w:semiHidden="0" w:name="Medium Grid 2 Accent 4"/>
-    <w:lsdException w:unhideWhenUsed="0" w:uiPriority="69" w:semiHidden="0" w:name="Medium Grid 3 Accent 4"/>
+    <w:lsdException w:qFormat="1" w:unhideWhenUsed="0" w:uiPriority="68" w:semiHidden="0" w:name="Medium Grid 2 Accent 4"/>
+    <w:lsdException w:qFormat="1" w:unhideWhenUsed="0" w:uiPriority="69" w:semiHidden="0" w:name="Medium Grid 3 Accent 4"/>
     <w:lsdException w:unhideWhenUsed="0" w:uiPriority="70" w:semiHidden="0" w:name="Dark List Accent 4"/>
     <w:lsdException w:unhideWhenUsed="0" w:uiPriority="71" w:semiHidden="0" w:name="Colorful Shading Accent 4"/>
     <w:lsdException w:unhideWhenUsed="0" w:uiPriority="72" w:semiHidden="0" w:name="Colorful List Accent 4"/>
@@ -7240,8 +8351,8 @@
     <w:lsdException w:qFormat="1" w:unhideWhenUsed="0" w:uiPriority="65" w:semiHidden="0" w:name="Medium List 1 Accent 5"/>
     <w:lsdException w:qFormat="1" w:unhideWhenUsed="0" w:uiPriority="66" w:semiHidden="0" w:name="Medium List 2 Accent 5"/>
     <w:lsdException w:qFormat="1" w:unhideWhenUsed="0" w:uiPriority="67" w:semiHidden="0" w:name="Medium Grid 1 Accent 5"/>
-    <w:lsdException w:unhideWhenUsed="0" w:uiPriority="68" w:semiHidden="0" w:name="Medium Grid 2 Accent 5"/>
-    <w:lsdException w:unhideWhenUsed="0" w:uiPriority="69" w:semiHidden="0" w:name="Medium Grid 3 Accent 5"/>
+    <w:lsdException w:qFormat="1" w:unhideWhenUsed="0" w:uiPriority="68" w:semiHidden="0" w:name="Medium Grid 2 Accent 5"/>
+    <w:lsdException w:qFormat="1" w:unhideWhenUsed="0" w:uiPriority="69" w:semiHidden="0" w:name="Medium Grid 3 Accent 5"/>
     <w:lsdException w:unhideWhenUsed="0" w:uiPriority="70" w:semiHidden="0" w:name="Dark List Accent 5"/>
     <w:lsdException w:unhideWhenUsed="0" w:uiPriority="71" w:semiHidden="0" w:name="Colorful Shading Accent 5"/>
     <w:lsdException w:unhideWhenUsed="0" w:uiPriority="72" w:semiHidden="0" w:name="Colorful List Accent 5"/>
@@ -7253,9 +8364,9 @@
     <w:lsdException w:qFormat="1" w:unhideWhenUsed="0" w:uiPriority="64" w:semiHidden="0" w:name="Medium Shading 2 Accent 6"/>
     <w:lsdException w:qFormat="1" w:unhideWhenUsed="0" w:uiPriority="65" w:semiHidden="0" w:name="Medium List 1 Accent 6"/>
     <w:lsdException w:qFormat="1" w:unhideWhenUsed="0" w:uiPriority="66" w:semiHidden="0" w:name="Medium List 2 Accent 6"/>
-    <w:lsdException w:unhideWhenUsed="0" w:uiPriority="67" w:semiHidden="0" w:name="Medium Grid 1 Accent 6"/>
-    <w:lsdException w:unhideWhenUsed="0" w:uiPriority="68" w:semiHidden="0" w:name="Medium Grid 2 Accent 6"/>
-    <w:lsdException w:unhideWhenUsed="0" w:uiPriority="69" w:semiHidden="0" w:name="Medium Grid 3 Accent 6"/>
+    <w:lsdException w:qFormat="1" w:unhideWhenUsed="0" w:uiPriority="67" w:semiHidden="0" w:name="Medium Grid 1 Accent 6"/>
+    <w:lsdException w:qFormat="1" w:unhideWhenUsed="0" w:uiPriority="68" w:semiHidden="0" w:name="Medium Grid 2 Accent 6"/>
+    <w:lsdException w:qFormat="1" w:unhideWhenUsed="0" w:uiPriority="69" w:semiHidden="0" w:name="Medium Grid 3 Accent 6"/>
     <w:lsdException w:unhideWhenUsed="0" w:uiPriority="70" w:semiHidden="0" w:name="Dark List Accent 6"/>
     <w:lsdException w:unhideWhenUsed="0" w:uiPriority="71" w:semiHidden="0" w:name="Colorful Shading Accent 6"/>
     <w:lsdException w:unhideWhenUsed="0" w:uiPriority="72" w:semiHidden="0" w:name="Colorful List Accent 6"/>
@@ -7797,6 +8908,7 @@
     <w:name w:val="List Continue 2"/>
     <w:basedOn w:val="1"/>
     <w:unhideWhenUsed/>
+    <w:qFormat/>
     <w:uiPriority w:val="99"/>
     <w:pPr>
       <w:spacing w:after="120"/>
@@ -13189,6 +14301,7 @@
   <w:style w:type="table" w:styleId="80">
     <w:name w:val="Medium List 2 Accent 4"/>
     <w:basedOn w:val="32"/>
+    <w:qFormat/>
     <w:uiPriority w:val="66"/>
     <w:pPr>
       <w:spacing w:after="0" w:line="240" w:lineRule="auto"/>
@@ -13998,6 +15111,7 @@
   <w:style w:type="table" w:styleId="89">
     <w:name w:val="Medium Grid 1 Accent 6"/>
     <w:basedOn w:val="32"/>
+    <w:qFormat/>
     <w:uiPriority w:val="67"/>
     <w:pPr>
       <w:spacing w:after="0" w:line="240" w:lineRule="auto"/>
@@ -14067,6 +15181,7 @@
   <w:style w:type="table" w:styleId="90">
     <w:name w:val="Medium Grid 2"/>
     <w:basedOn w:val="32"/>
+    <w:qFormat/>
     <w:uiPriority w:val="68"/>
     <w:pPr>
       <w:spacing w:after="0" w:line="240" w:lineRule="auto"/>
@@ -14213,6 +15328,7 @@
   <w:style w:type="table" w:styleId="91">
     <w:name w:val="Medium Grid 2 Accent 1"/>
     <w:basedOn w:val="32"/>
+    <w:qFormat/>
     <w:uiPriority w:val="68"/>
     <w:pPr>
       <w:spacing w:after="0" w:line="240" w:lineRule="auto"/>
@@ -14359,6 +15475,7 @@
   <w:style w:type="table" w:styleId="92">
     <w:name w:val="Medium Grid 2 Accent 2"/>
     <w:basedOn w:val="32"/>
+    <w:qFormat/>
     <w:uiPriority w:val="68"/>
     <w:pPr>
       <w:spacing w:after="0" w:line="240" w:lineRule="auto"/>
@@ -14505,6 +15622,7 @@
   <w:style w:type="table" w:styleId="93">
     <w:name w:val="Medium Grid 2 Accent 3"/>
     <w:basedOn w:val="32"/>
+    <w:qFormat/>
     <w:uiPriority w:val="68"/>
     <w:pPr>
       <w:spacing w:after="0" w:line="240" w:lineRule="auto"/>
@@ -14651,6 +15769,7 @@
   <w:style w:type="table" w:styleId="94">
     <w:name w:val="Medium Grid 2 Accent 4"/>
     <w:basedOn w:val="32"/>
+    <w:qFormat/>
     <w:uiPriority w:val="68"/>
     <w:pPr>
       <w:spacing w:after="0" w:line="240" w:lineRule="auto"/>
@@ -14797,6 +15916,7 @@
   <w:style w:type="table" w:styleId="95">
     <w:name w:val="Medium Grid 2 Accent 5"/>
     <w:basedOn w:val="32"/>
+    <w:qFormat/>
     <w:uiPriority w:val="68"/>
     <w:pPr>
       <w:spacing w:after="0" w:line="240" w:lineRule="auto"/>
@@ -14943,6 +16063,7 @@
   <w:style w:type="table" w:styleId="96">
     <w:name w:val="Medium Grid 2 Accent 6"/>
     <w:basedOn w:val="32"/>
+    <w:qFormat/>
     <w:uiPriority w:val="68"/>
     <w:pPr>
       <w:spacing w:after="0" w:line="240" w:lineRule="auto"/>
@@ -15089,6 +16210,7 @@
   <w:style w:type="table" w:styleId="97">
     <w:name w:val="Medium Grid 3"/>
     <w:basedOn w:val="32"/>
+    <w:qFormat/>
     <w:uiPriority w:val="69"/>
     <w:pPr>
       <w:spacing w:after="0" w:line="240" w:lineRule="auto"/>
@@ -15246,6 +16368,7 @@
   <w:style w:type="table" w:styleId="98">
     <w:name w:val="Medium Grid 3 Accent 1"/>
     <w:basedOn w:val="32"/>
+    <w:qFormat/>
     <w:uiPriority w:val="69"/>
     <w:pPr>
       <w:spacing w:after="0" w:line="240" w:lineRule="auto"/>
@@ -15403,6 +16526,7 @@
   <w:style w:type="table" w:styleId="99">
     <w:name w:val="Medium Grid 3 Accent 2"/>
     <w:basedOn w:val="32"/>
+    <w:qFormat/>
     <w:uiPriority w:val="69"/>
     <w:pPr>
       <w:spacing w:after="0" w:line="240" w:lineRule="auto"/>
@@ -15560,6 +16684,7 @@
   <w:style w:type="table" w:styleId="100">
     <w:name w:val="Medium Grid 3 Accent 3"/>
     <w:basedOn w:val="32"/>
+    <w:qFormat/>
     <w:uiPriority w:val="69"/>
     <w:pPr>
       <w:spacing w:after="0" w:line="240" w:lineRule="auto"/>
@@ -15717,6 +16842,7 @@
   <w:style w:type="table" w:styleId="101">
     <w:name w:val="Medium Grid 3 Accent 4"/>
     <w:basedOn w:val="32"/>
+    <w:qFormat/>
     <w:uiPriority w:val="69"/>
     <w:pPr>
       <w:spacing w:after="0" w:line="240" w:lineRule="auto"/>
@@ -15874,6 +17000,7 @@
   <w:style w:type="table" w:styleId="102">
     <w:name w:val="Medium Grid 3 Accent 5"/>
     <w:basedOn w:val="32"/>
+    <w:qFormat/>
     <w:uiPriority w:val="69"/>
     <w:pPr>
       <w:spacing w:after="0" w:line="240" w:lineRule="auto"/>
@@ -16031,6 +17158,7 @@
   <w:style w:type="table" w:styleId="103">
     <w:name w:val="Medium Grid 3 Accent 6"/>
     <w:basedOn w:val="32"/>
+    <w:qFormat/>
     <w:uiPriority w:val="69"/>
     <w:pPr>
       <w:spacing w:after="0" w:line="240" w:lineRule="auto"/>
@@ -16188,6 +17316,7 @@
   <w:style w:type="table" w:styleId="104">
     <w:name w:val="Dark List"/>
     <w:basedOn w:val="32"/>
+    <w:qFormat/>
     <w:uiPriority w:val="70"/>
     <w:pPr>
       <w:spacing w:after="0" w:line="240" w:lineRule="auto"/>
@@ -16303,6 +17432,7 @@
   <w:style w:type="table" w:styleId="105">
     <w:name w:val="Dark List Accent 1"/>
     <w:basedOn w:val="32"/>
+    <w:qFormat/>
     <w:uiPriority w:val="70"/>
     <w:pPr>
       <w:spacing w:after="0" w:line="240" w:lineRule="auto"/>
@@ -19357,12 +20487,14 @@
     <w:name w:val="Header Char"/>
     <w:basedOn w:val="132"/>
     <w:link w:val="25"/>
+    <w:qFormat/>
     <w:uiPriority w:val="99"/>
   </w:style>
   <w:style w:type="character" w:customStyle="1" w:styleId="137">
     <w:name w:val="Footer Char"/>
     <w:basedOn w:val="132"/>
     <w:link w:val="24"/>
+    <w:qFormat/>
     <w:uiPriority w:val="99"/>
   </w:style>
   <w:style w:type="paragraph" w:styleId="138">
@@ -19383,6 +20515,7 @@
     <w:name w:val="Heading 1 Char"/>
     <w:basedOn w:val="132"/>
     <w:link w:val="3"/>
+    <w:qFormat/>
     <w:uiPriority w:val="9"/>
     <w:rPr>
       <w:rFonts w:asciiTheme="majorHAnsi" w:hAnsiTheme="majorHAnsi" w:eastAsiaTheme="majorEastAsia" w:cstheme="majorBidi"/>
@@ -19397,6 +20530,7 @@
     <w:name w:val="Heading 2 Char"/>
     <w:basedOn w:val="132"/>
     <w:link w:val="4"/>
+    <w:qFormat/>
     <w:uiPriority w:val="9"/>
     <w:rPr>
       <w:rFonts w:asciiTheme="majorHAnsi" w:hAnsiTheme="majorHAnsi" w:eastAsiaTheme="majorEastAsia" w:cstheme="majorBidi"/>
@@ -19416,6 +20550,7 @@
     <w:name w:val="Heading 3 Char"/>
     <w:basedOn w:val="132"/>
     <w:link w:val="5"/>
+    <w:qFormat/>
     <w:uiPriority w:val="9"/>
     <w:rPr>
       <w:rFonts w:asciiTheme="majorHAnsi" w:hAnsiTheme="majorHAnsi" w:eastAsiaTheme="majorEastAsia" w:cstheme="majorBidi"/>
@@ -19433,6 +20568,7 @@
     <w:name w:val="Title Char"/>
     <w:basedOn w:val="132"/>
     <w:link w:val="31"/>
+    <w:qFormat/>
     <w:uiPriority w:val="10"/>
     <w:rPr>
       <w:rFonts w:asciiTheme="majorHAnsi" w:hAnsiTheme="majorHAnsi" w:eastAsiaTheme="majorEastAsia" w:cstheme="majorBidi"/>
@@ -19447,6 +20583,7 @@
     <w:name w:val="Subtitle Char"/>
     <w:basedOn w:val="132"/>
     <w:link w:val="26"/>
+    <w:qFormat/>
     <w:uiPriority w:val="11"/>
     <w:rPr>
       <w:rFonts w:asciiTheme="majorHAnsi" w:hAnsiTheme="majorHAnsi" w:eastAsiaTheme="majorEastAsia" w:cstheme="majorBidi"/>
@@ -19484,6 +20621,7 @@
     <w:name w:val="Body Text 2 Char"/>
     <w:basedOn w:val="132"/>
     <w:link w:val="28"/>
+    <w:qFormat/>
     <w:uiPriority w:val="99"/>
   </w:style>
   <w:style w:type="character" w:customStyle="1" w:styleId="147">
@@ -19501,6 +20639,7 @@
     <w:name w:val="Macro Text Char"/>
     <w:basedOn w:val="132"/>
     <w:link w:val="2"/>
+    <w:qFormat/>
     <w:uiPriority w:val="99"/>
     <w:rPr>
       <w:rFonts w:ascii="Courier" w:hAnsi="Courier"/>
@@ -19530,6 +20669,7 @@
     <w:name w:val="Quote Char"/>
     <w:basedOn w:val="132"/>
     <w:link w:val="149"/>
+    <w:qFormat/>
     <w:uiPriority w:val="29"/>
     <w:rPr>
       <w:i/>
@@ -19547,6 +20687,7 @@
     <w:basedOn w:val="132"/>
     <w:link w:val="6"/>
     <w:semiHidden/>
+    <w:qFormat/>
     <w:uiPriority w:val="9"/>
     <w:rPr>
       <w:rFonts w:asciiTheme="majorHAnsi" w:hAnsiTheme="majorHAnsi" w:eastAsiaTheme="majorEastAsia" w:cstheme="majorBidi"/>
@@ -19567,6 +20708,7 @@
     <w:basedOn w:val="132"/>
     <w:link w:val="7"/>
     <w:semiHidden/>
+    <w:qFormat/>
     <w:uiPriority w:val="9"/>
     <w:rPr>
       <w:rFonts w:asciiTheme="majorHAnsi" w:hAnsiTheme="majorHAnsi" w:eastAsiaTheme="majorEastAsia" w:cstheme="majorBidi"/>
@@ -19578,6 +20720,7 @@
     <w:basedOn w:val="132"/>
     <w:link w:val="8"/>
     <w:semiHidden/>
+    <w:qFormat/>
     <w:uiPriority w:val="9"/>
     <w:rPr>
       <w:rFonts w:asciiTheme="majorHAnsi" w:hAnsiTheme="majorHAnsi" w:eastAsiaTheme="majorEastAsia" w:cstheme="majorBidi"/>
@@ -19613,6 +20756,7 @@
     <w:basedOn w:val="132"/>
     <w:link w:val="10"/>
     <w:semiHidden/>
+    <w:qFormat/>
     <w:uiPriority w:val="9"/>
     <w:rPr>
       <w:rFonts w:asciiTheme="majorHAnsi" w:hAnsiTheme="majorHAnsi" w:eastAsiaTheme="majorEastAsia" w:cstheme="majorBidi"/>
@@ -19631,6 +20775,7 @@
     <w:basedOn w:val="132"/>
     <w:link w:val="11"/>
     <w:semiHidden/>
+    <w:qFormat/>
     <w:uiPriority w:val="9"/>
     <w:rPr>
       <w:rFonts w:asciiTheme="majorHAnsi" w:hAnsiTheme="majorHAnsi" w:eastAsiaTheme="majorEastAsia" w:cstheme="majorBidi"/>
@@ -19680,6 +20825,7 @@
     <w:name w:val="Intense Quote Char"/>
     <w:basedOn w:val="132"/>
     <w:link w:val="157"/>
+    <w:qFormat/>
     <w:uiPriority w:val="30"/>
     <w:rPr>
       <w:b/>
@@ -19792,6 +20938,7 @@
   </w:style>
   <w:style w:type="paragraph" w:customStyle="1" w:styleId="165">
     <w:name w:val="Figure Legend"/>
+    <w:qFormat/>
     <w:uiPriority w:val="0"/>
     <w:pPr>
       <w:keepLines/>
@@ -19806,6 +20953,7 @@
   </w:style>
   <w:style w:type="paragraph" w:customStyle="1" w:styleId="166">
     <w:name w:val="Reference"/>
+    <w:qFormat/>
     <w:uiPriority w:val="0"/>
     <w:pPr>
       <w:spacing w:after="40" w:line="240" w:lineRule="auto"/>

</xml_diff>

<commit_message>
Sync website with final submission materials
</commit_message>
<xml_diff>
--- a/public/Manuscript.docx
+++ b/public/Manuscript.docx
@@ -584,7 +584,7 @@
           <w:rFonts w:hint="eastAsia"/>
           <w:highlight w:val="none"/>
         </w:rPr>
-        <w:t>n the Global Mind Project (n=147,506), emotion had the highest cross-sectional network strength.</w:t>
+        <w:t>n the Global Mind Project (n</w:t>
       </w:r>
       <w:r>
         <w:rPr>
@@ -592,6 +592,36 @@
           <w:highlight w:val="none"/>
           <w:lang w:val="en-US" w:eastAsia="zh-CN"/>
         </w:rPr>
+        <w:t xml:space="preserve"> </w:t>
+      </w:r>
+      <w:r>
+        <w:rPr>
+          <w:rFonts w:hint="eastAsia"/>
+          <w:highlight w:val="none"/>
+        </w:rPr>
+        <w:t>=</w:t>
+      </w:r>
+      <w:r>
+        <w:rPr>
+          <w:rFonts w:hint="eastAsia" w:eastAsia="宋体"/>
+          <w:highlight w:val="none"/>
+          <w:lang w:val="en-US" w:eastAsia="zh-CN"/>
+        </w:rPr>
+        <w:t xml:space="preserve"> </w:t>
+      </w:r>
+      <w:r>
+        <w:rPr>
+          <w:rFonts w:hint="eastAsia"/>
+          <w:highlight w:val="none"/>
+        </w:rPr>
+        <w:t>147,506), emotion had the highest cross-sectional network strength.</w:t>
+      </w:r>
+      <w:r>
+        <w:rPr>
+          <w:rFonts w:hint="eastAsia" w:eastAsia="宋体"/>
+          <w:highlight w:val="none"/>
+          <w:lang w:val="en-US" w:eastAsia="zh-CN"/>
+        </w:rPr>
         <w:t xml:space="preserve"> A</w:t>
       </w:r>
       <w:r>
@@ -601,6 +631,8 @@
         </w:rPr>
         <w:t>cross longitudinal cohorts, psychological difficulties occupied leading net source positions, whereas screen-related measures did not.</w:t>
       </w:r>
+      <w:bookmarkStart w:id="0" w:name="_GoBack"/>
+      <w:bookmarkEnd w:id="0"/>
     </w:p>
     <w:p>
       <w:pPr>
@@ -687,7 +719,7 @@
           <w:rFonts w:hint="eastAsia"/>
           <w:highlight w:val="none"/>
         </w:rPr>
-        <w:t>. Within this context, adolescent problematic digital use rarely occurs in isolation. Problematic internet or smartphone use is associated with emotional distress and broader behavioural difficulties</w:t>
+        <w:t>. Within this context, adolescent problematic digital use rarely occurs in isolation. Problematic internet or smartphone use is associated with emotional distress and broader behavioural problems</w:t>
       </w:r>
       <w:r>
         <w:rPr>
@@ -700,10 +732,19 @@
       </w:r>
       <w:r>
         <w:rPr>
+          <w:rFonts w:hint="eastAsia" w:eastAsia="宋体"/>
+          <w:highlight w:val="none"/>
+          <w:vertAlign w:val="baseline"/>
+          <w:lang w:val="en-US" w:eastAsia="zh-CN"/>
+        </w:rPr>
+        <w:t>.</w:t>
+      </w:r>
+      <w:r>
+        <w:rPr>
           <w:rFonts w:hint="eastAsia"/>
           <w:highlight w:val="none"/>
         </w:rPr>
-        <w:t>, while greater social-media and screen exposure has been linked particularly to depressive symptoms and sleep disturbance</w:t>
+        <w:t xml:space="preserve"> Social media use, screen time and problematic use have also been associated with depressive symptoms and sleep problems</w:t>
       </w:r>
       <w:r>
         <w:rPr>
@@ -1148,7 +1189,7 @@
           <w:rFonts w:hint="eastAsia"/>
           <w:highlight w:val="none"/>
         </w:rPr>
-        <w:t>This domain-level pattern was also evident in the individual cross-domain paths. Emotional distress predicted later change in problematic digital use (DASS→CIAS, β=0.160), insomnia (DASS→ISI, β=0.151), broad SDQ difficulties (DASS→SDQ, β=0.120) and diet (DASS→DIET, β=0.108). The similarly strong reciprocal path from insomnia to emotional distress (ISI→DASS, β=0.150) indicated reciprocal prospective prediction between these two domains, while emotional distress retained the strongest positive net directionality. Emotional distress retained the strongest net source position in sensitivity analyses restricted to Bonferroni-significant cross-domain paths, adjusted for age, sex and grade, accounting for clustering within schools, and excluding diet (Supplementary Tables S13). Across these analyses, emotional distress was the leading longitudinal predictor in SEARCH; problematic digital use showed no clear net directionality.</w:t>
+        <w:t>This domain-level pattern was also evident in the individual cross-domain paths. Emotional distress predicted later change in problematic digital use (DASS→CIAS, β=0.160), insomnia (DASS→ISI, β=0.151), broad SDQ difficulties (DASS→SDQ, β=0.120) and diet (DASS→DIET, β=0.108). The similarly strong reciprocal path from insomnia to emotional distress (ISI→DASS, β=0.150) indicated reciprocal prospective prediction between these two domains, while emotional distress retained the strongest positive net directionality. Emotional distress retained the strongest net source position in sensitivity analyses restricted to Bonferroni-significant cross-domain paths, adjusted for age, sex and grade and excluding diet (Supplementary Table S13). Across these analyses, emotional distress was the leading longitudinal predictor in SEARCH; problematic digital use showed no clear net directionality.</w:t>
       </w:r>
     </w:p>
     <w:p>
@@ -1226,7 +1267,22 @@
           <w:rFonts w:hint="eastAsia"/>
           <w:highlight w:val="none"/>
         </w:rPr>
-        <w:t>Longitudinal cross-lagged network in SEARCH(a) Standardised coefficients from each Wave 1 domain to each Wave 3 domain; diagonal entries are autoregressive effects, and asterisks indicate nominal P &lt; 0.05 without multiplicity adjustment. (b) Directed network displaying cross-lagged paths with nominal P &lt; 0.05 and |β| ≥ 0.08. This display threshold was used for visual clarity. (c) CLPN net directionality, calculated as absolute cross-lagged out-strength minus in-strength, with 95% bootstrap confidence intervals. CIAS, generalised problematic digital use; DASS, emotional distress; SDQ, broad SDQ difficulties; DIET, diet; ISI, insomnia; ACT, physical activity. N = 6,092.</w:t>
+        <w:t>Longitudinal cross-lagged network in SEARCH</w:t>
+      </w:r>
+      <w:r>
+        <w:rPr>
+          <w:rFonts w:hint="eastAsia" w:eastAsia="宋体"/>
+          <w:highlight w:val="none"/>
+          <w:lang w:val="en-US" w:eastAsia="zh-CN"/>
+        </w:rPr>
+        <w:t xml:space="preserve">. </w:t>
+      </w:r>
+      <w:r>
+        <w:rPr>
+          <w:rFonts w:hint="eastAsia"/>
+          <w:highlight w:val="none"/>
+        </w:rPr>
+        <w:t>(a) Standardised coefficients from each Wave 1 domain to each Wave 3 domain; diagonal entries are autoregressive effects, and asterisks indicate nominal P &lt; 0.05 without multiplicity adjustment. (b) Directed network displaying cross-lagged paths with nominal P &lt; 0.05 and |β| ≥ 0.08. This display threshold was used for visual clarity. (c) CLPN net directionality, calculated as absolute cross-lagged out-strength minus in-strength, with 95% bootstrap confidence intervals. CIAS, generalised problematic digital use; DASS, emotional distress; SDQ, broad SDQ difficulties; DIET, diet; ISI, insomnia; ACT, physical activity. N = 6,092.</w:t>
       </w:r>
     </w:p>
     <w:p>
@@ -1380,8 +1436,6 @@
         </w:rPr>
         <w:t xml:space="preserve"> and gaming occupying net sink positions in MCS.</w:t>
       </w:r>
-      <w:bookmarkStart w:id="0" w:name="_GoBack"/>
-      <w:bookmarkEnd w:id="0"/>
     </w:p>
     <w:p>
       <w:pPr>
@@ -1923,6 +1977,7 @@
         <w:pStyle w:val="165"/>
         <w:keepLines/>
         <w:rPr>
+          <w:rFonts w:hint="eastAsia"/>
           <w:highlight w:val="none"/>
         </w:rPr>
       </w:pPr>
@@ -1940,7 +1995,7 @@
           <w:rFonts w:hint="eastAsia"/>
           <w:highlight w:val="none"/>
         </w:rPr>
-        <w:t xml:space="preserve"> | Exploratory Bayesian net out-degree and CLPN net directionality in SEARCH. (a) Exploratory Bayesian directed acyclic graph learned from tertile-discretised baseline domain scores; edge width denotes bootstrap stability. (b) Bootstrap frequencies of the eight most stable directed edges. (c) Association between Bayesian net out-degree and longitudinal cross-lagged panel network net directionality across the six SEARCH domains. CIAS, generalised problematic digital use; DASS, emotional distress; SDQ, broad difficulties; DIET, diet; ISI, insomnia; ACT, physical activity; DAG, directed acyclic graph; CLPN, cross-lagged panel network. N = 10,356 for the baseline DAG; n = 6,092 for the longitudinal CLPN; panel c contains six paired domain-level estimates.</w:t>
+        <w:t xml:space="preserve"> | Exploratory Bayesian net out-degree and CLPN net directionality in SEARCH. (a) Exploratory Bayesian directed acyclic graph learned from tertile-discretised baseline domain scores; edge width denotes bootstrap stability. (b) Bootstrap frequencies of the eight most stable directed edges. (c) Association between Bayesian net out-degree and longitudinal cross-lagged panel network net directionality across the six SEARCH domains. CIAS, generalised problematic digital use; DASS, emotional distress; SDQ, broad difficulties; DIET, diet; ISI, insomnia; ACT, physical activity; DAG, directed acyclic graph; CLPN, cross-lagged panel network. N = 6,092 for both the baseline DAG and the longitudinal CLPN; panel c contains six paired domain-level estimates.</w:t>
       </w:r>
     </w:p>
     <w:p>
@@ -2906,14 +2961,30 @@
     <w:p>
       <w:pPr>
         <w:rPr>
-          <w:highlight w:val="none"/>
-        </w:rPr>
-      </w:pPr>
-      <w:r>
-        <w:rPr>
-          <w:highlight w:val="none"/>
-        </w:rPr>
-        <w:t xml:space="preserve">Sensitivity analyses recalculated directionality using only Bonferroni-significant paths, adjusted the regressions for age, sex and grade, used school-cluster-robust inference, and fitted a five-domain model excluding diet. </w:t>
+          <w:rFonts w:hint="eastAsia" w:eastAsia="宋体"/>
+          <w:highlight w:val="none"/>
+          <w:lang w:val="en-US" w:eastAsia="zh-CN"/>
+        </w:rPr>
+      </w:pPr>
+      <w:r>
+        <w:rPr>
+          <w:highlight w:val="none"/>
+        </w:rPr>
+        <w:t>Sensitivity analyses recalculated directionality using only Bonferroni-significant paths, adjusted the regressions for age, sex and grade</w:t>
+      </w:r>
+      <w:r>
+        <w:rPr>
+          <w:rFonts w:hint="eastAsia" w:eastAsia="宋体"/>
+          <w:highlight w:val="none"/>
+          <w:lang w:val="en-US" w:eastAsia="zh-CN"/>
+        </w:rPr>
+        <w:t xml:space="preserve"> </w:t>
+      </w:r>
+      <w:r>
+        <w:rPr>
+          <w:highlight w:val="none"/>
+        </w:rPr>
+        <w:t xml:space="preserve">and fitted a five-domain model excluding diet. </w:t>
       </w:r>
       <w:r>
         <w:rPr>
@@ -2921,6 +2992,14 @@
           <w:highlight w:val="none"/>
         </w:rPr>
         <w:t>These analyses tested the robustness of the net source–sink ranking and directionality sign under alternative specifications.</w:t>
+      </w:r>
+      <w:r>
+        <w:rPr>
+          <w:rFonts w:hint="eastAsia" w:eastAsia="宋体"/>
+          <w:highlight w:val="none"/>
+          <w:lang w:val="en-US" w:eastAsia="zh-CN"/>
+        </w:rPr>
+        <w:t xml:space="preserve"> </w:t>
       </w:r>
     </w:p>
     <w:p>
@@ -3362,7 +3441,20 @@
         <w:rPr>
           <w:highlight w:val="none"/>
         </w:rPr>
-        <w:t>Spearman correlations and principal-component analysis assessed overlap among node metrics. Node-knockout analyses and sustained nonlinear propagation simulations were retained as supplementary robustness analyses. The propagation model applied a hyperbolic-tangent activation with gain g = 0.9 to the row-normalised absolute adjacency matrix under sustained module input.</w:t>
+        <w:t xml:space="preserve">Spearman correlations and principal-component analysis assessed overlap among node metrics. Node-knockout analyses and sustained nonlinear propagation simulations were retained as supplementary robustness analyses. The propagation model applied a hyperbolic-tangent activation with gain g = 0.9 to the </w:t>
+      </w:r>
+      <w:r>
+        <w:rPr>
+          <w:rFonts w:hint="eastAsia"/>
+          <w:highlight w:val="none"/>
+        </w:rPr>
+        <w:t>spectrally normalised absolute adjacency matrix</w:t>
+      </w:r>
+      <w:r>
+        <w:rPr>
+          <w:highlight w:val="none"/>
+        </w:rPr>
+        <w:t xml:space="preserve"> under sustained module input.</w:t>
       </w:r>
       <w:r>
         <w:rPr>
@@ -3408,21 +3500,38 @@
     <w:p>
       <w:pPr>
         <w:rPr>
-          <w:highlight w:val="none"/>
-        </w:rPr>
-      </w:pPr>
-      <w:r>
-        <w:rPr>
-          <w:highlight w:val="none"/>
-        </w:rPr>
-        <w:t xml:space="preserve">The six baseline SEARCH domain scores were discretised into tertiles and a directed acyclic graph was learned by hill-climb search with the Bayesian information criterion in pgmpy. Directed-edge stability was estimated across 200 bootstrap resamples. We also examined the completed partially directed acyclic graph, quartile discretisation, a continuous Gaussian Bayesian network and leave-one-domain-out correlations. </w:t>
-      </w:r>
+          <w:rFonts w:hint="eastAsia" w:eastAsia="宋体"/>
+          <w:highlight w:val="none"/>
+          <w:lang w:val="en-US" w:eastAsia="zh-CN"/>
+        </w:rPr>
+      </w:pPr>
       <w:r>
         <w:rPr>
           <w:rFonts w:hint="eastAsia"/>
           <w:highlight w:val="none"/>
         </w:rPr>
+        <w:t>The six baseline domain scores of the 6,092 longitudinally matched SEARCH participants</w:t>
+      </w:r>
+      <w:r>
+        <w:rPr>
+          <w:highlight w:val="none"/>
+        </w:rPr>
+        <w:t xml:space="preserve"> were discretised into tertiles and a directed acyclic graph was learned by hill-climb search with the Bayesian information criterion in pgmpy. Directed-edge stability was estimated across 200 bootstrap resamples. We also examined the completed partially directed acyclic graph, a continuous Gaussian Bayesian network and leave-one-domain-out correlations. </w:t>
+      </w:r>
+      <w:r>
+        <w:rPr>
+          <w:rFonts w:hint="eastAsia"/>
+          <w:highlight w:val="none"/>
+        </w:rPr>
         <w:t>Because observational Bayesian graphs identify an equivalence class and may be affected by unmeasured confounding, this analysis was interpreted as an exploratory comparison with CLPN ordering rather than causal identification.</w:t>
+      </w:r>
+      <w:r>
+        <w:rPr>
+          <w:rFonts w:hint="eastAsia" w:eastAsia="宋体"/>
+          <w:highlight w:val="none"/>
+          <w:lang w:val="en-US" w:eastAsia="zh-CN"/>
+        </w:rPr>
+        <w:t xml:space="preserve"> Agreement between Bayesian net out-degree and CLPN net directionality was assessed across six paired domain-level estimates using Pearson and Spearman correlations. The exact two-sided permutation test enumerated all 720 permutations and compared absolute Pearson correlations. The percentile 95% confidence interval for Pearson r was calculated from 5,000 attempted paired bootstrap resamples, excluding resamples with undefined correlations.</w:t>
       </w:r>
     </w:p>
     <w:p>
@@ -3539,7 +3648,7 @@
           <w:rFonts w:hint="eastAsia"/>
           <w:highlight w:val="none"/>
         </w:rPr>
-        <w:t xml:space="preserve"> bootstrap resamples.  </w:t>
+        <w:t xml:space="preserve"> bootstrap resamples. </w:t>
       </w:r>
     </w:p>
     <w:p>
@@ -3581,7 +3690,20 @@
         <w:rPr>
           <w:highlight w:val="none"/>
         </w:rPr>
-        <w:t xml:space="preserve">All available eligible records were analysed and no a priori sample-size calculation was performed. No missing-data imputation was used. The SEARCH cross-lagged model included 6,092 linked complete cases, the MCS model included 7,838 complete cases, the secondary baseline SEARCH network included 10,356 participants, and the Global Mind Project analysis included 147,506 complete cases. All tests were two-sided. Bootstrap counts were 1,000 for SEARCH directionality, 500 for MCS directionality, 300 for Global Mind Project strength, 200 for Bayesian edge stability and 500 for degree-preserving network nulls. </w:t>
+        <w:t xml:space="preserve">All available eligible records were analysed and no a priori sample-size calculation was performed. No missing-data imputation was used. The SEARCH cross-lagged model included 6,092 linked complete cases, the MCS model included 7,838 complete cases, the secondary baseline SEARCH network included 10,356 participants, and the Global Mind Project analysis included 147,506 complete cases. </w:t>
+      </w:r>
+      <w:r>
+        <w:rPr>
+          <w:rFonts w:hint="eastAsia"/>
+          <w:highlight w:val="none"/>
+        </w:rPr>
+        <w:t>All tests were two-sided. Bootstrap counts were 1,000 for SEARCH directionality, 500 for MCS directionality, 300 for Global Mind Project strength and 200 for Bayesian edge stability. We also generated 500 degree-preserving null networks.</w:t>
+      </w:r>
+      <w:r>
+        <w:rPr>
+          <w:highlight w:val="none"/>
+        </w:rPr>
+        <w:t xml:space="preserve"> </w:t>
       </w:r>
     </w:p>
     <w:p>
@@ -3658,14 +3780,68 @@
     <w:p>
       <w:pPr>
         <w:rPr>
-          <w:highlight w:val="none"/>
-        </w:rPr>
-      </w:pPr>
-      <w:r>
-        <w:rPr>
-          <w:highlight w:val="none"/>
-        </w:rPr>
-        <w:t>Analysis scripts for SEARCH network reconstruction, cross-lagged panel networks, structural-control analyses, Bayesian graphs, community detection, null models and figure generation are supplied in the accompanying main code archive. External Global Mind Project and Millennium Cohort Study scripts are supplied in a separate external-validation code archive.</w:t>
+          <w:rFonts w:hint="eastAsia" w:eastAsia="宋体"/>
+          <w:highlight w:val="none"/>
+          <w:lang w:val="en-US" w:eastAsia="zh-CN"/>
+        </w:rPr>
+      </w:pPr>
+      <w:r>
+        <w:rPr>
+          <w:rFonts w:hint="eastAsia"/>
+          <w:highlight w:val="none"/>
+        </w:rPr>
+        <w:t xml:space="preserve">The analysis code used in this study is available through the project website: </w:t>
+      </w:r>
+      <w:r>
+        <w:rPr>
+          <w:rFonts w:hint="eastAsia"/>
+          <w:highlight w:val="none"/>
+        </w:rPr>
+        <w:fldChar w:fldCharType="begin"/>
+      </w:r>
+      <w:r>
+        <w:rPr>
+          <w:rFonts w:hint="eastAsia"/>
+          <w:highlight w:val="none"/>
+        </w:rPr>
+        <w:instrText xml:space="preserve"> HYPERLINK "https://zling77.github.io/digital-use-symptom-networks/." </w:instrText>
+      </w:r>
+      <w:r>
+        <w:rPr>
+          <w:rFonts w:hint="eastAsia"/>
+          <w:highlight w:val="none"/>
+        </w:rPr>
+        <w:fldChar w:fldCharType="separate"/>
+      </w:r>
+      <w:r>
+        <w:rPr>
+          <w:rFonts w:hint="eastAsia"/>
+          <w:highlight w:val="none"/>
+        </w:rPr>
+        <w:t>https://zling77.github.io/digital-use-symptom-networks/</w:t>
+      </w:r>
+      <w:r>
+        <w:rPr>
+          <w:rFonts w:hint="eastAsia"/>
+          <w:highlight w:val="none"/>
+        </w:rPr>
+        <w:fldChar w:fldCharType="end"/>
+      </w:r>
+      <w:r>
+        <w:rPr>
+          <w:rFonts w:hint="eastAsia"/>
+          <w:highlight w:val="none"/>
+          <w:lang w:val="en-US" w:eastAsia="zh-CN"/>
+        </w:rPr>
+        <w:t xml:space="preserve"> </w:t>
+      </w:r>
+      <w:r>
+        <w:rPr>
+          <w:rFonts w:hint="eastAsia" w:eastAsia="宋体"/>
+          <w:highlight w:val="none"/>
+          <w:lang w:val="en-US" w:eastAsia="zh-CN"/>
+        </w:rPr>
+        <w:t>The main code archive contains scripts for SEARCH network reconstruction, cross-lagged panel networks, structural-control analyses, Bayesian graphs, community detection, null models and figure generation. A separate archive contains the Global Mind Project and Millennium Cohort Study analysis scripts.</w:t>
       </w:r>
     </w:p>
     <w:p>
@@ -8204,7 +8380,7 @@
     <w:lsdException w:uiPriority="99" w:name="Body Text Indent 2"/>
     <w:lsdException w:uiPriority="99" w:name="Body Text Indent 3"/>
     <w:lsdException w:uiPriority="99" w:name="Block Text"/>
-    <w:lsdException w:uiPriority="99" w:name="Hyperlink"/>
+    <w:lsdException w:qFormat="1" w:uiPriority="99" w:name="Hyperlink"/>
     <w:lsdException w:uiPriority="99" w:name="FollowedHyperlink"/>
     <w:lsdException w:qFormat="1" w:unhideWhenUsed="0" w:uiPriority="22" w:semiHidden="0" w:name="Strong"/>
     <w:lsdException w:qFormat="1" w:unhideWhenUsed="0" w:uiPriority="20" w:semiHidden="0" w:name="Emphasis"/>
@@ -8281,9 +8457,9 @@
     <w:lsdException w:qFormat="1" w:unhideWhenUsed="0" w:uiPriority="68" w:semiHidden="0" w:name="Medium Grid 2"/>
     <w:lsdException w:qFormat="1" w:unhideWhenUsed="0" w:uiPriority="69" w:semiHidden="0" w:name="Medium Grid 3"/>
     <w:lsdException w:qFormat="1" w:unhideWhenUsed="0" w:uiPriority="70" w:semiHidden="0" w:name="Dark List"/>
-    <w:lsdException w:unhideWhenUsed="0" w:uiPriority="71" w:semiHidden="0" w:name="Colorful Shading"/>
-    <w:lsdException w:unhideWhenUsed="0" w:uiPriority="72" w:semiHidden="0" w:name="Colorful List"/>
-    <w:lsdException w:unhideWhenUsed="0" w:uiPriority="73" w:semiHidden="0" w:name="Colorful Grid"/>
+    <w:lsdException w:qFormat="1" w:unhideWhenUsed="0" w:uiPriority="71" w:semiHidden="0" w:name="Colorful Shading"/>
+    <w:lsdException w:qFormat="1" w:unhideWhenUsed="0" w:uiPriority="72" w:semiHidden="0" w:name="Colorful List"/>
+    <w:lsdException w:qFormat="1" w:unhideWhenUsed="0" w:uiPriority="73" w:semiHidden="0" w:name="Colorful Grid"/>
     <w:lsdException w:qFormat="1" w:unhideWhenUsed="0" w:uiPriority="60" w:semiHidden="0" w:name="Light Shading Accent 1"/>
     <w:lsdException w:qFormat="1" w:unhideWhenUsed="0" w:uiPriority="61" w:semiHidden="0" w:name="Light List Accent 1"/>
     <w:lsdException w:qFormat="1" w:unhideWhenUsed="0" w:uiPriority="62" w:semiHidden="0" w:name="Light Grid Accent 1"/>
@@ -8298,9 +8474,9 @@
     <w:lsdException w:qFormat="1" w:unhideWhenUsed="0" w:uiPriority="68" w:semiHidden="0" w:name="Medium Grid 2 Accent 1"/>
     <w:lsdException w:qFormat="1" w:unhideWhenUsed="0" w:uiPriority="69" w:semiHidden="0" w:name="Medium Grid 3 Accent 1"/>
     <w:lsdException w:qFormat="1" w:unhideWhenUsed="0" w:uiPriority="70" w:semiHidden="0" w:name="Dark List Accent 1"/>
-    <w:lsdException w:unhideWhenUsed="0" w:uiPriority="71" w:semiHidden="0" w:name="Colorful Shading Accent 1"/>
-    <w:lsdException w:unhideWhenUsed="0" w:uiPriority="72" w:semiHidden="0" w:name="Colorful List Accent 1"/>
-    <w:lsdException w:unhideWhenUsed="0" w:uiPriority="73" w:semiHidden="0" w:name="Colorful Grid Accent 1"/>
+    <w:lsdException w:qFormat="1" w:unhideWhenUsed="0" w:uiPriority="71" w:semiHidden="0" w:name="Colorful Shading Accent 1"/>
+    <w:lsdException w:qFormat="1" w:unhideWhenUsed="0" w:uiPriority="72" w:semiHidden="0" w:name="Colorful List Accent 1"/>
+    <w:lsdException w:qFormat="1" w:unhideWhenUsed="0" w:uiPriority="73" w:semiHidden="0" w:name="Colorful Grid Accent 1"/>
     <w:lsdException w:qFormat="1" w:unhideWhenUsed="0" w:uiPriority="60" w:semiHidden="0" w:name="Light Shading Accent 2"/>
     <w:lsdException w:qFormat="1" w:unhideWhenUsed="0" w:uiPriority="61" w:semiHidden="0" w:name="Light List Accent 2"/>
     <w:lsdException w:qFormat="1" w:unhideWhenUsed="0" w:uiPriority="62" w:semiHidden="0" w:name="Light Grid Accent 2"/>
@@ -8311,10 +8487,10 @@
     <w:lsdException w:qFormat="1" w:unhideWhenUsed="0" w:uiPriority="67" w:semiHidden="0" w:name="Medium Grid 1 Accent 2"/>
     <w:lsdException w:qFormat="1" w:unhideWhenUsed="0" w:uiPriority="68" w:semiHidden="0" w:name="Medium Grid 2 Accent 2"/>
     <w:lsdException w:qFormat="1" w:unhideWhenUsed="0" w:uiPriority="69" w:semiHidden="0" w:name="Medium Grid 3 Accent 2"/>
-    <w:lsdException w:unhideWhenUsed="0" w:uiPriority="70" w:semiHidden="0" w:name="Dark List Accent 2"/>
-    <w:lsdException w:unhideWhenUsed="0" w:uiPriority="71" w:semiHidden="0" w:name="Colorful Shading Accent 2"/>
-    <w:lsdException w:unhideWhenUsed="0" w:uiPriority="72" w:semiHidden="0" w:name="Colorful List Accent 2"/>
-    <w:lsdException w:unhideWhenUsed="0" w:uiPriority="73" w:semiHidden="0" w:name="Colorful Grid Accent 2"/>
+    <w:lsdException w:qFormat="1" w:unhideWhenUsed="0" w:uiPriority="70" w:semiHidden="0" w:name="Dark List Accent 2"/>
+    <w:lsdException w:qFormat="1" w:unhideWhenUsed="0" w:uiPriority="71" w:semiHidden="0" w:name="Colorful Shading Accent 2"/>
+    <w:lsdException w:qFormat="1" w:unhideWhenUsed="0" w:uiPriority="72" w:semiHidden="0" w:name="Colorful List Accent 2"/>
+    <w:lsdException w:qFormat="1" w:unhideWhenUsed="0" w:uiPriority="73" w:semiHidden="0" w:name="Colorful Grid Accent 2"/>
     <w:lsdException w:qFormat="1" w:unhideWhenUsed="0" w:uiPriority="60" w:semiHidden="0" w:name="Light Shading Accent 3"/>
     <w:lsdException w:qFormat="1" w:unhideWhenUsed="0" w:uiPriority="61" w:semiHidden="0" w:name="Light List Accent 3"/>
     <w:lsdException w:qFormat="1" w:unhideWhenUsed="0" w:uiPriority="62" w:semiHidden="0" w:name="Light Grid Accent 3"/>
@@ -8325,10 +8501,10 @@
     <w:lsdException w:qFormat="1" w:unhideWhenUsed="0" w:uiPriority="67" w:semiHidden="0" w:name="Medium Grid 1 Accent 3"/>
     <w:lsdException w:qFormat="1" w:unhideWhenUsed="0" w:uiPriority="68" w:semiHidden="0" w:name="Medium Grid 2 Accent 3"/>
     <w:lsdException w:qFormat="1" w:unhideWhenUsed="0" w:uiPriority="69" w:semiHidden="0" w:name="Medium Grid 3 Accent 3"/>
-    <w:lsdException w:unhideWhenUsed="0" w:uiPriority="70" w:semiHidden="0" w:name="Dark List Accent 3"/>
-    <w:lsdException w:unhideWhenUsed="0" w:uiPriority="71" w:semiHidden="0" w:name="Colorful Shading Accent 3"/>
-    <w:lsdException w:unhideWhenUsed="0" w:uiPriority="72" w:semiHidden="0" w:name="Colorful List Accent 3"/>
-    <w:lsdException w:unhideWhenUsed="0" w:uiPriority="73" w:semiHidden="0" w:name="Colorful Grid Accent 3"/>
+    <w:lsdException w:qFormat="1" w:unhideWhenUsed="0" w:uiPriority="70" w:semiHidden="0" w:name="Dark List Accent 3"/>
+    <w:lsdException w:qFormat="1" w:unhideWhenUsed="0" w:uiPriority="71" w:semiHidden="0" w:name="Colorful Shading Accent 3"/>
+    <w:lsdException w:qFormat="1" w:unhideWhenUsed="0" w:uiPriority="72" w:semiHidden="0" w:name="Colorful List Accent 3"/>
+    <w:lsdException w:qFormat="1" w:unhideWhenUsed="0" w:uiPriority="73" w:semiHidden="0" w:name="Colorful Grid Accent 3"/>
     <w:lsdException w:qFormat="1" w:unhideWhenUsed="0" w:uiPriority="60" w:semiHidden="0" w:name="Light Shading Accent 4"/>
     <w:lsdException w:qFormat="1" w:unhideWhenUsed="0" w:uiPriority="61" w:semiHidden="0" w:name="Light List Accent 4"/>
     <w:lsdException w:qFormat="1" w:unhideWhenUsed="0" w:uiPriority="62" w:semiHidden="0" w:name="Light Grid Accent 4"/>
@@ -8339,10 +8515,10 @@
     <w:lsdException w:qFormat="1" w:unhideWhenUsed="0" w:uiPriority="67" w:semiHidden="0" w:name="Medium Grid 1 Accent 4"/>
     <w:lsdException w:qFormat="1" w:unhideWhenUsed="0" w:uiPriority="68" w:semiHidden="0" w:name="Medium Grid 2 Accent 4"/>
     <w:lsdException w:qFormat="1" w:unhideWhenUsed="0" w:uiPriority="69" w:semiHidden="0" w:name="Medium Grid 3 Accent 4"/>
-    <w:lsdException w:unhideWhenUsed="0" w:uiPriority="70" w:semiHidden="0" w:name="Dark List Accent 4"/>
-    <w:lsdException w:unhideWhenUsed="0" w:uiPriority="71" w:semiHidden="0" w:name="Colorful Shading Accent 4"/>
-    <w:lsdException w:unhideWhenUsed="0" w:uiPriority="72" w:semiHidden="0" w:name="Colorful List Accent 4"/>
-    <w:lsdException w:unhideWhenUsed="0" w:uiPriority="73" w:semiHidden="0" w:name="Colorful Grid Accent 4"/>
+    <w:lsdException w:qFormat="1" w:unhideWhenUsed="0" w:uiPriority="70" w:semiHidden="0" w:name="Dark List Accent 4"/>
+    <w:lsdException w:qFormat="1" w:unhideWhenUsed="0" w:uiPriority="71" w:semiHidden="0" w:name="Colorful Shading Accent 4"/>
+    <w:lsdException w:qFormat="1" w:unhideWhenUsed="0" w:uiPriority="72" w:semiHidden="0" w:name="Colorful List Accent 4"/>
+    <w:lsdException w:qFormat="1" w:unhideWhenUsed="0" w:uiPriority="73" w:semiHidden="0" w:name="Colorful Grid Accent 4"/>
     <w:lsdException w:qFormat="1" w:unhideWhenUsed="0" w:uiPriority="60" w:semiHidden="0" w:name="Light Shading Accent 5"/>
     <w:lsdException w:qFormat="1" w:unhideWhenUsed="0" w:uiPriority="61" w:semiHidden="0" w:name="Light List Accent 5"/>
     <w:lsdException w:qFormat="1" w:unhideWhenUsed="0" w:uiPriority="62" w:semiHidden="0" w:name="Light Grid Accent 5"/>
@@ -8353,10 +8529,10 @@
     <w:lsdException w:qFormat="1" w:unhideWhenUsed="0" w:uiPriority="67" w:semiHidden="0" w:name="Medium Grid 1 Accent 5"/>
     <w:lsdException w:qFormat="1" w:unhideWhenUsed="0" w:uiPriority="68" w:semiHidden="0" w:name="Medium Grid 2 Accent 5"/>
     <w:lsdException w:qFormat="1" w:unhideWhenUsed="0" w:uiPriority="69" w:semiHidden="0" w:name="Medium Grid 3 Accent 5"/>
-    <w:lsdException w:unhideWhenUsed="0" w:uiPriority="70" w:semiHidden="0" w:name="Dark List Accent 5"/>
-    <w:lsdException w:unhideWhenUsed="0" w:uiPriority="71" w:semiHidden="0" w:name="Colorful Shading Accent 5"/>
-    <w:lsdException w:unhideWhenUsed="0" w:uiPriority="72" w:semiHidden="0" w:name="Colorful List Accent 5"/>
-    <w:lsdException w:unhideWhenUsed="0" w:uiPriority="73" w:semiHidden="0" w:name="Colorful Grid Accent 5"/>
+    <w:lsdException w:qFormat="1" w:unhideWhenUsed="0" w:uiPriority="70" w:semiHidden="0" w:name="Dark List Accent 5"/>
+    <w:lsdException w:qFormat="1" w:unhideWhenUsed="0" w:uiPriority="71" w:semiHidden="0" w:name="Colorful Shading Accent 5"/>
+    <w:lsdException w:qFormat="1" w:unhideWhenUsed="0" w:uiPriority="72" w:semiHidden="0" w:name="Colorful List Accent 5"/>
+    <w:lsdException w:qFormat="1" w:unhideWhenUsed="0" w:uiPriority="73" w:semiHidden="0" w:name="Colorful Grid Accent 5"/>
     <w:lsdException w:qFormat="1" w:unhideWhenUsed="0" w:uiPriority="60" w:semiHidden="0" w:name="Light Shading Accent 6"/>
     <w:lsdException w:qFormat="1" w:unhideWhenUsed="0" w:uiPriority="61" w:semiHidden="0" w:name="Light List Accent 6"/>
     <w:lsdException w:qFormat="1" w:unhideWhenUsed="0" w:uiPriority="62" w:semiHidden="0" w:name="Light Grid Accent 6"/>
@@ -8367,10 +8543,10 @@
     <w:lsdException w:qFormat="1" w:unhideWhenUsed="0" w:uiPriority="67" w:semiHidden="0" w:name="Medium Grid 1 Accent 6"/>
     <w:lsdException w:qFormat="1" w:unhideWhenUsed="0" w:uiPriority="68" w:semiHidden="0" w:name="Medium Grid 2 Accent 6"/>
     <w:lsdException w:qFormat="1" w:unhideWhenUsed="0" w:uiPriority="69" w:semiHidden="0" w:name="Medium Grid 3 Accent 6"/>
-    <w:lsdException w:unhideWhenUsed="0" w:uiPriority="70" w:semiHidden="0" w:name="Dark List Accent 6"/>
-    <w:lsdException w:unhideWhenUsed="0" w:uiPriority="71" w:semiHidden="0" w:name="Colorful Shading Accent 6"/>
-    <w:lsdException w:unhideWhenUsed="0" w:uiPriority="72" w:semiHidden="0" w:name="Colorful List Accent 6"/>
-    <w:lsdException w:unhideWhenUsed="0" w:uiPriority="73" w:semiHidden="0" w:name="Colorful Grid Accent 6"/>
+    <w:lsdException w:qFormat="1" w:unhideWhenUsed="0" w:uiPriority="70" w:semiHidden="0" w:name="Dark List Accent 6"/>
+    <w:lsdException w:qFormat="1" w:unhideWhenUsed="0" w:uiPriority="71" w:semiHidden="0" w:name="Colorful Shading Accent 6"/>
+    <w:lsdException w:qFormat="1" w:unhideWhenUsed="0" w:uiPriority="72" w:semiHidden="0" w:name="Colorful List Accent 6"/>
+    <w:lsdException w:qFormat="1" w:unhideWhenUsed="0" w:uiPriority="73" w:semiHidden="0" w:name="Colorful Grid Accent 6"/>
   </w:latentStyles>
   <w:style w:type="paragraph" w:default="1" w:styleId="1">
     <w:name w:val="Normal"/>
@@ -17548,6 +17724,7 @@
   <w:style w:type="table" w:styleId="106">
     <w:name w:val="Dark List Accent 2"/>
     <w:basedOn w:val="32"/>
+    <w:qFormat/>
     <w:uiPriority w:val="70"/>
     <w:pPr>
       <w:spacing w:after="0" w:line="240" w:lineRule="auto"/>
@@ -17663,6 +17840,7 @@
   <w:style w:type="table" w:styleId="107">
     <w:name w:val="Dark List Accent 3"/>
     <w:basedOn w:val="32"/>
+    <w:qFormat/>
     <w:uiPriority w:val="70"/>
     <w:pPr>
       <w:spacing w:after="0" w:line="240" w:lineRule="auto"/>
@@ -17778,6 +17956,7 @@
   <w:style w:type="table" w:styleId="108">
     <w:name w:val="Dark List Accent 4"/>
     <w:basedOn w:val="32"/>
+    <w:qFormat/>
     <w:uiPriority w:val="70"/>
     <w:pPr>
       <w:spacing w:after="0" w:line="240" w:lineRule="auto"/>
@@ -17893,6 +18072,7 @@
   <w:style w:type="table" w:styleId="109">
     <w:name w:val="Dark List Accent 5"/>
     <w:basedOn w:val="32"/>
+    <w:qFormat/>
     <w:uiPriority w:val="70"/>
     <w:pPr>
       <w:spacing w:after="0" w:line="240" w:lineRule="auto"/>
@@ -18008,6 +18188,7 @@
   <w:style w:type="table" w:styleId="110">
     <w:name w:val="Dark List Accent 6"/>
     <w:basedOn w:val="32"/>
+    <w:qFormat/>
     <w:uiPriority w:val="70"/>
     <w:pPr>
       <w:spacing w:after="0" w:line="240" w:lineRule="auto"/>
@@ -18123,6 +18304,7 @@
   <w:style w:type="table" w:styleId="111">
     <w:name w:val="Colorful Shading"/>
     <w:basedOn w:val="32"/>
+    <w:qFormat/>
     <w:uiPriority w:val="71"/>
     <w:pPr>
       <w:spacing w:after="0" w:line="240" w:lineRule="auto"/>
@@ -18271,6 +18453,7 @@
   <w:style w:type="table" w:styleId="112">
     <w:name w:val="Colorful Shading Accent 1"/>
     <w:basedOn w:val="32"/>
+    <w:qFormat/>
     <w:uiPriority w:val="71"/>
     <w:pPr>
       <w:spacing w:after="0" w:line="240" w:lineRule="auto"/>
@@ -18419,6 +18602,7 @@
   <w:style w:type="table" w:styleId="113">
     <w:name w:val="Colorful Shading Accent 2"/>
     <w:basedOn w:val="32"/>
+    <w:qFormat/>
     <w:uiPriority w:val="71"/>
     <w:pPr>
       <w:spacing w:after="0" w:line="240" w:lineRule="auto"/>
@@ -18567,6 +18751,7 @@
   <w:style w:type="table" w:styleId="114">
     <w:name w:val="Colorful Shading Accent 3"/>
     <w:basedOn w:val="32"/>
+    <w:qFormat/>
     <w:uiPriority w:val="71"/>
     <w:pPr>
       <w:spacing w:after="0" w:line="240" w:lineRule="auto"/>
@@ -18695,6 +18880,7 @@
   <w:style w:type="table" w:styleId="115">
     <w:name w:val="Colorful Shading Accent 4"/>
     <w:basedOn w:val="32"/>
+    <w:qFormat/>
     <w:uiPriority w:val="71"/>
     <w:pPr>
       <w:spacing w:after="0" w:line="240" w:lineRule="auto"/>
@@ -18843,6 +19029,7 @@
   <w:style w:type="table" w:styleId="116">
     <w:name w:val="Colorful Shading Accent 5"/>
     <w:basedOn w:val="32"/>
+    <w:qFormat/>
     <w:uiPriority w:val="71"/>
     <w:pPr>
       <w:spacing w:after="0" w:line="240" w:lineRule="auto"/>
@@ -18991,6 +19178,7 @@
   <w:style w:type="table" w:styleId="117">
     <w:name w:val="Colorful Shading Accent 6"/>
     <w:basedOn w:val="32"/>
+    <w:qFormat/>
     <w:uiPriority w:val="71"/>
     <w:pPr>
       <w:spacing w:after="0" w:line="240" w:lineRule="auto"/>
@@ -19139,6 +19327,7 @@
   <w:style w:type="table" w:styleId="118">
     <w:name w:val="Colorful List"/>
     <w:basedOn w:val="32"/>
+    <w:qFormat/>
     <w:uiPriority w:val="72"/>
     <w:pPr>
       <w:spacing w:after="0" w:line="240" w:lineRule="auto"/>
@@ -19231,6 +19420,7 @@
   <w:style w:type="table" w:styleId="119">
     <w:name w:val="Colorful List Accent 1"/>
     <w:basedOn w:val="32"/>
+    <w:qFormat/>
     <w:uiPriority w:val="72"/>
     <w:pPr>
       <w:spacing w:after="0" w:line="240" w:lineRule="auto"/>
@@ -19323,6 +19513,7 @@
   <w:style w:type="table" w:styleId="120">
     <w:name w:val="Colorful List Accent 2"/>
     <w:basedOn w:val="32"/>
+    <w:qFormat/>
     <w:uiPriority w:val="72"/>
     <w:pPr>
       <w:spacing w:after="0" w:line="240" w:lineRule="auto"/>
@@ -19415,6 +19606,7 @@
   <w:style w:type="table" w:styleId="121">
     <w:name w:val="Colorful List Accent 3"/>
     <w:basedOn w:val="32"/>
+    <w:qFormat/>
     <w:uiPriority w:val="72"/>
     <w:pPr>
       <w:spacing w:after="0" w:line="240" w:lineRule="auto"/>
@@ -19507,6 +19699,7 @@
   <w:style w:type="table" w:styleId="122">
     <w:name w:val="Colorful List Accent 4"/>
     <w:basedOn w:val="32"/>
+    <w:qFormat/>
     <w:uiPriority w:val="72"/>
     <w:pPr>
       <w:spacing w:after="0" w:line="240" w:lineRule="auto"/>
@@ -19599,6 +19792,7 @@
   <w:style w:type="table" w:styleId="123">
     <w:name w:val="Colorful List Accent 5"/>
     <w:basedOn w:val="32"/>
+    <w:qFormat/>
     <w:uiPriority w:val="72"/>
     <w:pPr>
       <w:spacing w:after="0" w:line="240" w:lineRule="auto"/>
@@ -19691,6 +19885,7 @@
   <w:style w:type="table" w:styleId="124">
     <w:name w:val="Colorful List Accent 6"/>
     <w:basedOn w:val="32"/>
+    <w:qFormat/>
     <w:uiPriority w:val="72"/>
     <w:pPr>
       <w:spacing w:after="0" w:line="240" w:lineRule="auto"/>
@@ -19783,6 +19978,7 @@
   <w:style w:type="table" w:styleId="125">
     <w:name w:val="Colorful Grid"/>
     <w:basedOn w:val="32"/>
+    <w:qFormat/>
     <w:uiPriority w:val="73"/>
     <w:pPr>
       <w:spacing w:after="0" w:line="240" w:lineRule="auto"/>
@@ -19879,6 +20075,7 @@
   <w:style w:type="table" w:styleId="126">
     <w:name w:val="Colorful Grid Accent 1"/>
     <w:basedOn w:val="32"/>
+    <w:qFormat/>
     <w:uiPriority w:val="73"/>
     <w:pPr>
       <w:spacing w:after="0" w:line="240" w:lineRule="auto"/>
@@ -19975,6 +20172,7 @@
   <w:style w:type="table" w:styleId="127">
     <w:name w:val="Colorful Grid Accent 2"/>
     <w:basedOn w:val="32"/>
+    <w:qFormat/>
     <w:uiPriority w:val="73"/>
     <w:pPr>
       <w:spacing w:after="0" w:line="240" w:lineRule="auto"/>
@@ -20071,6 +20269,7 @@
   <w:style w:type="table" w:styleId="128">
     <w:name w:val="Colorful Grid Accent 3"/>
     <w:basedOn w:val="32"/>
+    <w:qFormat/>
     <w:uiPriority w:val="73"/>
     <w:pPr>
       <w:spacing w:after="0" w:line="240" w:lineRule="auto"/>
@@ -20167,6 +20366,7 @@
   <w:style w:type="table" w:styleId="129">
     <w:name w:val="Colorful Grid Accent 4"/>
     <w:basedOn w:val="32"/>
+    <w:qFormat/>
     <w:uiPriority w:val="73"/>
     <w:pPr>
       <w:spacing w:after="0" w:line="240" w:lineRule="auto"/>
@@ -20263,6 +20463,7 @@
   <w:style w:type="table" w:styleId="130">
     <w:name w:val="Colorful Grid Accent 5"/>
     <w:basedOn w:val="32"/>
+    <w:qFormat/>
     <w:uiPriority w:val="73"/>
     <w:pPr>
       <w:spacing w:after="0" w:line="240" w:lineRule="auto"/>
@@ -20359,6 +20560,7 @@
   <w:style w:type="table" w:styleId="131">
     <w:name w:val="Colorful Grid Accent 6"/>
     <w:basedOn w:val="32"/>
+    <w:qFormat/>
     <w:uiPriority w:val="73"/>
     <w:pPr>
       <w:spacing w:after="0" w:line="240" w:lineRule="auto"/>
@@ -20477,6 +20679,7 @@
     <w:basedOn w:val="132"/>
     <w:semiHidden/>
     <w:unhideWhenUsed/>
+    <w:qFormat/>
     <w:uiPriority w:val="99"/>
     <w:rPr>
       <w:color w:val="0000FF"/>

</xml_diff>

<commit_message>
Update public files from final submission
</commit_message>
<xml_diff>
--- a/public/Manuscript.docx
+++ b/public/Manuscript.docx
@@ -21,28 +21,7 @@
           <w:szCs w:val="36"/>
           <w:highlight w:val="none"/>
         </w:rPr>
-        <w:t>Emotional distress predict</w:t>
-      </w:r>
-      <w:r>
-        <w:rPr>
-          <w:rFonts w:hint="eastAsia" w:ascii="Arial" w:hAnsi="Arial" w:eastAsia="宋体" w:cs="Arial"/>
-          <w:b/>
-          <w:sz w:val="36"/>
-          <w:szCs w:val="36"/>
-          <w:highlight w:val="none"/>
-          <w:lang w:val="en-US" w:eastAsia="zh-CN"/>
-        </w:rPr>
-        <w:t>s</w:t>
-      </w:r>
-      <w:r>
-        <w:rPr>
-          <w:rFonts w:hint="default" w:ascii="Arial" w:hAnsi="Arial" w:cs="Arial"/>
-          <w:b/>
-          <w:sz w:val="36"/>
-          <w:szCs w:val="36"/>
-          <w:highlight w:val="none"/>
-        </w:rPr>
-        <w:t xml:space="preserve"> change in adolescent problematic digital use and related symptoms</w:t>
+        <w:t>Emotional distress predicts later problematic digital use in adolescents</w:t>
       </w:r>
     </w:p>
     <w:p>
@@ -389,250 +368,8 @@
           <w:rFonts w:hint="eastAsia"/>
           <w:highlight w:val="none"/>
         </w:rPr>
-        <w:t xml:space="preserve">Whether adolescent problematic digital use precedes or follows broader </w:t>
-      </w:r>
-      <w:r>
-        <w:rPr>
-          <w:rFonts w:hint="eastAsia" w:eastAsia="宋体"/>
-          <w:highlight w:val="none"/>
-          <w:lang w:eastAsia="zh-CN"/>
-        </w:rPr>
-        <w:t>mental health difficulties</w:t>
-      </w:r>
-      <w:r>
-        <w:rPr>
-          <w:rFonts w:hint="eastAsia"/>
-          <w:highlight w:val="none"/>
-        </w:rPr>
-        <w:t xml:space="preserve"> remains unresolved. In the School-based Evaluation Advancing Response for Child Health (SEARCH) cohort in China (N</w:t>
-      </w:r>
-      <w:r>
-        <w:rPr>
-          <w:rFonts w:hint="eastAsia" w:eastAsia="宋体"/>
-          <w:highlight w:val="none"/>
-          <w:lang w:val="en-US" w:eastAsia="zh-CN"/>
-        </w:rPr>
-        <w:t xml:space="preserve"> </w:t>
-      </w:r>
-      <w:r>
-        <w:rPr>
-          <w:rFonts w:hint="eastAsia"/>
-          <w:highlight w:val="none"/>
-        </w:rPr>
-        <w:t>=</w:t>
-      </w:r>
-      <w:r>
-        <w:rPr>
-          <w:rFonts w:hint="eastAsia" w:eastAsia="宋体"/>
-          <w:highlight w:val="none"/>
-          <w:lang w:val="en-US" w:eastAsia="zh-CN"/>
-        </w:rPr>
-        <w:t xml:space="preserve"> </w:t>
-      </w:r>
-      <w:r>
-        <w:rPr>
-          <w:rFonts w:hint="eastAsia"/>
-          <w:highlight w:val="none"/>
-        </w:rPr>
-        <w:t>10,356; n</w:t>
-      </w:r>
-      <w:r>
-        <w:rPr>
-          <w:rFonts w:hint="eastAsia" w:eastAsia="宋体"/>
-          <w:highlight w:val="none"/>
-          <w:lang w:val="en-US" w:eastAsia="zh-CN"/>
-        </w:rPr>
-        <w:t xml:space="preserve"> </w:t>
-      </w:r>
-      <w:r>
-        <w:rPr>
-          <w:rFonts w:hint="eastAsia"/>
-          <w:highlight w:val="none"/>
-        </w:rPr>
-        <w:t>=</w:t>
-      </w:r>
-      <w:r>
-        <w:rPr>
-          <w:rFonts w:hint="eastAsia" w:eastAsia="宋体"/>
-          <w:highlight w:val="none"/>
-          <w:lang w:val="en-US" w:eastAsia="zh-CN"/>
-        </w:rPr>
-        <w:t xml:space="preserve"> </w:t>
-      </w:r>
-      <w:r>
-        <w:rPr>
-          <w:rFonts w:hint="eastAsia"/>
-          <w:highlight w:val="none"/>
-        </w:rPr>
-        <w:t>6,092 reassessed one year later), a cross-lagged panel network (CLPN) showed that emotional distress had the strongest positive net directionality (+0.249, 95% CI 0.086 to 0.418) and predicted later problematic digital use, insomnia, broad difficulties and diet.</w:t>
-      </w:r>
-      <w:r>
-        <w:rPr>
-          <w:rFonts w:hint="eastAsia" w:eastAsia="宋体"/>
-          <w:highlight w:val="none"/>
-          <w:lang w:val="en-US" w:eastAsia="zh-CN"/>
-        </w:rPr>
-        <w:t xml:space="preserve"> Problematic digital use showed no significant net directionality. </w:t>
-      </w:r>
-      <w:r>
-        <w:rPr>
-          <w:rFonts w:hint="eastAsia"/>
-          <w:highlight w:val="none"/>
-        </w:rPr>
-        <w:t>In the UK Millennium Cohort Study (n</w:t>
-      </w:r>
-      <w:r>
-        <w:rPr>
-          <w:rFonts w:hint="eastAsia" w:eastAsia="宋体"/>
-          <w:highlight w:val="none"/>
-          <w:lang w:val="en-US" w:eastAsia="zh-CN"/>
-        </w:rPr>
-        <w:t xml:space="preserve"> </w:t>
-      </w:r>
-      <w:r>
-        <w:rPr>
-          <w:rFonts w:hint="eastAsia"/>
-          <w:highlight w:val="none"/>
-        </w:rPr>
-        <w:t>=</w:t>
-      </w:r>
-      <w:r>
-        <w:rPr>
-          <w:rFonts w:hint="eastAsia" w:eastAsia="宋体"/>
-          <w:highlight w:val="none"/>
-          <w:lang w:val="en-US" w:eastAsia="zh-CN"/>
-        </w:rPr>
-        <w:t xml:space="preserve"> </w:t>
-      </w:r>
-      <w:r>
-        <w:rPr>
-          <w:rFonts w:hint="eastAsia"/>
-          <w:highlight w:val="none"/>
-        </w:rPr>
-        <w:t>7,838)</w:t>
-      </w:r>
-      <w:r>
-        <w:rPr>
-          <w:rFonts w:hint="eastAsia" w:eastAsia="宋体"/>
-          <w:highlight w:val="none"/>
-          <w:lang w:val="en-US" w:eastAsia="zh-CN"/>
-        </w:rPr>
-        <w:t>,</w:t>
-      </w:r>
-      <w:r>
-        <w:rPr>
-          <w:rFonts w:hint="eastAsia"/>
-          <w:highlight w:val="none"/>
-        </w:rPr>
-        <w:t xml:space="preserve"> </w:t>
-      </w:r>
-      <w:r>
-        <w:rPr>
-          <w:rFonts w:hint="eastAsia" w:eastAsia="宋体"/>
-          <w:highlight w:val="none"/>
-          <w:lang w:eastAsia="zh-CN"/>
-        </w:rPr>
-        <w:t>social media use</w:t>
-      </w:r>
-      <w:r>
-        <w:rPr>
-          <w:rFonts w:hint="eastAsia"/>
-          <w:highlight w:val="none"/>
-        </w:rPr>
-        <w:t xml:space="preserve"> </w:t>
-      </w:r>
-      <w:r>
-        <w:rPr>
-          <w:rFonts w:hint="eastAsia" w:eastAsia="宋体"/>
-          <w:highlight w:val="none"/>
-          <w:lang w:val="en-US" w:eastAsia="zh-CN"/>
-        </w:rPr>
-        <w:t>w</w:t>
-      </w:r>
-      <w:r>
-        <w:rPr>
-          <w:rFonts w:hint="eastAsia"/>
-          <w:highlight w:val="none"/>
-        </w:rPr>
-        <w:t>as the strongest net sink (−0.211, 95% CI −0.260 to −0.139), whereas hyperactivity/inattention was the leading</w:t>
-      </w:r>
-      <w:r>
-        <w:rPr>
-          <w:rFonts w:hint="eastAsia" w:eastAsia="宋体"/>
-          <w:highlight w:val="none"/>
-          <w:lang w:val="en-US" w:eastAsia="zh-CN"/>
-        </w:rPr>
-        <w:t xml:space="preserve"> net </w:t>
-      </w:r>
-      <w:r>
-        <w:rPr>
-          <w:rFonts w:hint="eastAsia"/>
-          <w:highlight w:val="none"/>
-        </w:rPr>
-        <w:t xml:space="preserve">source. Static structural-control positions differed from CLPN net directionality. Bayesian net out-degree showed a positive but imprecise association with CLPN net directionality. </w:t>
-      </w:r>
-      <w:r>
-        <w:rPr>
-          <w:rFonts w:hint="eastAsia" w:eastAsia="宋体"/>
-          <w:highlight w:val="none"/>
-          <w:lang w:val="en-US" w:eastAsia="zh-CN"/>
-        </w:rPr>
-        <w:t>I</w:t>
-      </w:r>
-      <w:r>
-        <w:rPr>
-          <w:rFonts w:hint="eastAsia"/>
-          <w:highlight w:val="none"/>
-        </w:rPr>
-        <w:t>n the Global Mind Project (n</w:t>
-      </w:r>
-      <w:r>
-        <w:rPr>
-          <w:rFonts w:hint="eastAsia" w:eastAsia="宋体"/>
-          <w:highlight w:val="none"/>
-          <w:lang w:val="en-US" w:eastAsia="zh-CN"/>
-        </w:rPr>
-        <w:t xml:space="preserve"> </w:t>
-      </w:r>
-      <w:r>
-        <w:rPr>
-          <w:rFonts w:hint="eastAsia"/>
-          <w:highlight w:val="none"/>
-        </w:rPr>
-        <w:t>=</w:t>
-      </w:r>
-      <w:r>
-        <w:rPr>
-          <w:rFonts w:hint="eastAsia" w:eastAsia="宋体"/>
-          <w:highlight w:val="none"/>
-          <w:lang w:val="en-US" w:eastAsia="zh-CN"/>
-        </w:rPr>
-        <w:t xml:space="preserve"> </w:t>
-      </w:r>
-      <w:r>
-        <w:rPr>
-          <w:rFonts w:hint="eastAsia"/>
-          <w:highlight w:val="none"/>
-        </w:rPr>
-        <w:t>147,506), emotion had the highest cross-sectional network strength.</w:t>
-      </w:r>
-      <w:r>
-        <w:rPr>
-          <w:rFonts w:hint="eastAsia" w:eastAsia="宋体"/>
-          <w:highlight w:val="none"/>
-          <w:lang w:val="en-US" w:eastAsia="zh-CN"/>
-        </w:rPr>
-        <w:t xml:space="preserve"> A</w:t>
-      </w:r>
-      <w:r>
-        <w:rPr>
-          <w:rFonts w:hint="eastAsia"/>
-          <w:highlight w:val="none"/>
-        </w:rPr>
-        <w:t>cross longitudinal cohorts, psychological difficulties occupied leading net source positions, whereas screen-related measures did not.</w:t>
-      </w:r>
-      <w:bookmarkStart w:id="0" w:name="_GoBack"/>
-      <w:bookmarkEnd w:id="0"/>
+        <w:t>Adolescent digital use is associated with psychological difficulties, but prospective relationships may differ between symptoms of problematic use and usage duration. We analysed two-wave data from 6,092 adolescents in the Chinese SEARCH cohort followed for approximately one year and 7,838 UK Millennium Cohort Study participants followed from ages 14 to 17. Cross-lagged panel networks accounted for baseline scores across six domains within each cohort. In SEARCH, emotional distress predicted later problematic digital use (β = 0.160); the reciprocal association was also positive (β = 0.079). In the UK cohort, hyperactivity/inattention and conduct problems positively predicted subsequent social media use and gaming, whereas internalising distress showed small negative coefficients for both behaviours. These findings identify different psychological domains associated with later digital use across cohorts and support distinguishing symptoms of problematic use from time spent on social media or gaming.</w:t>
+      </w:r>
     </w:p>
     <w:p>
       <w:pPr>
@@ -997,52 +734,7 @@
           <w:rFonts w:hint="eastAsia"/>
           <w:highlight w:val="none"/>
         </w:rPr>
-        <w:t>The model included generalised problematic digital use, emotional distress, broad Strengths and Difficulties Questionnaire (SDQ) difficulties, diet, insomnia and physical activity in 6,092 adolescents reassessed approximately one year later. We then examined whether</w:t>
-      </w:r>
-      <w:r>
-        <w:rPr>
-          <w:rFonts w:hint="eastAsia" w:eastAsia="宋体"/>
-          <w:highlight w:val="none"/>
-          <w:lang w:val="en-US" w:eastAsia="zh-CN"/>
-        </w:rPr>
-        <w:t xml:space="preserve"> </w:t>
-      </w:r>
-      <w:r>
-        <w:rPr>
-          <w:rFonts w:hint="eastAsia"/>
-          <w:highlight w:val="none"/>
-        </w:rPr>
-        <w:t>the longitudinal position of screen-related measures</w:t>
-      </w:r>
-      <w:r>
-        <w:rPr>
-          <w:rFonts w:hint="eastAsia" w:eastAsia="宋体"/>
-          <w:highlight w:val="none"/>
-          <w:lang w:val="en-US" w:eastAsia="zh-CN"/>
-        </w:rPr>
-        <w:t xml:space="preserve"> </w:t>
-      </w:r>
-      <w:r>
-        <w:rPr>
-          <w:rFonts w:hint="eastAsia"/>
-          <w:highlight w:val="none"/>
-        </w:rPr>
-        <w:t xml:space="preserve">extended to the UK Millennium Cohort Study (MCS), where </w:t>
-      </w:r>
-      <w:r>
-        <w:rPr>
-          <w:rFonts w:hint="eastAsia" w:eastAsia="宋体"/>
-          <w:highlight w:val="none"/>
-          <w:lang w:eastAsia="zh-CN"/>
-        </w:rPr>
-        <w:t>social media use</w:t>
-      </w:r>
-      <w:r>
-        <w:rPr>
-          <w:rFonts w:hint="eastAsia"/>
-          <w:highlight w:val="none"/>
-        </w:rPr>
-        <w:t xml:space="preserve"> and gaming were measured directly between ages 14 and 17</w:t>
+        <w:t>The model included generalised problematic digital use, emotional distress, a study-specific Strengths and Difficulties Questionnaire (SDQ) core-item composite, diet, insomnia and physical activity in 6,092 adolescents reassessed approximately one year later. We then conducted a construct-level longitudinal comparison in the UK Millennium Cohort Study (MCS), where social media use and gaming were measured directly between ages 14 and 17</w:t>
       </w:r>
       <w:r>
         <w:rPr>
@@ -1128,7 +820,7 @@
           <w:rFonts w:hint="eastAsia"/>
           <w:highlight w:val="none"/>
         </w:rPr>
-        <w:t>Emotional distress is the strongest net source in SEARCH</w:t>
+        <w:t>Emotional distress shows the largest positive CLPN net-directionality estimate in SEARCH</w:t>
       </w:r>
     </w:p>
     <w:p>
@@ -1164,17 +856,46 @@
     <w:p>
       <w:pPr>
         <w:rPr>
+          <w:rFonts w:hint="eastAsia"/>
+          <w:highlight w:val="none"/>
+        </w:rPr>
+      </w:pPr>
+      <w:r>
+        <w:rPr>
+          <w:rFonts w:hint="eastAsia"/>
+          <w:highlight w:val="none"/>
+        </w:rPr>
+        <w:t>Net directionality summarises the balance between absolute outgoing and incoming cross-domain coefficients, excluding autoregressive paths. Positive values indicate a greater balance of outgoing than incoming cross-domain prediction, whereas negative values indicate the reverse.</w:t>
+      </w:r>
+      <w:r>
+        <w:rPr>
           <w:rFonts w:hint="eastAsia" w:eastAsia="宋体"/>
           <w:highlight w:val="none"/>
           <w:lang w:val="en-US" w:eastAsia="zh-CN"/>
         </w:rPr>
-      </w:pPr>
+        <w:t xml:space="preserve"> </w:t>
+      </w:r>
       <w:r>
         <w:rPr>
           <w:rFonts w:hint="eastAsia"/>
           <w:highlight w:val="none"/>
         </w:rPr>
-        <w:t xml:space="preserve">Within this retained sample, emotional distress showed the largest positive CLPN net directionality (+0.249, 95% CI 0.086 to 0.418; Fig. 1), placing it in the strongest net source position. Broad SDQ difficulties (−0.090, 95% CI −0.189 to −0.003) and physical activity (−0.145, 95% CI −0.218 to −0.060) occupied net sink positions. By contrast, problematic digital use (CIAS; −0.061, 95% CI −0.161 to 0.051), diet (−0.014, 95% CI −0.137 to 0.108) and insomnia (+0.061, 95% CI −0.091 to 0.217) showed no significant net directionality because their confidence intervals included zero. </w:t>
+        <w:t>Within this retained sample, emotional distress</w:t>
+      </w:r>
+      <w:r>
+        <w:rPr>
+          <w:rFonts w:hint="eastAsia" w:eastAsia="宋体"/>
+          <w:highlight w:val="none"/>
+          <w:lang w:val="en-US" w:eastAsia="zh-CN"/>
+        </w:rPr>
+        <w:t xml:space="preserve"> </w:t>
+      </w:r>
+      <w:r>
+        <w:rPr>
+          <w:rFonts w:hint="eastAsia"/>
+          <w:highlight w:val="none"/>
+        </w:rPr>
+        <w:t>had the largest positive point estimate (+0.249, 95% CI 0.086–0.418; Fig. 1). The SDQ broad-difficulties domain (−0.090, 95% CI −0.189 to −0.003) and physical activity (−0.145, 95% CI −0.218 to −0.060) had negative net-directionality estimates. The confidence intervals for problematic digital use (CIAS; −0.061, 95% CI −0.161 to 0.051), diet (−0.014, 95% CI −0.137 to 0.108) and insomnia (+0.061, 95% CI −0.091 to 0.217) included zero.</w:t>
       </w:r>
     </w:p>
     <w:p>
@@ -1189,7 +910,37 @@
           <w:rFonts w:hint="eastAsia"/>
           <w:highlight w:val="none"/>
         </w:rPr>
-        <w:t>This domain-level pattern was also evident in the individual cross-domain paths. Emotional distress predicted later change in problematic digital use (DASS→CIAS, β=0.160), insomnia (DASS→ISI, β=0.151), broad SDQ difficulties (DASS→SDQ, β=0.120) and diet (DASS→DIET, β=0.108). The similarly strong reciprocal path from insomnia to emotional distress (ISI→DASS, β=0.150) indicated reciprocal prospective prediction between these two domains, while emotional distress retained the strongest positive net directionality. Emotional distress retained the strongest net source position in sensitivity analyses restricted to Bonferroni-significant cross-domain paths, adjusted for age, sex and grade and excluding diet (Supplementary Table S13). Across these analyses, emotional distress was the leading longitudinal predictor in SEARCH; problematic digital use showed no clear net directionality.</w:t>
+        <w:t>The individual paths further clarified this pattern. Emotional distress predicted later problematic digital use (DASS→CIAS, β = 0.160). The reciprocal CIAS→DASS association was also positive but smaller (β = 0.079). Emotional distress predicted later insomnia (β = 0.151), the SDQ broad-difficulties domain score (β = 0.120) and diet (β = 0.108). The reciprocal path from insomnia to emotional distress was of similar magnitude (ISI→DASS, β = 0.150), indicating prospective prediction in both directions. Emotional distress retained the strongest positive CLPN net directionality. With school-cluster-robust inference, the DASS→CIAS coefficient was 0.160 (95% CI 0.076–0.244; nominal P = 0.0020; Bonferroni-adjusted P = 0.059). The DASS→ISI association remained significant after Bonferroni correction (adjusted P = 0.038).</w:t>
+      </w:r>
+      <w:r>
+        <w:rPr>
+          <w:rFonts w:hint="eastAsia" w:eastAsia="宋体"/>
+          <w:highlight w:val="none"/>
+          <w:lang w:val="en-US" w:eastAsia="zh-CN"/>
+        </w:rPr>
+        <w:t xml:space="preserve"> </w:t>
+      </w:r>
+      <w:r>
+        <w:rPr>
+          <w:rFonts w:hint="eastAsia"/>
+          <w:highlight w:val="none"/>
+        </w:rPr>
+        <w:t xml:space="preserve">It also retained the leading </w:t>
+      </w:r>
+      <w:r>
+        <w:rPr>
+          <w:rFonts w:hint="eastAsia" w:eastAsia="宋体"/>
+          <w:highlight w:val="none"/>
+          <w:lang w:eastAsia="zh-CN"/>
+        </w:rPr>
+        <w:t>CLPN net source position</w:t>
+      </w:r>
+      <w:r>
+        <w:rPr>
+          <w:rFonts w:hint="eastAsia"/>
+          <w:highlight w:val="none"/>
+        </w:rPr>
+        <w:t xml:space="preserve"> in sensitivity analyses restricted to Bonferroni-significant cross-domain paths, adjusted for age, sex and grade, and excluding diet (Supplementary Table S13). Across the sensitivity analyses, emotional distress retained the largest positive net-directionality point estimate. Under school-cluster-robust inference, the DASS→CIAS coefficient remained positive, although its Bonferroni-adjusted P value was 0.059.</w:t>
       </w:r>
     </w:p>
     <w:p>
@@ -1282,7 +1033,22 @@
           <w:rFonts w:hint="eastAsia"/>
           <w:highlight w:val="none"/>
         </w:rPr>
-        <w:t>(a) Standardised coefficients from each Wave 1 domain to each Wave 3 domain; diagonal entries are autoregressive effects, and asterisks indicate nominal P &lt; 0.05 without multiplicity adjustment. (b) Directed network displaying cross-lagged paths with nominal P &lt; 0.05 and |β| ≥ 0.08. This display threshold was used for visual clarity. (c) CLPN net directionality, calculated as absolute cross-lagged out-strength minus in-strength, with 95% bootstrap confidence intervals. CIAS, generalised problematic digital use; DASS, emotional distress; SDQ, broad SDQ difficulties; DIET, diet; ISI, insomnia; ACT, physical activity. N = 6,092.</w:t>
+        <w:t>(a) Standardised coefficients from each Wave 1 domain to each Wave 3 domain; diagonal entries are autoregressive effects, and asterisks indicate nominal P &lt; 0.05 without multiplicity adjustment. (b) Directed network displaying cross-lagged paths with nominal P &lt; 0.05 and |β| ≥ 0.08. The reciprocal CIAS→DASS path (β = 0.079) falls below the display threshold and is shown in panel a.</w:t>
+      </w:r>
+      <w:r>
+        <w:rPr>
+          <w:rFonts w:hint="eastAsia" w:eastAsia="宋体"/>
+          <w:highlight w:val="none"/>
+          <w:lang w:val="en-US" w:eastAsia="zh-CN"/>
+        </w:rPr>
+        <w:t xml:space="preserve"> </w:t>
+      </w:r>
+      <w:r>
+        <w:rPr>
+          <w:rFonts w:hint="eastAsia"/>
+          <w:highlight w:val="none"/>
+        </w:rPr>
+        <w:t>This display threshold was used for visual clarity. (c) CLPN net directionality, calculated as absolute cross-lagged out-strength minus in-strength, with 95% bootstrap confidence intervals. CIAS, generalised problematic digital use; DASS, emotional distress; SDQ, broad SDQ difficulties; DIET, diet; ISI, insomnia; ACT, physical activity. N = 6,092.</w:t>
       </w:r>
     </w:p>
     <w:p>
@@ -1295,26 +1061,25 @@
       </w:pPr>
       <w:r>
         <w:rPr>
+          <w:rFonts w:hint="eastAsia"/>
+          <w:highlight w:val="none"/>
+        </w:rPr>
+        <w:t>Social media use and gaming</w:t>
+      </w:r>
+      <w:r>
+        <w:rPr>
           <w:rFonts w:hint="eastAsia" w:eastAsia="宋体"/>
           <w:highlight w:val="none"/>
           <w:lang w:val="en-US" w:eastAsia="zh-CN"/>
         </w:rPr>
-        <w:t>S</w:t>
-      </w:r>
-      <w:r>
-        <w:rPr>
-          <w:rFonts w:hint="eastAsia" w:eastAsia="宋体"/>
-          <w:highlight w:val="none"/>
-          <w:lang w:eastAsia="zh-CN"/>
-        </w:rPr>
-        <w:t>ocial media use</w:t>
+        <w:t xml:space="preserve"> </w:t>
       </w:r>
       <w:r>
         <w:rPr>
           <w:rFonts w:hint="eastAsia"/>
           <w:highlight w:val="none"/>
         </w:rPr>
-        <w:t xml:space="preserve"> and gaming occupy net sink positions in the UK cohort</w:t>
+        <w:t>show negative CLPN net-directionality estimates in the UK cohort</w:t>
       </w:r>
     </w:p>
     <w:p>
@@ -1329,37 +1094,112 @@
           <w:rFonts w:hint="eastAsia"/>
           <w:highlight w:val="none"/>
         </w:rPr>
-        <w:t>In SEARCH, emotional distress occupied the strongest net source position, whereas problematic digital use showed no significant net directionality. We next tested this longitudinal ordering in the independent UK Millennium Cohort Study (MCS), which followed adolescents from age 14 to 17 and directly measured social media use and electronic gaming.</w:t>
+        <w:t xml:space="preserve">In SEARCH, emotional distress occupied the leading </w:t>
       </w:r>
       <w:r>
         <w:rPr>
           <w:rFonts w:hint="eastAsia" w:eastAsia="宋体"/>
           <w:highlight w:val="none"/>
+          <w:lang w:eastAsia="zh-CN"/>
+        </w:rPr>
+        <w:t>CLPN net source position</w:t>
+      </w:r>
+      <w:r>
+        <w:rPr>
+          <w:rFonts w:hint="eastAsia"/>
+          <w:highlight w:val="none"/>
+        </w:rPr>
+        <w:t>; CIAS</w:t>
+      </w:r>
+      <w:r>
+        <w:rPr>
+          <w:rFonts w:hint="eastAsia" w:eastAsia="宋体"/>
+          <w:highlight w:val="none"/>
           <w:lang w:val="en-US" w:eastAsia="zh-CN"/>
         </w:rPr>
-        <w:t xml:space="preserve"> </w:t>
+        <w:t xml:space="preserve"> (</w:t>
       </w:r>
       <w:r>
         <w:rPr>
           <w:rFonts w:hint="eastAsia"/>
           <w:highlight w:val="none"/>
         </w:rPr>
-        <w:t xml:space="preserve">Among 9,520 cohort members linked across the two ages, 7,838 had complete data across all six domains and entered the CLPN analysis. The resulting pattern placed screen-related behaviours in net sink positions: </w:t>
+        <w:t>problematic digital use</w:t>
       </w:r>
       <w:r>
         <w:rPr>
           <w:rFonts w:hint="eastAsia" w:eastAsia="宋体"/>
           <w:highlight w:val="none"/>
+          <w:lang w:val="en-US" w:eastAsia="zh-CN"/>
+        </w:rPr>
+        <w:t>)</w:t>
+      </w:r>
+      <w:r>
+        <w:rPr>
+          <w:rFonts w:hint="eastAsia"/>
+          <w:highlight w:val="none"/>
+        </w:rPr>
+        <w:t xml:space="preserve"> showed positive reciprocal associations with emotional distress, while the confidence interval for its net-directionality estimate included zero. We next examined this longitudinal ordering in the independent UK Millennium Cohort Study (MCS), which followed adolescents from age 14 to age 17 and directly measured </w:t>
+      </w:r>
+      <w:r>
+        <w:rPr>
+          <w:rFonts w:hint="eastAsia" w:eastAsia="宋体"/>
+          <w:highlight w:val="none"/>
           <w:lang w:eastAsia="zh-CN"/>
         </w:rPr>
-        <w:t>social media use</w:t>
+        <w:t>social media</w:t>
       </w:r>
       <w:r>
         <w:rPr>
           <w:rFonts w:hint="eastAsia"/>
           <w:highlight w:val="none"/>
         </w:rPr>
-        <w:t xml:space="preserve"> was the strongest net sink (−0.211, 95% CI −0.260 to −0.139), while gaming (−0.089, 95% CI −0.149 to −0.020) and peer problems (−0.080, 95% CI −0.161 to −0.004; Fig. 2) also occupied net sink positions.</w:t>
+        <w:t xml:space="preserve"> use and electronic gaming. Among 9,520 cohort members linked across the two ages, 7,838 had complete data across all six domains and entered the CLPN analysis. Screen-related behaviours occupied </w:t>
+      </w:r>
+      <w:r>
+        <w:rPr>
+          <w:rFonts w:hint="eastAsia" w:eastAsia="宋体"/>
+          <w:highlight w:val="none"/>
+          <w:lang w:eastAsia="zh-CN"/>
+        </w:rPr>
+        <w:t>CLPN net sink position</w:t>
+      </w:r>
+      <w:r>
+        <w:rPr>
+          <w:rFonts w:hint="eastAsia"/>
+          <w:highlight w:val="none"/>
+        </w:rPr>
+        <w:t xml:space="preserve">s. </w:t>
+      </w:r>
+      <w:r>
+        <w:rPr>
+          <w:rFonts w:hint="eastAsia" w:eastAsia="宋体"/>
+          <w:highlight w:val="none"/>
+          <w:lang w:eastAsia="zh-CN"/>
+        </w:rPr>
+        <w:t>social media</w:t>
+      </w:r>
+      <w:r>
+        <w:rPr>
+          <w:rFonts w:hint="eastAsia"/>
+          <w:highlight w:val="none"/>
+        </w:rPr>
+        <w:t xml:space="preserve"> use had the strongest negative CLPN net directionality (−0.211, 95% CI −0.260 to −0.139). Gaming (−0.089, 95% CI −0.149 to −0.020) and peer problems (−0.080, 95% CI −0.161 to −0.004; Fig. 2) also occupied </w:t>
+      </w:r>
+      <w:r>
+        <w:rPr>
+          <w:rFonts w:hint="eastAsia" w:eastAsia="宋体"/>
+          <w:highlight w:val="none"/>
+          <w:lang w:eastAsia="zh-CN"/>
+        </w:rPr>
+        <w:t>CLPN net sink position</w:t>
+      </w:r>
+      <w:r>
+        <w:rPr>
+          <w:rFonts w:hint="eastAsia"/>
+          <w:highlight w:val="none"/>
+        </w:rPr>
+        <w:t>s.</w:t>
       </w:r>
     </w:p>
     <w:p>
@@ -1374,22 +1214,22 @@
           <w:rFonts w:hint="eastAsia"/>
           <w:highlight w:val="none"/>
         </w:rPr>
-        <w:t>Among the net source positions, hyperactivity/inattention was the strongest (+0.177, 95% CI 0.105 to 0.255), followed by self-reported internalising distress (+0.105, 95% CI 0.023 to 0.154) and conduct problems (+0.098, 95% CI 0.015 to 0.191). The strongest prospective paths to later screen-related behaviour originated from these broader difficulties</w:t>
+        <w:t xml:space="preserve">Among the domains with positive CLPN net directionality, hyperactivity/inattention had the largest value (+0.177, 95% CI 0.105 to 0.255), followed by self-reported internalising distress (+0.105, 95% CI 0.023 to 0.154) and conduct problems (+0.098, 95% CI 0.015 to 0.191). The strongest prospective paths to later screen-related behaviour originated from the externalising domains. Hyperactivity/inattention predicted gaming (β = 0.137) and </w:t>
       </w:r>
       <w:r>
         <w:rPr>
           <w:rFonts w:hint="eastAsia" w:eastAsia="宋体"/>
           <w:highlight w:val="none"/>
-          <w:lang w:val="en-US" w:eastAsia="zh-CN"/>
-        </w:rPr>
-        <w:t>:</w:t>
+          <w:lang w:eastAsia="zh-CN"/>
+        </w:rPr>
+        <w:t>social media</w:t>
       </w:r>
       <w:r>
         <w:rPr>
           <w:rFonts w:hint="eastAsia"/>
           <w:highlight w:val="none"/>
         </w:rPr>
-        <w:t xml:space="preserve"> hyperactivity/inattention predicted gaming (β = 0.137) and </w:t>
+        <w:t xml:space="preserve"> use (β = 0.112); conduct problems predicted </w:t>
       </w:r>
       <w:r>
         <w:rPr>
@@ -1397,14 +1237,14 @@
           <w:highlight w:val="none"/>
           <w:lang w:eastAsia="zh-CN"/>
         </w:rPr>
-        <w:t>social media use</w:t>
+        <w:t>social media</w:t>
       </w:r>
       <w:r>
         <w:rPr>
           <w:rFonts w:hint="eastAsia"/>
           <w:highlight w:val="none"/>
         </w:rPr>
-        <w:t xml:space="preserve"> (β = 0.112), while conduct problems predicted both </w:t>
+        <w:t xml:space="preserve"> use (β = 0.080) and gaming (β = 0.060). Self-reported internalising distress had positive CLPN net directionality, but its direct paths to later </w:t>
       </w:r>
       <w:r>
         <w:rPr>
@@ -1412,14 +1252,14 @@
           <w:highlight w:val="none"/>
           <w:lang w:eastAsia="zh-CN"/>
         </w:rPr>
-        <w:t>social media use</w:t>
+        <w:t>social media</w:t>
       </w:r>
       <w:r>
         <w:rPr>
           <w:rFonts w:hint="eastAsia"/>
           <w:highlight w:val="none"/>
         </w:rPr>
-        <w:t xml:space="preserve"> (β = 0.080) and gaming (β = 0.060). The MCS results broadened the SEARCH pattern: emotional distress was the strongest net source in SEARCH, while MCS identified both internalising and externalising net source positions, led by hyperactivity/inattention. Across both cohorts, the core ordering was consistent: screen-related behaviours did not occupy leading net source positions, with problematic digital use showing no significant net directionality in SEARCH and </w:t>
+        <w:t xml:space="preserve"> use (β = −0.013) and gaming (β = −0.045) were negative. Emotional distress had the strongest positive CLPN net directionality in SEARCH. MCS extended this pattern by identifying both internalising and externalising domains with positive CLPN net directionality, led by hyperactivity/inattention. Across both cohorts, screen-related behaviours did not occupy leading </w:t>
       </w:r>
       <w:r>
         <w:rPr>
@@ -1427,14 +1267,44 @@
           <w:highlight w:val="none"/>
           <w:lang w:eastAsia="zh-CN"/>
         </w:rPr>
-        <w:t>social media use</w:t>
+        <w:t>CLPN net source position</w:t>
       </w:r>
       <w:r>
         <w:rPr>
           <w:rFonts w:hint="eastAsia"/>
           <w:highlight w:val="none"/>
         </w:rPr>
-        <w:t xml:space="preserve"> and gaming occupying net sink positions in MCS.</w:t>
+        <w:t xml:space="preserve">s. Problematic digital use showed no significant CLPN net directionality in SEARCH; </w:t>
+      </w:r>
+      <w:r>
+        <w:rPr>
+          <w:rFonts w:hint="eastAsia" w:eastAsia="宋体"/>
+          <w:highlight w:val="none"/>
+          <w:lang w:eastAsia="zh-CN"/>
+        </w:rPr>
+        <w:t>social media</w:t>
+      </w:r>
+      <w:r>
+        <w:rPr>
+          <w:rFonts w:hint="eastAsia"/>
+          <w:highlight w:val="none"/>
+        </w:rPr>
+        <w:t xml:space="preserve"> use and gaming occupied </w:t>
+      </w:r>
+      <w:r>
+        <w:rPr>
+          <w:rFonts w:hint="eastAsia" w:eastAsia="宋体"/>
+          <w:highlight w:val="none"/>
+          <w:lang w:eastAsia="zh-CN"/>
+        </w:rPr>
+        <w:t>CLPN net sink position</w:t>
+      </w:r>
+      <w:r>
+        <w:rPr>
+          <w:rFonts w:hint="eastAsia"/>
+          <w:highlight w:val="none"/>
+        </w:rPr>
+        <w:t>s in MCS.</w:t>
       </w:r>
     </w:p>
     <w:p>
@@ -1589,7 +1459,7 @@
           <w:rFonts w:hint="eastAsia"/>
           <w:highlight w:val="none"/>
         </w:rPr>
-        <w:t>The longitudinal analyses in SEARCH and MCS placed screen-related behaviours outside the leading CLPN net source positions. We next examined the baseline SEARCH network to identify item-level structural-control positions. The network contained 104 items connected by 2,777 non-zero edges (density = 0.518, modularity = 0.443, global efficiency = 0.759). Despite the dense interconnection, ten equivalent MDS solutions were identified, each comprising three nodes whose immediate neighbourhoods covered the remaining network. Across these solutions, the most recurrent control nodes were DIET22 (worry about eating too much; control frequency = 0.60), SDQ18 (often lies or cheats; 0.50) and DASS14 (intolerance of interruption; 0.40; Fig. 3). The leading control positions arose from diet, behavioural and emotional symptoms. No CIAS item ranked among the three highest-frequency control nodes.</w:t>
+        <w:t>The longitudinal analyses in SEARCH and MCS placed screen-related behaviours outside the leading CLPN net source positions. We next examined the baseline SEARCH network to identify item-level structural-control positions. The network contained 104 items connected by 2,777 non-zero edges (density = 0.518, modularity = 0.443, global efficiency = 0.759). Despite the dense interconnection, ten equivalent MDS solutions were identified, each comprising three nodes whose immediate neighbourhoods covered the remaining network. Across these solutions, the most recurrent control nodes were DIET22 (worried by others about eating too much; control frequency = 0.60), SDQ18 (often lies or cheats; 0.50) and DASS14 (intolerance of interruption; 0.40; Fig. 3). The leading control positions arose from diet, behavioural and emotional symptoms. No CIAS item ranked among the three highest-frequency control nodes.</w:t>
       </w:r>
       <w:r>
         <w:rPr>
@@ -1619,7 +1489,22 @@
           <w:rFonts w:hint="eastAsia"/>
           <w:highlight w:val="none"/>
         </w:rPr>
-        <w:t xml:space="preserve"> control frequency correlated only weakly with node strength (Spearman ρ = 0.061) and loaded on a separate component from conventional centrality measures (Supplementary Fig. S15 and Table S10). Structural coverage and network connectedness identified distinct symptom roles.</w:t>
+        <w:t xml:space="preserve"> </w:t>
+      </w:r>
+      <w:r>
+        <w:rPr>
+          <w:rFonts w:hint="eastAsia" w:eastAsia="宋体"/>
+          <w:highlight w:val="none"/>
+          <w:lang w:val="en-US" w:eastAsia="zh-CN"/>
+        </w:rPr>
+        <w:t>c</w:t>
+      </w:r>
+      <w:r>
+        <w:rPr>
+          <w:rFonts w:hint="eastAsia"/>
+          <w:highlight w:val="none"/>
+        </w:rPr>
+        <w:t>ontrol frequency correlated only weakly with node strength (Spearman ρ = 0.061) and showed a different loading profile from conventional centrality measures. Structural coverage and network connectedness therefore provided different summaries of node position.</w:t>
       </w:r>
     </w:p>
     <w:p>
@@ -1679,7 +1564,7 @@
           <w:rFonts w:hint="eastAsia"/>
           <w:highlight w:val="none"/>
         </w:rPr>
-        <w:t>At the broader domain level, diet and broad SDQ difficulties occupied the strongest structural-control positions, emotional distress and problematic digital use formed an intermediate layer, and physical activity and insomnia occupied the weakest positions. This static architecture did not reproduce the longitudinal hierarchy. Emotional distress held an intermediate structural position but occupied the strongest CLPN net source position. Problematic digital use remained intermediate in the static network and showed no significant CLPN net directionality</w:t>
+        <w:t>At the broader domain level, diet and broad SDQ difficulties occupied the strongest structural-control positions, emotional distress and problematic digital use formed an intermediate layer, and physical activity and insomnia occupied the weakest positions. This static architecture did not reproduce the longitudinal hierarchy. Emotional distress held an intermediate structural position but occupied the leading CLPN net source position. Problematic digital use remained intermediate in the static network and showed no significant CLPN net directionality</w:t>
       </w:r>
       <w:r>
         <w:rPr>
@@ -1886,7 +1771,7 @@
           <w:rFonts w:hint="eastAsia"/>
           <w:highlight w:val="none"/>
         </w:rPr>
-        <w:t>An exploratory Bayesian directed acyclic graph fitted to the six Wave 1 SEARCH domain scores was used to compare Bayesian net out-degree with CLPN ordering. DASS had the highest net out-degree (+2), with outgoing edges to SDQ, CIAS and DIET. By contrast, CIAS had balanced in- and out-degree, while DIET had the most negative Bayesian net out-degree (−2; Fig. 4). The most stable directed edges were CIAS→ACT (bootstrap frequency = 0.970), DASS→SDQ (0.910), CIAS→DIET (0.905), DASS→DIET (0.855) and DASS→CIAS (0.850). Three of these five leading edges originated from DASS.</w:t>
+        <w:t>An exploratory Bayesian directed acyclic graph fitted to the six Wave 1 SEARCH domain scores was used to compare Bayesian net out-degree with CLPN ordering. DASS and ISI shared the highest Bayesian net out-degree (+2). DASS had outgoing edges to SDQ, CIAS and DIET. CIAS had balanced in- and out-degree. DIET had the most negative Bayesian net out-degree (−2; Fig. 4). The most stable directed edges were CIAS→ACT (bootstrap frequency = 0.970), DASS→SDQ (0.910), CIAS→DIET (0.905), DASS→DIET (0.855) and DASS→CIAS (0.850). Three of these five leading edges originated from DASS.</w:t>
       </w:r>
     </w:p>
     <w:p>
@@ -1901,22 +1786,7 @@
           <w:rFonts w:hint="eastAsia"/>
           <w:highlight w:val="none"/>
         </w:rPr>
-        <w:t>Across the six domains, Bayesian net out-degree was positively correlated with CLPN net directionality, although the estimate was imprecise (Pearson r = 0.750, two-sided P = 0.086; bootstrap 95% CI −0.604 to 0.995). DASS had</w:t>
-      </w:r>
-      <w:r>
-        <w:rPr>
-          <w:rFonts w:hint="eastAsia" w:eastAsia="宋体"/>
-          <w:highlight w:val="none"/>
-          <w:lang w:val="en-US" w:eastAsia="zh-CN"/>
-        </w:rPr>
-        <w:t xml:space="preserve"> a</w:t>
-      </w:r>
-      <w:r>
-        <w:rPr>
-          <w:rFonts w:hint="eastAsia"/>
-          <w:highlight w:val="none"/>
-        </w:rPr>
-        <w:t xml:space="preserve"> positive Bayesian net out-degree and occupied the strongest CLPN net source position. All seven skeleton edges were reversible in the CPDAG (Supplementary Tables S15–S16). These results show partial correspondence in domain ordering between the Bayesian and CLPN models.</w:t>
+        <w:t>Across the six domains, Bayesian net out-degree was positively correlated with CLPN net directionality, but the estimate was imprecise (Pearson r = 0.750, two-sided P = 0.086; bootstrap 95% CI −0.604 to 0.995). DASS shared the highest Bayesian net out-degree with ISI and occupied the leading CLPN net source position. All seven skeleton edges were reversible in the CPDAG (Supplementary Tables S15–S16). These results show partial correspondence in domain ordering between the Bayesian and CLPN models.</w:t>
       </w:r>
     </w:p>
     <w:p>
@@ -2050,7 +1920,37 @@
           <w:rFonts w:hint="eastAsia"/>
           <w:highlight w:val="none"/>
         </w:rPr>
-        <w:t>e examined whether the emotional prominence identified in SEARCH held under a different measurement system and across a much broader population. The Global Mind Project (GMP) analysis included 147,506 participants aged 18–24 years with complete data across six mapped domains from a pooled multinational sample. Emotion had the highest undirected network strength (0.726, 95% CI 0.714 to 0.738). It was followed by diet (0.504, 95% CI 0.493 to 0.515), activity (0.444, 95% CI 0.434 to 0.455), broad behavioural difficulties (0.409, 95% CI 0.396 to 0.424) and sleep (0.409, 95% CI 0.401 to 0.420). At the opposite end of the network, the social-media-frequency proxy had the lowest strength (0.075, 95% CI 0.065 to 0.085; Fig. 5), placing social-media frequency at the periphery of the mapped health system.</w:t>
+        <w:t xml:space="preserve">e examined whether the emotional prominence identified in SEARCH held under a different measurement system and across a much broader population. The Global Mind Project (GMP) analysis included 147,506 participants aged 18–24 years with complete data across six mapped domains from a pooled multinational sample. Emotion had the highest undirected network strength (0.726, 95% CI 0.714 to 0.738). It was followed by diet (0.504, 95% CI 0.493 to 0.515), activity (0.444, 95% CI 0.434 to 0.455), broad behavioural difficulties (0.409, 95% CI 0.396 to 0.424) and sleep (0.409, 95% CI 0.401 to 0.420). At the opposite end of the network, the </w:t>
+      </w:r>
+      <w:r>
+        <w:rPr>
+          <w:rFonts w:hint="eastAsia" w:eastAsia="宋体"/>
+          <w:highlight w:val="none"/>
+          <w:lang w:eastAsia="zh-CN"/>
+        </w:rPr>
+        <w:t>social media</w:t>
+      </w:r>
+      <w:r>
+        <w:rPr>
+          <w:rFonts w:hint="eastAsia"/>
+          <w:highlight w:val="none"/>
+        </w:rPr>
+        <w:t xml:space="preserve">-frequency proxy had the lowest strength (0.075, 95% CI 0.065 to 0.085; Fig. 5), placing </w:t>
+      </w:r>
+      <w:r>
+        <w:rPr>
+          <w:rFonts w:hint="eastAsia" w:eastAsia="宋体"/>
+          <w:highlight w:val="none"/>
+          <w:lang w:eastAsia="zh-CN"/>
+        </w:rPr>
+        <w:t>social media</w:t>
+      </w:r>
+      <w:r>
+        <w:rPr>
+          <w:rFonts w:hint="eastAsia"/>
+          <w:highlight w:val="none"/>
+        </w:rPr>
+        <w:t xml:space="preserve"> frequency at the periphery of the mapped health system.</w:t>
       </w:r>
       <w:r>
         <w:rPr>
@@ -2090,7 +1990,37 @@
           <w:rFonts w:hint="eastAsia"/>
           <w:highlight w:val="none"/>
         </w:rPr>
-        <w:t>Across these distinct populations and analytical frameworks, emotional difficulties remained prominent, while screen-related measures occupied less prominent positions.</w:t>
+        <w:t>Emotion ranked first in both six-domain networks. The screen-related domain ranked second in SEARCH and last in GMP, distinguishing the network positions of</w:t>
+      </w:r>
+      <w:r>
+        <w:rPr>
+          <w:rFonts w:hint="eastAsia" w:eastAsia="宋体"/>
+          <w:highlight w:val="none"/>
+          <w:lang w:eastAsia="zh-CN"/>
+        </w:rPr>
+        <w:t xml:space="preserve"> problematic use</w:t>
+      </w:r>
+      <w:r>
+        <w:rPr>
+          <w:rFonts w:hint="eastAsia"/>
+          <w:highlight w:val="none"/>
+        </w:rPr>
+        <w:t xml:space="preserve"> symptoms and </w:t>
+      </w:r>
+      <w:r>
+        <w:rPr>
+          <w:rFonts w:hint="eastAsia" w:eastAsia="宋体"/>
+          <w:highlight w:val="none"/>
+          <w:lang w:eastAsia="zh-CN"/>
+        </w:rPr>
+        <w:t>social media</w:t>
+      </w:r>
+      <w:r>
+        <w:rPr>
+          <w:rFonts w:hint="eastAsia"/>
+          <w:highlight w:val="none"/>
+        </w:rPr>
+        <w:t xml:space="preserve"> frequency.</w:t>
       </w:r>
     </w:p>
     <w:p>
@@ -2152,24 +2082,39 @@
         <w:pStyle w:val="165"/>
         <w:keepLines/>
         <w:rPr>
+          <w:rFonts w:hint="default" w:eastAsia="宋体"/>
+          <w:highlight w:val="none"/>
+          <w:lang w:val="en-US" w:eastAsia="zh-CN"/>
+        </w:rPr>
+      </w:pPr>
+      <w:r>
+        <w:rPr>
+          <w:b/>
+          <w:highlight w:val="none"/>
+        </w:rPr>
+        <w:t xml:space="preserve">Figure 5 | </w:t>
+      </w:r>
+      <w:r>
+        <w:rPr>
+          <w:rFonts w:hint="eastAsia"/>
+          <w:highlight w:val="none"/>
+        </w:rPr>
+        <w:t xml:space="preserve">Cross-sectional construct-level comparison in </w:t>
+      </w:r>
+      <w:r>
+        <w:rPr>
           <w:rFonts w:hint="eastAsia" w:eastAsia="宋体"/>
           <w:highlight w:val="none"/>
           <w:lang w:val="en-US" w:eastAsia="zh-CN"/>
         </w:rPr>
-      </w:pPr>
-      <w:r>
-        <w:rPr>
-          <w:b/>
-          <w:highlight w:val="none"/>
-        </w:rPr>
-        <w:t xml:space="preserve">Figure 5 | </w:t>
+        <w:t>GMP</w:t>
       </w:r>
       <w:r>
         <w:rPr>
           <w:rFonts w:hint="eastAsia"/>
           <w:highlight w:val="none"/>
         </w:rPr>
-        <w:t xml:space="preserve">Cross-sectional construct-level comparison in </w:t>
+        <w:t>. (a) Six-domain Gaussian graphical model in young adults; node size denotes domain strength. (b) Within-cohort normalised domain strength in the six-domain GMP network and a corresponding six-domain network derived from aggregated baseline SEARCH scores. Domain strengths were divided by the maximum strength within each cohort, so that the strongest domain was assigned a value of 1. (c) GMP domain strength with 95% bootstrap confidence intervals.</w:t>
       </w:r>
       <w:r>
         <w:rPr>
@@ -2177,19 +2122,49 @@
           <w:highlight w:val="none"/>
           <w:lang w:val="en-US" w:eastAsia="zh-CN"/>
         </w:rPr>
-        <w:t>GMP</w:t>
+        <w:t xml:space="preserve"> </w:t>
       </w:r>
       <w:r>
         <w:rPr>
           <w:rFonts w:hint="eastAsia"/>
           <w:highlight w:val="none"/>
         </w:rPr>
-        <w:t>. (a) Six-domain Gaussian graphical model in young adults; node size denotes domain strength. (b) Within-cohort normalised domain strength in the six-domain GMP network and a corresponding six-domain network derived from aggregated baseline SEARCH scores. Domain strengths were divided by the maximum strength within each cohort, so that the strongest domain was assigned a value of 1. (c) GMP domain strength with 95% bootstrap confidence intervals. In GMP, the screen-related domain was represented by social media frequency.</w:t>
+        <w:t>In SEARCH, the screen-related domain was represented by CIAS-R</w:t>
       </w:r>
       <w:r>
         <w:rPr>
           <w:rFonts w:hint="eastAsia" w:eastAsia="宋体"/>
           <w:highlight w:val="none"/>
+          <w:lang w:eastAsia="zh-CN"/>
+        </w:rPr>
+        <w:t xml:space="preserve"> problematic use</w:t>
+      </w:r>
+      <w:r>
+        <w:rPr>
+          <w:rFonts w:hint="eastAsia"/>
+          <w:highlight w:val="none"/>
+        </w:rPr>
+        <w:t xml:space="preserve"> symptoms; in GMP, it was represented by </w:t>
+      </w:r>
+      <w:r>
+        <w:rPr>
+          <w:rFonts w:hint="eastAsia" w:eastAsia="宋体"/>
+          <w:highlight w:val="none"/>
+          <w:lang w:eastAsia="zh-CN"/>
+        </w:rPr>
+        <w:t>social media</w:t>
+      </w:r>
+      <w:r>
+        <w:rPr>
+          <w:rFonts w:hint="eastAsia"/>
+          <w:highlight w:val="none"/>
+        </w:rPr>
+        <w:t xml:space="preserve"> frequency. N = 147,506 participants aged 18–24 years</w:t>
+      </w:r>
+      <w:r>
+        <w:rPr>
+          <w:rFonts w:hint="eastAsia" w:eastAsia="宋体"/>
+          <w:highlight w:val="none"/>
           <w:lang w:val="en-US" w:eastAsia="zh-CN"/>
         </w:rPr>
         <w:t xml:space="preserve"> </w:t>
@@ -2199,7 +2174,7 @@
           <w:rFonts w:hint="eastAsia"/>
           <w:highlight w:val="none"/>
         </w:rPr>
-        <w:t>Emotion had the highest network strength in GMP. N = 147,506 participants aged 18–24 years</w:t>
+        <w:t>in the pooled multinational GMP sample.</w:t>
       </w:r>
       <w:r>
         <w:rPr>
@@ -2207,22 +2182,7 @@
           <w:highlight w:val="none"/>
           <w:lang w:val="en-US" w:eastAsia="zh-CN"/>
         </w:rPr>
-        <w:t xml:space="preserve"> </w:t>
-      </w:r>
-      <w:r>
-        <w:rPr>
-          <w:rFonts w:hint="eastAsia"/>
-          <w:highlight w:val="none"/>
-        </w:rPr>
-        <w:t>in the pooled multinational GMP sample.</w:t>
-      </w:r>
-      <w:r>
-        <w:rPr>
-          <w:rFonts w:hint="eastAsia" w:eastAsia="宋体"/>
-          <w:highlight w:val="none"/>
-          <w:lang w:val="en-US" w:eastAsia="zh-CN"/>
-        </w:rPr>
-        <w:t xml:space="preserve"> BEH, broad behavioural difficulties; SM, social-media frequency.</w:t>
+        <w:t xml:space="preserve"> BEH, broad behavioural difficulties; SM, social media frequency. </w:t>
       </w:r>
     </w:p>
     <w:p>
@@ -2252,22 +2212,7 @@
           <w:rFonts w:hint="eastAsia"/>
           <w:highlight w:val="none"/>
         </w:rPr>
-        <w:t xml:space="preserve">Across both cohorts, broader emotional and behavioural difficulties were the leading longitudinal predictors; screen-related measures did not occupy leading net source positions. In SEARCH, emotional distress had the largest positive CLPN net directionality and predicted later change in generalised problematic digital use, insomnia, broad SDQ difficulties and diet; problematic digital use itself had no significant net directionality. In MCS, directly measured social media use was the strongest net sink and gaming also occupied a net sink position. The net source positions included hyperactivity/inattention, internalising distress and conduct problems, extending beyond emotional distress alone. Across cohorts, broader psychological difficulties occupied the leading net source positions, although the specific domains differed. Problematic digital use, </w:t>
-      </w:r>
-      <w:r>
-        <w:rPr>
-          <w:rFonts w:hint="eastAsia" w:eastAsia="宋体"/>
-          <w:highlight w:val="none"/>
-          <w:lang w:eastAsia="zh-CN"/>
-        </w:rPr>
-        <w:t>social media use</w:t>
-      </w:r>
-      <w:r>
-        <w:rPr>
-          <w:rFonts w:hint="eastAsia"/>
-          <w:highlight w:val="none"/>
-        </w:rPr>
-        <w:t xml:space="preserve"> and gaming did not occupy leading CLPN net source positions when analysed within broader psychological systems.</w:t>
+        <w:t>In SEARCH, emotional distress had the largest positive net-directionality point estimate and positively predicted later problematic digital use; the reciprocal coefficient was also positive, while the confidence interval for CIAS net directionality included zero. In MCS, hyperactivity/inattention and conduct problems positively predicted later social-media use and gaming, whereas internalising distress showed small negative direct coefficients for both behaviours. Thus, the psychological domains associated with later digital use differed between cohorts and between problematic-use symptoms and reported usage duration.</w:t>
       </w:r>
     </w:p>
     <w:p>
@@ -2282,7 +2227,113 @@
           <w:rFonts w:hint="eastAsia"/>
           <w:highlight w:val="none"/>
         </w:rPr>
-        <w:t>This distinction changes how associations between digital use and mental health should be interpreted. Elevated problematic digital-use scores mark clinically relevant functional impairment and warrant assessment in their own right. Their network position also places digital use within the accompanying symptom burden, outside the leading predictive position. In SEARCH, emotional distress occupied the strongest net source position; in MCS, externalising difficulties, especially hyperactivity/inattention, predicted later screen-related behaviour. Clinical and preventive assessment should therefore prioritise the emotional, attentional and conduct context of escalating digital engagement rather than assessing screen exposure in isolation. These estimates define prospective relations that can be tested in intervention and intensive longitudinal designs</w:t>
+        <w:t xml:space="preserve">The external analyses clarify the construct boundary. SEARCH assessed generalised problematic internet and digital-media use with the CIAS-R. MCS measured hours of </w:t>
+      </w:r>
+      <w:r>
+        <w:rPr>
+          <w:rFonts w:hint="eastAsia" w:eastAsia="宋体"/>
+          <w:highlight w:val="none"/>
+          <w:lang w:eastAsia="zh-CN"/>
+        </w:rPr>
+        <w:t>social media</w:t>
+      </w:r>
+      <w:r>
+        <w:rPr>
+          <w:rFonts w:hint="eastAsia"/>
+          <w:highlight w:val="none"/>
+        </w:rPr>
+        <w:t xml:space="preserve"> use and gaming, and GMP used </w:t>
+      </w:r>
+      <w:r>
+        <w:rPr>
+          <w:rFonts w:hint="eastAsia" w:eastAsia="宋体"/>
+          <w:highlight w:val="none"/>
+          <w:lang w:eastAsia="zh-CN"/>
+        </w:rPr>
+        <w:t>social media</w:t>
+      </w:r>
+      <w:r>
+        <w:rPr>
+          <w:rFonts w:hint="eastAsia"/>
+          <w:highlight w:val="none"/>
+        </w:rPr>
+        <w:t xml:space="preserve"> frequency. These measures provide construct-level convergence across related forms of digital use but do not constitute instrument-level replication. MCS provided the longitudinal exposure-based comparison: </w:t>
+      </w:r>
+      <w:r>
+        <w:rPr>
+          <w:rFonts w:hint="eastAsia" w:eastAsia="宋体"/>
+          <w:highlight w:val="none"/>
+          <w:lang w:eastAsia="zh-CN"/>
+        </w:rPr>
+        <w:t>social media</w:t>
+      </w:r>
+      <w:r>
+        <w:rPr>
+          <w:rFonts w:hint="eastAsia"/>
+          <w:highlight w:val="none"/>
+        </w:rPr>
+        <w:t xml:space="preserve"> use and gaming occupied CLPN net sink positions. In the pooled GMP sample, emotion had the highest cross-sectional network strength and </w:t>
+      </w:r>
+      <w:r>
+        <w:rPr>
+          <w:rFonts w:hint="eastAsia" w:eastAsia="宋体"/>
+          <w:highlight w:val="none"/>
+          <w:lang w:eastAsia="zh-CN"/>
+        </w:rPr>
+        <w:t>social media</w:t>
+      </w:r>
+      <w:r>
+        <w:rPr>
+          <w:rFonts w:hint="eastAsia"/>
+          <w:highlight w:val="none"/>
+        </w:rPr>
+        <w:t xml:space="preserve"> frequency the lowest. This ordering applied specifically to the GMP measure and sample. It does not indicate that all digital-use constructs occupy peripheral network positions; CIAS ranked second in the corresponding six-domain SEARCH network.</w:t>
+      </w:r>
+    </w:p>
+    <w:p>
+      <w:pPr>
+        <w:rPr>
+          <w:rFonts w:hint="eastAsia"/>
+          <w:highlight w:val="none"/>
+        </w:rPr>
+      </w:pPr>
+      <w:r>
+        <w:rPr>
+          <w:rFonts w:hint="eastAsia"/>
+          <w:highlight w:val="none"/>
+        </w:rPr>
+        <w:t>This distinction changes how associations between digital use and mental health should be interpreted. Elevated problematic digital-use scores mark clinically relevant functional impairment and warrant assessment in their own right. Their network position also places digital use within the accompanying symptom burden, outside the leading predictive position. T</w:t>
+      </w:r>
+      <w:bookmarkStart w:id="0" w:name="_GoBack"/>
+      <w:r>
+        <w:rPr>
+          <w:rFonts w:hint="eastAsia"/>
+          <w:highlight w:val="none"/>
+        </w:rPr>
+        <w:t>he findings support assessing em</w:t>
+      </w:r>
+      <w:bookmarkEnd w:id="0"/>
+      <w:r>
+        <w:rPr>
+          <w:rFonts w:hint="eastAsia"/>
+          <w:highlight w:val="none"/>
+        </w:rPr>
+        <w:t>otional, attentional and conduct difficulties alongside digital engagement. Assessment of screen exposure alone would not capture this broader context.</w:t>
+      </w:r>
+      <w:r>
+        <w:rPr>
+          <w:rFonts w:hint="eastAsia" w:eastAsia="宋体"/>
+          <w:highlight w:val="none"/>
+          <w:lang w:val="en-US" w:eastAsia="zh-CN"/>
+        </w:rPr>
+        <w:t xml:space="preserve"> </w:t>
+      </w:r>
+      <w:r>
+        <w:rPr>
+          <w:rFonts w:hint="eastAsia"/>
+          <w:highlight w:val="none"/>
+        </w:rPr>
+        <w:t>These estimates define prospective relations that can be tested in intervention and intensive longitudinal designs</w:t>
       </w:r>
       <w:r>
         <w:rPr>
@@ -2313,37 +2364,15 @@
           <w:rFonts w:hint="eastAsia"/>
           <w:highlight w:val="none"/>
         </w:rPr>
-        <w:t xml:space="preserve">The comparison of static and temporal models provides a second contribution. </w:t>
-      </w:r>
-      <w:r>
-        <w:rPr>
-          <w:rFonts w:hint="eastAsia" w:eastAsia="宋体"/>
-          <w:highlight w:val="none"/>
-          <w:lang w:eastAsia="zh-CN"/>
-        </w:rPr>
-        <w:t>MDS analysis identified diet, SDQ and emotional items whose neighbourhoods covered the baseline graph; the CLPN placed DASS in the strongest domain-level net source position.</w:t>
+        <w:t>The comparison of static and temporal models provides a second contribution. MDS analysis identified diet, SDQ and emotional items whose neighbourhoods covered the baseline graph; DASS occupied the leading domain-level CLPN net source position. Control frequency was only weakly related to node strength, and average module control strength did not reproduce CLPN net directionality. Graph topology and longitudinal prediction identified different dimensions of the symptom system. Structural-control nodes represent features of an estimated cross-sectional graph and should not be interpreted as causal intervention targets. Their value lies in describing sparse coverage and architecture; temporal or causal prioritisation requires longitudinal or experimental evidence</w:t>
       </w:r>
       <w:r>
         <w:rPr>
           <w:rFonts w:hint="eastAsia"/>
           <w:highlight w:val="none"/>
-        </w:rPr>
-        <w:t xml:space="preserve"> Control frequency was only weakly related to node strength, and average module control strength did not reproduce </w:t>
-      </w:r>
-      <w:r>
-        <w:rPr>
-          <w:rFonts w:hint="eastAsia" w:eastAsia="宋体"/>
-          <w:highlight w:val="none"/>
-          <w:lang w:eastAsia="zh-CN"/>
-        </w:rPr>
-        <w:t>CLPN net directionality</w:t>
-      </w:r>
-      <w:r>
-        <w:rPr>
-          <w:rFonts w:hint="eastAsia"/>
-          <w:highlight w:val="none"/>
-        </w:rPr>
-        <w:t>. Graph topology and longitudinal prediction identified different dimensions of the symptom system. Structural-control nodes should consequently be interpreted as features of an estimated cross-sectional graph, not as causal intervention targets. Their value lies in describing sparse coverage and architecture; temporal or causal prioritisation requires longitudinal or experimental evidence</w:t>
+          <w:vertAlign w:val="superscript"/>
+        </w:rPr>
+        <w:t>20</w:t>
       </w:r>
       <w:r>
         <w:rPr>
@@ -2352,14 +2381,22 @@
           <w:vertAlign w:val="superscript"/>
           <w:lang w:val="en-US" w:eastAsia="zh-CN"/>
         </w:rPr>
-        <w:t>20-25</w:t>
+        <w:t>-</w:t>
       </w:r>
       <w:r>
         <w:rPr>
           <w:rFonts w:hint="eastAsia"/>
           <w:highlight w:val="none"/>
-        </w:rPr>
-        <w:t>. In the exploratory Bayesian graph, DASS had the highest net out-degree, which was positively but imprecisely associated with CLPN net directionality across domains.</w:t>
+          <w:vertAlign w:val="superscript"/>
+        </w:rPr>
+        <w:t>25</w:t>
+      </w:r>
+      <w:r>
+        <w:rPr>
+          <w:rFonts w:hint="eastAsia"/>
+          <w:highlight w:val="none"/>
+        </w:rPr>
+        <w:t xml:space="preserve">. </w:t>
       </w:r>
     </w:p>
     <w:p>
@@ -2374,52 +2411,7 @@
           <w:rFonts w:hint="eastAsia"/>
           <w:highlight w:val="none"/>
         </w:rPr>
-        <w:t xml:space="preserve">The external analyses sharpen the construct boundary. SEARCH assessed generalised problematic internet and digital-media use through the CIAS-R, whereas MCS measured hours of </w:t>
-      </w:r>
-      <w:r>
-        <w:rPr>
-          <w:rFonts w:hint="eastAsia" w:eastAsia="宋体"/>
-          <w:highlight w:val="none"/>
-          <w:lang w:eastAsia="zh-CN"/>
-        </w:rPr>
-        <w:t>social media use</w:t>
-      </w:r>
-      <w:r>
-        <w:rPr>
-          <w:rFonts w:hint="eastAsia"/>
-          <w:highlight w:val="none"/>
-        </w:rPr>
-        <w:t xml:space="preserve"> and gaming, and the Global Mind Project used social-media frequency. These measures provide construct-level convergence across related forms of digital use without implying instrument-level replication.</w:t>
-      </w:r>
-      <w:r>
-        <w:rPr>
-          <w:rFonts w:hint="eastAsia" w:eastAsia="宋体"/>
-          <w:highlight w:val="none"/>
-          <w:lang w:val="en-US" w:eastAsia="zh-CN"/>
-        </w:rPr>
-        <w:t xml:space="preserve"> </w:t>
-      </w:r>
-      <w:r>
-        <w:rPr>
-          <w:rFonts w:hint="eastAsia"/>
-          <w:highlight w:val="none"/>
-        </w:rPr>
-        <w:t xml:space="preserve">The MCS variables provided the longitudinal exposure-based comparison: both </w:t>
-      </w:r>
-      <w:r>
-        <w:rPr>
-          <w:rFonts w:hint="eastAsia" w:eastAsia="宋体"/>
-          <w:highlight w:val="none"/>
-          <w:lang w:eastAsia="zh-CN"/>
-        </w:rPr>
-        <w:t>social media use</w:t>
-      </w:r>
-      <w:r>
-        <w:rPr>
-          <w:rFonts w:hint="eastAsia"/>
-          <w:highlight w:val="none"/>
-        </w:rPr>
-        <w:t xml:space="preserve"> and gaming occupied net sink positions. The Global Mind Project provided a pooled multinational cross-sectional comparison: emotion had the highest network strength, whereas social-media frequency had the lowest. These findings distinguish impairment-oriented problematic use from exposure-oriented frequency: screen-related measures did not occupy leading CLPN net source positions and had relatively low cross-sectional network strength in GMP.</w:t>
+        <w:t>The exploratory Bayesian analysis provided an auxiliary within-sample comparison. DASS and ISI shared the highest Bayesian net out-degree, but all skeleton edges were reversible in the CPDAG; the analysis therefore did not independently validate the longitudinal directions.</w:t>
       </w:r>
     </w:p>
     <w:p>
@@ -2450,7 +2442,22 @@
           <w:rFonts w:hint="eastAsia"/>
           <w:highlight w:val="none"/>
         </w:rPr>
-        <w:t>. Linkage retained 6,092 of 10,356 baseline participants, and the retained sample had lower baseline symptom burden, which may attenuate or alter longitudinal estimates. The broad SDQ domain included emotional, conduct, hyperactivity, peer and reverse-scored prosocial items; DASS→SDQ paths therefore represent prediction of broad difficulties rather than conduct-specific change and partly span overlapping affective content. Diet response options changed between waves; wave-standardised domain scores and a five-domain sensitivity analysis addressed this change. MCS used different internalising instruments at ages 14 and 17, precluding scale-level invariance testing. Finally, the pooled Global Mind Project analysis does not estimate country-specific networks and remains cross-sectional.</w:t>
+        <w:t>. Linkage retained 6,092 of 10,356 baseline participants, and the retained sample had lower baseline symptom burden, which may attenuate or alter longitudinal estimates. The broad SDQ domain included emotional, conduct, hyperactivity/inattention, peer and prosocial items, with items 7, 11, 14, 21 and 25 reverse-scored; DASS→SDQ paths therefore represent prediction of broad difficulties rather than conduct-specific change and partly span overlapping affective content. Diet response options changed between waves. Diet scores were standardised within wave, and a sensitivity analysis omitted the diet domain. MCS used different internalising instruments at ages 14 and 17, precluding scale-level invariance testing. The MCS estimates describe multivariable prospective ordering within the linked complete-case sample.</w:t>
+      </w:r>
+      <w:r>
+        <w:rPr>
+          <w:rFonts w:hint="eastAsia" w:eastAsia="宋体"/>
+          <w:highlight w:val="none"/>
+          <w:lang w:val="en-US" w:eastAsia="zh-CN"/>
+        </w:rPr>
+        <w:t xml:space="preserve"> </w:t>
+      </w:r>
+      <w:r>
+        <w:rPr>
+          <w:rFonts w:hint="eastAsia"/>
+          <w:highlight w:val="none"/>
+        </w:rPr>
+        <w:t>Finally, the pooled Global Mind Project analysis does not estimate country-specific networks and remains cross-sectional.</w:t>
       </w:r>
     </w:p>
     <w:p>
@@ -2464,7 +2471,7 @@
           <w:rFonts w:hint="eastAsia"/>
           <w:highlight w:val="none"/>
         </w:rPr>
-        <w:t xml:space="preserve">The evidence supports a predictive reframing of adolescent digital-use research. Screen-related measures remained outside the leading CLPN net source positions: problematic digital use showed no significant net directionality in SEARCH, while </w:t>
+        <w:t xml:space="preserve">The evidence supports a predictive reframing of adolescent digital-use research. Screen-related measures remained outside the leading CLPN net source positions. Problematic digital use showed no significant CLPN net directionality in SEARCH; </w:t>
       </w:r>
       <w:r>
         <w:rPr>
@@ -2472,14 +2479,14 @@
           <w:highlight w:val="none"/>
           <w:lang w:eastAsia="zh-CN"/>
         </w:rPr>
-        <w:t>social media use</w:t>
+        <w:t>social media</w:t>
       </w:r>
       <w:r>
         <w:rPr>
           <w:rFonts w:hint="eastAsia"/>
           <w:highlight w:val="none"/>
         </w:rPr>
-        <w:t xml:space="preserve"> and gaming occupied net sink positions in MCS. Emotional distress occupied the strongest net source position in SEARCH, while internalising and externalising difficulties occupied net source positions in MCS. Static network control identified a different set of topological features. Together, these findings position screen-related behaviours within the broader psychological context of adolescent mental health and support integrated assessment of digital engagement alongside emotional and behavioural difficulties.</w:t>
+        <w:t xml:space="preserve"> use and gaming occupied CLPN net sink positions in MCS. Emotional distress occupied the leading CLPN net source position in SEARCH. Internalising and externalising difficulties occupied CLPN net source positions in MCS. Static structural-control analysis identified a different set of topological features. These findings position screen-related behaviours within the broader psychological context of adolescent mental health and support integrated assessment of digital engagement alongside emotional and behavioural difficulties.</w:t>
       </w:r>
     </w:p>
     <w:p>
@@ -2584,7 +2591,7 @@
           <w:rFonts w:hint="eastAsia"/>
           <w:highlight w:val="none"/>
         </w:rPr>
-        <w:t>The follow-up wave used in the longitudinal analysis (Wave 3) was exported in April 2024, approximately one year after baseline.</w:t>
+        <w:t>The Wave 3 assessments were collected between 18 October and 13 December 2023. Among the 6,092 linked participants, the median interval between Wave 1 and Wave 3 was 336 days (IQR, 311–360; range, 247–414 days).</w:t>
       </w:r>
       <w:r>
         <w:rPr>
@@ -2722,67 +2729,32 @@
       </w:pPr>
       <w:r>
         <w:rPr>
-          <w:highlight w:val="none"/>
-        </w:rPr>
-        <w:t xml:space="preserve">Nine items were excluded before item-level network estimation. </w:t>
-      </w:r>
-      <w:r>
-        <w:rPr>
-          <w:rFonts w:hint="eastAsia"/>
-          <w:highlight w:val="none"/>
-        </w:rPr>
-        <w:t>The six SDQ impact-supplement items (items 26–31) were excluded because they assess the duration, distress and functional impact of overall difficulties and do not represent individual symptoms.</w:t>
-      </w:r>
-      <w:r>
-        <w:rPr>
-          <w:highlight w:val="none"/>
-        </w:rPr>
-        <w:t xml:space="preserve"> DIET item 3 was a multiple-response item and was not comparable with scalar items. </w:t>
-      </w:r>
-      <w:r>
-        <w:rPr>
-          <w:rFonts w:hint="eastAsia"/>
-          <w:highlight w:val="none"/>
-        </w:rPr>
-        <w:t>ACT items 5 and 6 assessed recreational screen time and were excluded from the physical-activity domain.</w:t>
-      </w:r>
-      <w:r>
-        <w:rPr>
-          <w:highlight w:val="none"/>
-        </w:rPr>
-        <w:t xml:space="preserve"> </w:t>
-      </w:r>
-      <w:r>
-        <w:rPr>
-          <w:rFonts w:hint="eastAsia"/>
-          <w:highlight w:val="none"/>
-        </w:rPr>
-        <w:t>After these exclusions, the final baseline network contained 104 items</w:t>
-      </w:r>
-      <w:r>
-        <w:rPr>
-          <w:highlight w:val="none"/>
-        </w:rPr>
-        <w:t xml:space="preserve">: 26 CIAS-R, 21 DASS-21, 25 SDQ, 7 ISI, 21 DIET and 4 ACT items. SDQ items 7, 11, 14, 21 and 25 were reverse-scored so that higher values indicated greater difficulty. </w:t>
-      </w:r>
-      <w:r>
-        <w:rPr>
-          <w:rFonts w:hint="eastAsia"/>
-          <w:highlight w:val="none"/>
-        </w:rPr>
-        <w:t>Because all 25 core SDQ items were retained, including emotional and reverse-scored prosocial content, we describe this domain as broad SDQ difficulties.</w:t>
-      </w:r>
-      <w:r>
-        <w:rPr>
           <w:rFonts w:hint="eastAsia" w:eastAsia="宋体"/>
           <w:highlight w:val="none"/>
           <w:lang w:val="en-US" w:eastAsia="zh-CN"/>
         </w:rPr>
-        <w:t xml:space="preserve"> The CIAS-R, DASS-21, SDQ and ISI have established psychometric properties.</w:t>
+        <w:t>Nine items were excluded before item-level network estimation. The six SDQ impact-supplement items (items 26–31) were excluded because they assess the duration, distress and functional impact of overall difficulties and do not represent individual symptoms. DIET item 3 was a multiple-response item and was not comparable with scalar items. ACT items 5 and 6 assessed recreational screen time and were excluded from the physical-activity domain. After these exclusions, the final baseline network contained 104 items: 26 CIAS-R, 21 DASS-21, 25 SDQ, 7 ISI, 21 DIET and 4 ACT items.</w:t>
       </w:r>
     </w:p>
     <w:p>
       <w:pPr>
+        <w:rPr>
+          <w:rFonts w:hint="eastAsia" w:eastAsia="宋体"/>
+          <w:highlight w:val="none"/>
+          <w:lang w:val="en-US" w:eastAsia="zh-CN"/>
+        </w:rPr>
+      </w:pPr>
+      <w:r>
+        <w:rPr>
+          <w:rFonts w:hint="eastAsia" w:eastAsia="宋体"/>
+          <w:highlight w:val="none"/>
+          <w:lang w:val="en-US" w:eastAsia="zh-CN"/>
+        </w:rPr>
+        <w:t xml:space="preserve">The same 25-item SDQ was administered at both waves. All 25 core items were retained for the item-level network. Items 7, 11, 14, 21 and 25 were reverse-scored, whereas the five prosocial items (items 1, 4, 9, 17 and 20) were retained in their original prosocial direction. For the longitudinal analysis, each item was standardised within wave and the 25 standardised item scores were averaged to form a study-specific 25-item SDQ core-item composite representing the broad-difficulties domain. This composite is not equivalent to the standard 20-item SDQ total difficulties score, and higher values should not be interpreted uniformly as greater difficulties. The CIAS-R, DASS-21 and ISI have established psychometric properties. </w:t>
+      </w:r>
+    </w:p>
+    <w:p>
+      <w:pPr>
         <w:pStyle w:val="5"/>
         <w:keepNext/>
         <w:rPr>
@@ -2832,7 +2804,20 @@
         <w:rPr>
           <w:highlight w:val="none"/>
         </w:rPr>
-        <w:t xml:space="preserve"> Each domain score was z-standardised within wave. Cross-wave correlations were 0.58 for CIAS-R, 0.63 for DASS, 0.43 for SDQ, 0.34 for diet, 0.57 for ISI and 0.31 for physical activity. Baseline differences between linked and unlinked participants were quantified with standardised mean differences.</w:t>
+        <w:t xml:space="preserve"> </w:t>
+      </w:r>
+      <w:r>
+        <w:rPr>
+          <w:rFonts w:hint="eastAsia"/>
+          <w:highlight w:val="none"/>
+        </w:rPr>
+        <w:t>Within each wave, item scores were z-standardised and averaged within each of the six domains. The resulting domain scores were then z-standardised within wave for CLPN estimation.</w:t>
+      </w:r>
+      <w:r>
+        <w:rPr>
+          <w:highlight w:val="none"/>
+        </w:rPr>
+        <w:t xml:space="preserve"> Cross-wave correlations were 0.58 for CIAS-R, 0.63 for DASS, 0.43 for SDQ, 0.34 for diet, 0.57 for ISI and 0.31 for physical activity. Baseline differences between linked and unlinked participants were quantified with standardised mean differences.</w:t>
       </w:r>
     </w:p>
     <w:p>
@@ -2941,21 +2926,7 @@
           <w:rFonts w:hint="eastAsia"/>
           <w:highlight w:val="none"/>
         </w:rPr>
-        <w:t>Positive values indicate a net source position and negative values a net sink position. Because the calculation uses absolute coefficients, both positive and negative cross-lagged paths contribute to net directionality.</w:t>
-      </w:r>
-      <w:r>
-        <w:rPr>
-          <w:rFonts w:hint="eastAsia" w:eastAsia="宋体"/>
-          <w:highlight w:val="none"/>
-          <w:lang w:val="en-US" w:eastAsia="zh-CN"/>
-        </w:rPr>
-        <w:t xml:space="preserve"> </w:t>
-      </w:r>
-      <w:r>
-        <w:rPr>
-          <w:highlight w:val="none"/>
-        </w:rPr>
-        <w:t>Percentile 95% confidence intervals were estimated with 1,000 nonparametric bootstrap resamples.</w:t>
+        <w:t>Positive values indicate a CLPN net source position, and negative values indicate a CLPN net sink position. Both positive and negative cross-lagged paths contribute to CLPN net directionality because the calculation uses absolute coefficients.</w:t>
       </w:r>
     </w:p>
     <w:p>
@@ -2968,38 +2939,11 @@
       </w:pPr>
       <w:r>
         <w:rPr>
-          <w:highlight w:val="none"/>
-        </w:rPr>
-        <w:t>Sensitivity analyses recalculated directionality using only Bonferroni-significant paths, adjusted the regressions for age, sex and grade</w:t>
-      </w:r>
-      <w:r>
-        <w:rPr>
           <w:rFonts w:hint="eastAsia" w:eastAsia="宋体"/>
           <w:highlight w:val="none"/>
           <w:lang w:val="en-US" w:eastAsia="zh-CN"/>
         </w:rPr>
-        <w:t xml:space="preserve"> </w:t>
-      </w:r>
-      <w:r>
-        <w:rPr>
-          <w:highlight w:val="none"/>
-        </w:rPr>
-        <w:t xml:space="preserve">and fitted a five-domain model excluding diet. </w:t>
-      </w:r>
-      <w:r>
-        <w:rPr>
-          <w:rFonts w:hint="eastAsia"/>
-          <w:highlight w:val="none"/>
-        </w:rPr>
-        <w:t>These analyses tested the robustness of the net source–sink ranking and directionality sign under alternative specifications.</w:t>
-      </w:r>
-      <w:r>
-        <w:rPr>
-          <w:rFonts w:hint="eastAsia" w:eastAsia="宋体"/>
-          <w:highlight w:val="none"/>
-          <w:lang w:val="en-US" w:eastAsia="zh-CN"/>
-        </w:rPr>
-        <w:t xml:space="preserve"> </w:t>
+        <w:t>Sensitivity analyses recalculated CLPN net directionality using only Bonferroni-significant cross-domain paths, adjusted the regressions for age, sex and grade, and fitted a five-domain model excluding diet. These analyses assessed the stability of CLPN net source and CLPN net sink positions across alternative specifications. School-cluster-robust inference was also calculated for all 30 cross-domain paths using CR1 standard errors clustered by the 10 baseline schools. Two-sided P values and 95% confidence intervals used a t distribution with 9 degrees of freedom, with Bonferroni correction across the 30 paths.</w:t>
       </w:r>
     </w:p>
     <w:p>
@@ -3093,7 +3037,44 @@
         <w:rPr>
           <w:highlight w:val="none"/>
         </w:rPr>
-        <w:t xml:space="preserve"> were obtained under licence from the UK Data Service. De-identified family and cohort-member identifiers linked 9,520 adolescents across sweeps. Six nodes were available at both ages: self-reported </w:t>
+        <w:t xml:space="preserve"> were obtained under licence from the UK Data Service. De-identified family and cohort-member identifiers linked 9,520 adolescents across sweeps. </w:t>
+      </w:r>
+      <w:r>
+        <w:rPr>
+          <w:rFonts w:hint="eastAsia"/>
+          <w:highlight w:val="none"/>
+        </w:rPr>
+        <w:t>Six constructs were available at both ages: self-reported internalising distress, assessed with the 13-item Short Mood and Feelings Questionnaire at age 14</w:t>
+      </w:r>
+      <w:r>
+        <w:rPr>
+          <w:rFonts w:hint="eastAsia"/>
+          <w:highlight w:val="none"/>
+          <w:vertAlign w:val="superscript"/>
+        </w:rPr>
+        <w:t>48</w:t>
+      </w:r>
+      <w:r>
+        <w:rPr>
+          <w:rFonts w:hint="eastAsia"/>
+          <w:highlight w:val="none"/>
+        </w:rPr>
+        <w:t xml:space="preserve"> and the Kessler K6 at age 17</w:t>
+      </w:r>
+      <w:r>
+        <w:rPr>
+          <w:rFonts w:hint="eastAsia"/>
+          <w:highlight w:val="none"/>
+          <w:vertAlign w:val="superscript"/>
+        </w:rPr>
+        <w:t>49</w:t>
+      </w:r>
+      <w:r>
+        <w:rPr>
+          <w:rFonts w:hint="eastAsia"/>
+          <w:highlight w:val="none"/>
+        </w:rPr>
+        <w:t xml:space="preserve">; parent-reported SDQ conduct problems, hyperactivity/inattention and peer problems; and self-reported hours of </w:t>
       </w:r>
       <w:r>
         <w:rPr>
@@ -3101,13 +3082,77 @@
           <w:highlight w:val="none"/>
           <w:lang w:eastAsia="zh-CN"/>
         </w:rPr>
-        <w:t>internalising</w:t>
-      </w:r>
-      <w:r>
-        <w:rPr>
-          <w:highlight w:val="none"/>
-        </w:rPr>
-        <w:t xml:space="preserve"> distress, assessed with the 13-item Short Mood and Feelings Questionnaire at age 14</w:t>
+        <w:t>social media</w:t>
+      </w:r>
+      <w:r>
+        <w:rPr>
+          <w:rFonts w:hint="eastAsia"/>
+          <w:highlight w:val="none"/>
+        </w:rPr>
+        <w:t xml:space="preserve"> use and electronic gaming. Scores were z-standardised within wave.</w:t>
+      </w:r>
+    </w:p>
+    <w:p>
+      <w:pPr>
+        <w:rPr>
+          <w:highlight w:val="none"/>
+        </w:rPr>
+      </w:pPr>
+      <w:r>
+        <w:rPr>
+          <w:rFonts w:hint="eastAsia"/>
+          <w:highlight w:val="none"/>
+        </w:rPr>
+        <w:t>The MCS CLPN included the six constructs available at both sweeps and used the regression and CLPN net directionality definition specified for SEARCH. Each age-17 construct was regressed on all six age-14 constructs, and 95% confidence intervals for CLPN net directionality were estimated using 500 nonparametric bootstrap resamples. The analysis estimated multivariable prospective associations among 7,838 participants with complete data; no additional demographic covariates, survey weights or complex-design corrections were applied. Because internalising distress was assessed using different instruments at ages 14 and 17, this node was interpreted at the construct level.</w:t>
+      </w:r>
+    </w:p>
+    <w:p>
+      <w:pPr>
+        <w:pStyle w:val="5"/>
+        <w:keepNext/>
+        <w:rPr>
+          <w:highlight w:val="none"/>
+        </w:rPr>
+      </w:pPr>
+      <w:r>
+        <w:rPr>
+          <w:highlight w:val="none"/>
+        </w:rPr>
+        <w:t>Baseline SEARCH network reconstruction</w:t>
+      </w:r>
+    </w:p>
+    <w:p>
+      <w:pPr>
+        <w:rPr>
+          <w:highlight w:val="none"/>
+        </w:rPr>
+      </w:pPr>
+      <w:r>
+        <w:rPr>
+          <w:highlight w:val="none"/>
+        </w:rPr>
+        <w:t xml:space="preserve">Item responses were transformed to normal marginals with a nonparanormal Gaussian-copula transformation. A Gaussian graphical model was estimated with graphical </w:t>
+      </w:r>
+      <w:r>
+        <w:rPr>
+          <w:rFonts w:hint="eastAsia" w:eastAsia="宋体"/>
+          <w:highlight w:val="none"/>
+          <w:lang w:val="en-US" w:eastAsia="zh-CN"/>
+        </w:rPr>
+        <w:t>l</w:t>
+      </w:r>
+      <w:r>
+        <w:rPr>
+          <w:highlight w:val="none"/>
+        </w:rPr>
+        <w:t>asso</w:t>
+      </w:r>
+      <w:r>
+        <w:rPr>
+          <w:highlight w:val="none"/>
+          <w:vertAlign w:val="superscript"/>
+        </w:rPr>
+        <w:t>18,</w:t>
       </w:r>
       <w:r>
         <w:rPr>
@@ -3116,13 +3161,83 @@
           <w:vertAlign w:val="superscript"/>
           <w:lang w:val="en-US" w:eastAsia="zh-CN"/>
         </w:rPr>
-        <w:t>48</w:t>
-      </w:r>
-      <w:r>
-        <w:rPr>
-          <w:highlight w:val="none"/>
-        </w:rPr>
-        <w:t xml:space="preserve"> and the Kessler K6 at age 17</w:t>
+        <w:t xml:space="preserve"> </w:t>
+      </w:r>
+      <w:r>
+        <w:rPr>
+          <w:highlight w:val="none"/>
+          <w:vertAlign w:val="superscript"/>
+        </w:rPr>
+        <w:t>19</w:t>
+      </w:r>
+      <w:r>
+        <w:rPr>
+          <w:highlight w:val="none"/>
+        </w:rPr>
+        <w:t>. The regularisation parameter was selected by l</w:t>
+      </w:r>
+      <w:r>
+        <w:rPr>
+          <w:rFonts w:hint="eastAsia"/>
+          <w:highlight w:val="none"/>
+        </w:rPr>
+        <w:t>ikelihood-based fivefold cross-validation</w:t>
+      </w:r>
+      <w:r>
+        <w:rPr>
+          <w:highlight w:val="none"/>
+        </w:rPr>
+        <w:t xml:space="preserve"> over a 100-point geometric grid from lambda-max = 0.824 to 1% of that value, yielding lambda = 0.0581. Partial correlations were derived from the precision matrix. Cross-sectional network reporting followed current methodological standards</w:t>
+      </w:r>
+      <w:r>
+        <w:rPr>
+          <w:highlight w:val="none"/>
+          <w:vertAlign w:val="superscript"/>
+        </w:rPr>
+        <w:t>23</w:t>
+      </w:r>
+      <w:r>
+        <w:rPr>
+          <w:highlight w:val="none"/>
+        </w:rPr>
+        <w:t>.</w:t>
+      </w:r>
+    </w:p>
+    <w:p>
+      <w:pPr>
+        <w:pStyle w:val="5"/>
+        <w:keepNext/>
+        <w:rPr>
+          <w:highlight w:val="none"/>
+        </w:rPr>
+      </w:pPr>
+      <w:r>
+        <w:rPr>
+          <w:highlight w:val="none"/>
+        </w:rPr>
+        <w:t>Structural-control and robustness analyses</w:t>
+      </w:r>
+    </w:p>
+    <w:p>
+      <w:pPr>
+        <w:rPr>
+          <w:highlight w:val="none"/>
+        </w:rPr>
+      </w:pPr>
+      <w:r>
+        <w:rPr>
+          <w:rFonts w:hint="eastAsia" w:eastAsia="宋体"/>
+          <w:highlight w:val="none"/>
+          <w:lang w:eastAsia="zh-CN"/>
+        </w:rPr>
+        <w:t>MDS solutions were enumerated exhaustively for the primary cross-validated network. For the sensitivity networks, control frequencies were estimated from 60 randomised optimal MDS solutions</w:t>
+      </w:r>
+      <w:r>
+        <w:rPr>
+          <w:highlight w:val="none"/>
+          <w:vertAlign w:val="superscript"/>
+        </w:rPr>
+        <w:t>20,</w:t>
       </w:r>
       <w:r>
         <w:rPr>
@@ -3131,27 +3246,54 @@
           <w:vertAlign w:val="superscript"/>
           <w:lang w:val="en-US" w:eastAsia="zh-CN"/>
         </w:rPr>
-        <w:t>49</w:t>
-      </w:r>
-      <w:r>
-        <w:rPr>
-          <w:highlight w:val="none"/>
-        </w:rPr>
-        <w:t xml:space="preserve">; SDQ conduct, hyperactivity/inattention and peer-problem subscales; self-reported hours of </w:t>
+        <w:t xml:space="preserve"> </w:t>
+      </w:r>
+      <w:r>
+        <w:rPr>
+          <w:highlight w:val="none"/>
+          <w:vertAlign w:val="superscript"/>
+        </w:rPr>
+        <w:t>21</w:t>
+      </w:r>
+      <w:r>
+        <w:rPr>
+          <w:highlight w:val="none"/>
+        </w:rPr>
+        <w:t xml:space="preserve">. A dominating set is a group of nodes such that every node in the graph either belongs to the set or is adjacent to a member. Control frequency was defined as the proportion of </w:t>
+      </w:r>
+      <w:r>
+        <w:rPr>
+          <w:rFonts w:hint="eastAsia"/>
+          <w:highlight w:val="none"/>
+        </w:rPr>
+        <w:t>MDS solutions</w:t>
+      </w:r>
+      <w:r>
+        <w:rPr>
+          <w:highlight w:val="none"/>
+        </w:rPr>
+        <w:t xml:space="preserve"> containing a node. The module control network summarised inter-module structural coverage using average module control strength</w:t>
       </w:r>
       <w:r>
         <w:rPr>
           <w:rFonts w:hint="eastAsia" w:eastAsia="宋体"/>
           <w:highlight w:val="none"/>
-          <w:lang w:eastAsia="zh-CN"/>
-        </w:rPr>
-        <w:t>social media use</w:t>
-      </w:r>
-      <w:r>
-        <w:rPr>
-          <w:highlight w:val="none"/>
-        </w:rPr>
-        <w:t>; and self-reported hours of electronic gaming. Scores were z-standardised within wave.</w:t>
+          <w:lang w:val="en-US" w:eastAsia="zh-CN"/>
+        </w:rPr>
+        <w:t xml:space="preserve"> (AMCS)</w:t>
+      </w:r>
+      <w:r>
+        <w:rPr>
+          <w:highlight w:val="none"/>
+          <w:vertAlign w:val="superscript"/>
+        </w:rPr>
+        <w:t>22</w:t>
+      </w:r>
+      <w:r>
+        <w:rPr>
+          <w:highlight w:val="none"/>
+        </w:rPr>
+        <w:t>. These quantities refer to the topology of the estimated undirected graph; they do not represent intervention effects, dynamical controllability or temporal precedence.</w:t>
       </w:r>
     </w:p>
     <w:p>
@@ -3162,14 +3304,131 @@
       </w:pPr>
       <w:r>
         <w:rPr>
-          <w:rFonts w:hint="eastAsia"/>
-          <w:highlight w:val="none"/>
-        </w:rPr>
-        <w:t>The MCS CLPN used the six constructs available at both sweeps and followed the same regression specification and net-directionality definition as SEARCH, with 500 nonparametric bootstrap resamples. The complete-case analysis included 7,838 participants. Because internalising distress was measured using different instruments at ages 14 and 17, this node was interpreted at the construct level.</w:t>
+          <w:highlight w:val="none"/>
+        </w:rPr>
+        <w:t>To separate minimum-set size from node identity, 500 degree-preserving null networks were generated by double-edge-swap randomisation and each node's observed control frequency was compared with its node-specific null domination frequency. Estimator sensitivity was examined with EBIC graphical</w:t>
+      </w:r>
+      <w:r>
+        <w:rPr>
+          <w:rFonts w:hint="eastAsia" w:eastAsia="宋体"/>
+          <w:highlight w:val="none"/>
+          <w:lang w:val="en-US" w:eastAsia="zh-CN"/>
+        </w:rPr>
+        <w:t xml:space="preserve"> l</w:t>
+      </w:r>
+      <w:r>
+        <w:rPr>
+          <w:highlight w:val="none"/>
+        </w:rPr>
+        <w:t>asso networks at gamma values of 0, 0.25 and 0.5, the primary cross-validated network, and a positive-edges-only version. Six community-detection algorithms (Louvain, Leiden, Walktrap, Spinglass, Fast-Greedy and Infomap) were compared with the six prespecified domains using adjusted Rand index and normalised mutual information</w:t>
+      </w:r>
+      <w:r>
+        <w:rPr>
+          <w:rFonts w:hint="eastAsia" w:eastAsia="宋体"/>
+          <w:highlight w:val="none"/>
+          <w:vertAlign w:val="superscript"/>
+          <w:lang w:val="en-US" w:eastAsia="zh-CN"/>
+        </w:rPr>
+        <w:t>31</w:t>
+      </w:r>
+      <w:r>
+        <w:rPr>
+          <w:highlight w:val="none"/>
+        </w:rPr>
+        <w:t>. Community assignments were also compared across waves.</w:t>
       </w:r>
     </w:p>
     <w:p>
       <w:pPr>
+        <w:rPr>
+          <w:rFonts w:hint="eastAsia" w:eastAsia="宋体"/>
+          <w:highlight w:val="none"/>
+          <w:lang w:val="en-US" w:eastAsia="zh-CN"/>
+        </w:rPr>
+      </w:pPr>
+      <w:r>
+        <w:rPr>
+          <w:highlight w:val="none"/>
+        </w:rPr>
+        <w:t>We additionally calculated node strength, closeness, betweenness, eigenvector centrality, signed expected influence, bridge strength, bridge expected influence, bridge betweenness, participation coefficient, average controllability, modal controllability and control energy</w:t>
+      </w:r>
+      <w:r>
+        <w:rPr>
+          <w:rFonts w:hint="eastAsia" w:eastAsia="宋体"/>
+          <w:highlight w:val="none"/>
+          <w:vertAlign w:val="superscript"/>
+          <w:lang w:val="en-US" w:eastAsia="zh-CN"/>
+        </w:rPr>
+        <w:t>32</w:t>
+      </w:r>
+      <w:r>
+        <w:rPr>
+          <w:highlight w:val="none"/>
+        </w:rPr>
+        <w:t xml:space="preserve">. </w:t>
+      </w:r>
+      <w:r>
+        <w:rPr>
+          <w:rFonts w:hint="eastAsia"/>
+          <w:highlight w:val="none"/>
+        </w:rPr>
+        <w:t>Average and modal controllability, together with the control energy associated with state transitions in the ISI and ACT modules, were derived from the discrete-time linear controllability Gramian applied to the absolute-weight adjacency matrix.</w:t>
+      </w:r>
+      <w:r>
+        <w:rPr>
+          <w:rFonts w:hint="eastAsia" w:eastAsia="宋体"/>
+          <w:highlight w:val="none"/>
+          <w:lang w:val="en-US" w:eastAsia="zh-CN"/>
+        </w:rPr>
+        <w:t xml:space="preserve"> </w:t>
+      </w:r>
+      <w:r>
+        <w:rPr>
+          <w:highlight w:val="none"/>
+        </w:rPr>
+        <w:t xml:space="preserve">Spearman correlations and principal-component analysis assessed overlap among node metrics. Node-knockout analyses and sustained nonlinear propagation simulations were retained as supplementary robustness analyses. The propagation model applied a hyperbolic-tangent activation with gain g = 0.9 to the </w:t>
+      </w:r>
+      <w:r>
+        <w:rPr>
+          <w:rFonts w:hint="eastAsia"/>
+          <w:highlight w:val="none"/>
+        </w:rPr>
+        <w:t>spectrally normalised absolute adjacency matrix</w:t>
+      </w:r>
+      <w:r>
+        <w:rPr>
+          <w:highlight w:val="none"/>
+        </w:rPr>
+        <w:t xml:space="preserve"> under sustained module input.</w:t>
+      </w:r>
+      <w:r>
+        <w:rPr>
+          <w:rFonts w:hint="eastAsia" w:eastAsia="宋体"/>
+          <w:highlight w:val="none"/>
+          <w:lang w:val="en-US" w:eastAsia="zh-CN"/>
+        </w:rPr>
+        <w:t xml:space="preserve"> Group-level network structures were compared using a permutation-based network comparison test</w:t>
+      </w:r>
+      <w:r>
+        <w:rPr>
+          <w:rFonts w:hint="eastAsia" w:eastAsia="宋体"/>
+          <w:highlight w:val="none"/>
+          <w:vertAlign w:val="superscript"/>
+          <w:lang w:val="en-US" w:eastAsia="zh-CN"/>
+        </w:rPr>
+        <w:t>50</w:t>
+      </w:r>
+      <w:r>
+        <w:rPr>
+          <w:rFonts w:hint="eastAsia" w:eastAsia="宋体"/>
+          <w:highlight w:val="none"/>
+          <w:lang w:val="en-US" w:eastAsia="zh-CN"/>
+        </w:rPr>
+        <w:t>.</w:t>
+      </w:r>
+    </w:p>
+    <w:p>
+      <w:pPr>
         <w:pStyle w:val="5"/>
         <w:keepNext/>
         <w:rPr>
@@ -3180,41 +3439,72 @@
         <w:rPr>
           <w:highlight w:val="none"/>
         </w:rPr>
-        <w:t>Baseline SEARCH network reconstruction</w:t>
+        <w:t>Exploratory Bayesian graph</w:t>
       </w:r>
     </w:p>
     <w:p>
       <w:pPr>
         <w:rPr>
-          <w:highlight w:val="none"/>
-        </w:rPr>
-      </w:pPr>
-      <w:r>
-        <w:rPr>
-          <w:highlight w:val="none"/>
-        </w:rPr>
-        <w:t xml:space="preserve">Item responses were transformed to normal marginals with a nonparanormal Gaussian-copula transformation. A Gaussian graphical model was estimated with graphical </w:t>
-      </w:r>
-      <w:r>
-        <w:rPr>
           <w:rFonts w:hint="eastAsia" w:eastAsia="宋体"/>
           <w:highlight w:val="none"/>
           <w:lang w:val="en-US" w:eastAsia="zh-CN"/>
         </w:rPr>
-        <w:t>l</w:t>
-      </w:r>
-      <w:r>
-        <w:rPr>
-          <w:highlight w:val="none"/>
-        </w:rPr>
-        <w:t>asso</w:t>
-      </w:r>
-      <w:r>
-        <w:rPr>
-          <w:highlight w:val="none"/>
-          <w:vertAlign w:val="superscript"/>
-        </w:rPr>
-        <w:t>18,</w:t>
+      </w:pPr>
+      <w:r>
+        <w:rPr>
+          <w:rFonts w:hint="eastAsia"/>
+          <w:highlight w:val="none"/>
+        </w:rPr>
+        <w:t>The six baseline domain scores of the 6,092 longitudinally matched SEARCH participants</w:t>
+      </w:r>
+      <w:r>
+        <w:rPr>
+          <w:highlight w:val="none"/>
+        </w:rPr>
+        <w:t xml:space="preserve"> were discretised into tertiles and a directed acyclic graph was learned by hill-climb search with the Bayesian information criterion in pgmpy. Directed-edge stability was estimated across 200 bootstrap resamples. We also examined the completed partially directed acyclic graph, a continuous Gaussian Bayesian network and leave-one-domain-out correlations. </w:t>
+      </w:r>
+      <w:r>
+        <w:rPr>
+          <w:rFonts w:hint="eastAsia"/>
+          <w:highlight w:val="none"/>
+        </w:rPr>
+        <w:t>Because observational Bayesian graphs identify an equivalence class and may be affected by unmeasured confounding, this analysis was interpreted as an exploratory comparison with CLPN ordering rather than causal identification.</w:t>
+      </w:r>
+      <w:r>
+        <w:rPr>
+          <w:rFonts w:hint="eastAsia" w:eastAsia="宋体"/>
+          <w:highlight w:val="none"/>
+          <w:lang w:val="en-US" w:eastAsia="zh-CN"/>
+        </w:rPr>
+        <w:t xml:space="preserve"> Agreement between Bayesian net out-degree and CLPN net directionality was assessed across six paired domain-level estimates using Pearson and Spearman correlations. The exact two-sided permutation test enumerated all 720 permutations and compared absolute Pearson correlations. The percentile 95% confidence interval for Pearson r was calculated from 5,000 attempted paired bootstrap resamples, excluding resamples with undefined correlations.</w:t>
+      </w:r>
+    </w:p>
+    <w:p>
+      <w:pPr>
+        <w:pStyle w:val="5"/>
+        <w:keepNext/>
+        <w:rPr>
+          <w:highlight w:val="none"/>
+        </w:rPr>
+      </w:pPr>
+      <w:r>
+        <w:rPr>
+          <w:highlight w:val="none"/>
+        </w:rPr>
+        <w:t>Global Mind Project analysis</w:t>
+      </w:r>
+    </w:p>
+    <w:p>
+      <w:pPr>
+        <w:rPr>
+          <w:highlight w:val="none"/>
+        </w:rPr>
+      </w:pPr>
+      <w:r>
+        <w:rPr>
+          <w:highlight w:val="none"/>
+        </w:rPr>
+        <w:t>The Global Mind Project/Mental Health Million dataset contains adult self-report records collected internationally</w:t>
       </w:r>
       <w:r>
         <w:rPr>
@@ -3223,37 +3513,119 @@
           <w:vertAlign w:val="superscript"/>
           <w:lang w:val="en-US" w:eastAsia="zh-CN"/>
         </w:rPr>
-        <w:t xml:space="preserve"> </w:t>
+        <w:t>29</w:t>
       </w:r>
       <w:r>
         <w:rPr>
           <w:highlight w:val="none"/>
           <w:vertAlign w:val="superscript"/>
         </w:rPr>
-        <w:t>19</w:t>
-      </w:r>
-      <w:r>
-        <w:rPr>
-          <w:highlight w:val="none"/>
-        </w:rPr>
-        <w:t>. The regularisation parameter was selected by likelihood-based K-fold cross-validation over a 100-point geometric grid from lambda-max = 0.824 to 1% of that value, yielding lambda = 0.0581. Partial correlations were derived from the precision matrix. Cross-sectional network reporting followed current methodological standards</w:t>
-      </w:r>
-      <w:r>
-        <w:rPr>
+        <w:t>,</w:t>
+      </w:r>
+      <w:r>
+        <w:rPr>
+          <w:rFonts w:hint="eastAsia" w:eastAsia="宋体"/>
           <w:highlight w:val="none"/>
           <w:vertAlign w:val="superscript"/>
-        </w:rPr>
-        <w:t>23</w:t>
-      </w:r>
-      <w:r>
-        <w:rPr>
-          <w:highlight w:val="none"/>
-        </w:rPr>
-        <w:t>.</w:t>
+          <w:lang w:val="en-US" w:eastAsia="zh-CN"/>
+        </w:rPr>
+        <w:t xml:space="preserve"> 30</w:t>
+      </w:r>
+      <w:r>
+        <w:rPr>
+          <w:highlight w:val="none"/>
+        </w:rPr>
+        <w:t xml:space="preserve">. </w:t>
+      </w:r>
+      <w:r>
+        <w:rPr>
+          <w:rFonts w:hint="eastAsia"/>
+          <w:highlight w:val="none"/>
+        </w:rPr>
+        <w:t>We selected participants aged 18–24 years; 147,506 had complete data for six mapped constructs and were included in the pooled multinational analysis.</w:t>
+      </w:r>
+      <w:r>
+        <w:rPr>
+          <w:highlight w:val="none"/>
+        </w:rPr>
+        <w:t xml:space="preserve"> Emotion was represented by fear/anxiety, sadness/hopelessness, mood swings and anger; broad behaviour by restlessness/hyperactivity, aggression and impulsivity; sleep by sleep frequency and quality; diet by ultra-processed food, fruit/vegetable and sugary-food frequency and appetite; activity by exercise frequency; and digital exposure by </w:t>
+      </w:r>
+      <w:r>
+        <w:rPr>
+          <w:rFonts w:hint="eastAsia" w:eastAsia="宋体"/>
+          <w:highlight w:val="none"/>
+          <w:lang w:eastAsia="zh-CN"/>
+        </w:rPr>
+        <w:t>social media</w:t>
+      </w:r>
+      <w:r>
+        <w:rPr>
+          <w:highlight w:val="none"/>
+        </w:rPr>
+        <w:t xml:space="preserve"> frequency.</w:t>
       </w:r>
     </w:p>
     <w:p>
       <w:pPr>
+        <w:rPr>
+          <w:rFonts w:hint="eastAsia"/>
+          <w:highlight w:val="none"/>
+        </w:rPr>
+      </w:pPr>
+      <w:r>
+        <w:rPr>
+          <w:rFonts w:hint="eastAsia"/>
+          <w:highlight w:val="none"/>
+        </w:rPr>
+        <w:t xml:space="preserve">Within each mapped GMP domain, component items were z-standardised and averaged to form a domain score. The six domain scores were transformed to normal marginals, and a Gaussian graphical model was estimated using cross-validated graphical </w:t>
+      </w:r>
+      <w:r>
+        <w:rPr>
+          <w:rFonts w:hint="eastAsia" w:eastAsia="宋体"/>
+          <w:highlight w:val="none"/>
+          <w:lang w:val="en-US" w:eastAsia="zh-CN"/>
+        </w:rPr>
+        <w:t>l</w:t>
+      </w:r>
+      <w:r>
+        <w:rPr>
+          <w:rFonts w:hint="eastAsia"/>
+          <w:highlight w:val="none"/>
+        </w:rPr>
+        <w:t xml:space="preserve">asso. Domain strength was calculated as the sum of absolute partial correlations, with 95% confidence intervals obtained from 300 </w:t>
+      </w:r>
+      <w:r>
+        <w:rPr>
+          <w:rFonts w:hint="eastAsia" w:eastAsia="宋体"/>
+          <w:highlight w:val="none"/>
+          <w:lang w:eastAsia="zh-CN"/>
+        </w:rPr>
+        <w:t>nonparametric</w:t>
+      </w:r>
+      <w:r>
+        <w:rPr>
+          <w:rFonts w:hint="eastAsia"/>
+          <w:highlight w:val="none"/>
+        </w:rPr>
+        <w:t xml:space="preserve"> bootstrap resamples. </w:t>
+      </w:r>
+    </w:p>
+    <w:p>
+      <w:pPr>
+        <w:rPr>
+          <w:highlight w:val="none"/>
+        </w:rPr>
+      </w:pPr>
+      <w:r>
+        <w:rPr>
+          <w:rFonts w:hint="eastAsia"/>
+          <w:highlight w:val="none"/>
+        </w:rPr>
+        <w:t>For the descriptive comparison in Fig. 5b, the 104 baseline SEARCH items were summed within six corresponding domains, and the resulting domain scores were z-standardised. A six-domain partial-correlation network was derived from the inverse correlation matrix, with domain strength calculated in the same way. Strengths were normalised separately within each cohort by dividing each value by the maximum domain strength, so that the strongest domain was assigned a value of 1. This comparison was descriptive and did not test differences between cohorts.</w:t>
+      </w:r>
+    </w:p>
+    <w:p>
+      <w:pPr>
         <w:pStyle w:val="5"/>
         <w:keepNext/>
         <w:rPr>
@@ -3264,7 +3636,7 @@
         <w:rPr>
           <w:highlight w:val="none"/>
         </w:rPr>
-        <w:t>Structural-control and robustness analyses</w:t>
+        <w:t>Statistics and reproducibility</w:t>
       </w:r>
     </w:p>
     <w:p>
@@ -3275,435 +3647,16 @@
       </w:pPr>
       <w:r>
         <w:rPr>
-          <w:rFonts w:hint="eastAsia" w:eastAsia="宋体"/>
-          <w:highlight w:val="none"/>
-          <w:lang w:eastAsia="zh-CN"/>
-        </w:rPr>
-        <w:t>MDS solutions</w:t>
-      </w:r>
-      <w:r>
-        <w:rPr>
-          <w:highlight w:val="none"/>
-        </w:rPr>
-        <w:t xml:space="preserve"> were enumerated exhaustively</w:t>
-      </w:r>
-      <w:r>
-        <w:rPr>
-          <w:highlight w:val="none"/>
-          <w:vertAlign w:val="superscript"/>
-        </w:rPr>
-        <w:t>20,</w:t>
-      </w:r>
-      <w:r>
-        <w:rPr>
-          <w:rFonts w:hint="eastAsia" w:eastAsia="宋体"/>
-          <w:highlight w:val="none"/>
-          <w:vertAlign w:val="superscript"/>
-          <w:lang w:val="en-US" w:eastAsia="zh-CN"/>
-        </w:rPr>
-        <w:t xml:space="preserve"> </w:t>
-      </w:r>
-      <w:r>
-        <w:rPr>
-          <w:highlight w:val="none"/>
-          <w:vertAlign w:val="superscript"/>
-        </w:rPr>
-        <w:t>21</w:t>
-      </w:r>
-      <w:r>
-        <w:rPr>
-          <w:highlight w:val="none"/>
-        </w:rPr>
-        <w:t xml:space="preserve">. A dominating set is a group of nodes such that every node in the graph either belongs to the set or is adjacent to a member. Control frequency was defined as the proportion of </w:t>
+          <w:highlight w:val="none"/>
+        </w:rPr>
+        <w:t xml:space="preserve">All available eligible records were analysed and no a priori sample-size calculation was performed. No missing-data imputation was used. The SEARCH cross-lagged model included 6,092 linked complete cases, the MCS model included 7,838 complete cases, the secondary baseline SEARCH network included 10,356 participants, and the Global Mind Project analysis included 147,506 complete cases. </w:t>
       </w:r>
       <w:r>
         <w:rPr>
           <w:rFonts w:hint="eastAsia"/>
           <w:highlight w:val="none"/>
         </w:rPr>
-        <w:t>MDS solutions</w:t>
-      </w:r>
-      <w:r>
-        <w:rPr>
-          <w:highlight w:val="none"/>
-        </w:rPr>
-        <w:t xml:space="preserve"> containing a node. The module control network summarised inter-module structural coverage using average module control strength</w:t>
-      </w:r>
-      <w:r>
-        <w:rPr>
-          <w:rFonts w:hint="eastAsia" w:eastAsia="宋体"/>
-          <w:highlight w:val="none"/>
-          <w:lang w:val="en-US" w:eastAsia="zh-CN"/>
-        </w:rPr>
-        <w:t xml:space="preserve"> (AMCS)</w:t>
-      </w:r>
-      <w:r>
-        <w:rPr>
-          <w:highlight w:val="none"/>
-          <w:vertAlign w:val="superscript"/>
-        </w:rPr>
-        <w:t>22</w:t>
-      </w:r>
-      <w:r>
-        <w:rPr>
-          <w:highlight w:val="none"/>
-        </w:rPr>
-        <w:t>. These quantities refer to the topology of the estimated undirected graph; they do not represent intervention effects, dynamical controllability or temporal precedence.</w:t>
-      </w:r>
-    </w:p>
-    <w:p>
-      <w:pPr>
-        <w:rPr>
-          <w:highlight w:val="none"/>
-        </w:rPr>
-      </w:pPr>
-      <w:r>
-        <w:rPr>
-          <w:highlight w:val="none"/>
-        </w:rPr>
-        <w:t>To separate minimum-set size from node identity, 500 degree-preserving null networks were generated by double-edge-swap randomisation and each node's observed control frequency was compared with its node-specific null domination frequency. Estimator sensitivity was examined with EBIC graphical</w:t>
-      </w:r>
-      <w:r>
-        <w:rPr>
-          <w:rFonts w:hint="eastAsia" w:eastAsia="宋体"/>
-          <w:highlight w:val="none"/>
-          <w:lang w:val="en-US" w:eastAsia="zh-CN"/>
-        </w:rPr>
-        <w:t xml:space="preserve"> l</w:t>
-      </w:r>
-      <w:r>
-        <w:rPr>
-          <w:highlight w:val="none"/>
-        </w:rPr>
-        <w:t>asso networks at gamma values of 0, 0.25 and 0.5, the primary cross-validated network, and a positive-edges-only version. Six community-detection algorithms (Louvain, Leiden, Walktrap, Spinglass, Fast-Greedy and Infomap) were compared with the six prespecified domains using adjusted Rand index and normalised mutual information</w:t>
-      </w:r>
-      <w:r>
-        <w:rPr>
-          <w:rFonts w:hint="eastAsia" w:eastAsia="宋体"/>
-          <w:highlight w:val="none"/>
-          <w:vertAlign w:val="superscript"/>
-          <w:lang w:val="en-US" w:eastAsia="zh-CN"/>
-        </w:rPr>
-        <w:t>31</w:t>
-      </w:r>
-      <w:r>
-        <w:rPr>
-          <w:highlight w:val="none"/>
-        </w:rPr>
-        <w:t>. Community assignments were also compared across waves.</w:t>
-      </w:r>
-    </w:p>
-    <w:p>
-      <w:pPr>
-        <w:rPr>
-          <w:rFonts w:hint="eastAsia" w:eastAsia="宋体"/>
-          <w:highlight w:val="none"/>
-          <w:lang w:val="en-US" w:eastAsia="zh-CN"/>
-        </w:rPr>
-      </w:pPr>
-      <w:r>
-        <w:rPr>
-          <w:highlight w:val="none"/>
-        </w:rPr>
-        <w:t>We additionally calculated node strength, closeness, betweenness, eigenvector centrality, signed expected influence, bridge strength, bridge expected influence, bridge betweenness, participation coefficient, average controllability, modal controllability and control energy</w:t>
-      </w:r>
-      <w:r>
-        <w:rPr>
-          <w:rFonts w:hint="eastAsia" w:eastAsia="宋体"/>
-          <w:highlight w:val="none"/>
-          <w:vertAlign w:val="superscript"/>
-          <w:lang w:val="en-US" w:eastAsia="zh-CN"/>
-        </w:rPr>
-        <w:t>32</w:t>
-      </w:r>
-      <w:r>
-        <w:rPr>
-          <w:highlight w:val="none"/>
-        </w:rPr>
-        <w:t xml:space="preserve">. </w:t>
-      </w:r>
-      <w:r>
-        <w:rPr>
-          <w:rFonts w:hint="eastAsia"/>
-          <w:highlight w:val="none"/>
-        </w:rPr>
-        <w:t>Average and modal controllability, together with the control energy associated with state transitions in the ISI and ACT modules, were derived from the discrete-time linear controllability Gramian applied to the absolute-weight adjacency matrix.</w:t>
-      </w:r>
-      <w:r>
-        <w:rPr>
-          <w:rFonts w:hint="eastAsia" w:eastAsia="宋体"/>
-          <w:highlight w:val="none"/>
-          <w:lang w:val="en-US" w:eastAsia="zh-CN"/>
-        </w:rPr>
-        <w:t xml:space="preserve"> </w:t>
-      </w:r>
-      <w:r>
-        <w:rPr>
-          <w:highlight w:val="none"/>
-        </w:rPr>
-        <w:t xml:space="preserve">Spearman correlations and principal-component analysis assessed overlap among node metrics. Node-knockout analyses and sustained nonlinear propagation simulations were retained as supplementary robustness analyses. The propagation model applied a hyperbolic-tangent activation with gain g = 0.9 to the </w:t>
-      </w:r>
-      <w:r>
-        <w:rPr>
-          <w:rFonts w:hint="eastAsia"/>
-          <w:highlight w:val="none"/>
-        </w:rPr>
-        <w:t>spectrally normalised absolute adjacency matrix</w:t>
-      </w:r>
-      <w:r>
-        <w:rPr>
-          <w:highlight w:val="none"/>
-        </w:rPr>
-        <w:t xml:space="preserve"> under sustained module input.</w:t>
-      </w:r>
-      <w:r>
-        <w:rPr>
-          <w:rFonts w:hint="eastAsia" w:eastAsia="宋体"/>
-          <w:highlight w:val="none"/>
-          <w:lang w:val="en-US" w:eastAsia="zh-CN"/>
-        </w:rPr>
-        <w:t xml:space="preserve"> Group-level network structures were compared using a permutation-based network comparison test</w:t>
-      </w:r>
-      <w:r>
-        <w:rPr>
-          <w:rFonts w:hint="eastAsia" w:eastAsia="宋体"/>
-          <w:highlight w:val="none"/>
-          <w:vertAlign w:val="superscript"/>
-          <w:lang w:val="en-US" w:eastAsia="zh-CN"/>
-        </w:rPr>
-        <w:t>50</w:t>
-      </w:r>
-      <w:r>
-        <w:rPr>
-          <w:rFonts w:hint="eastAsia" w:eastAsia="宋体"/>
-          <w:highlight w:val="none"/>
-          <w:lang w:val="en-US" w:eastAsia="zh-CN"/>
-        </w:rPr>
-        <w:t>.</w:t>
-      </w:r>
-    </w:p>
-    <w:p>
-      <w:pPr>
-        <w:pStyle w:val="5"/>
-        <w:keepNext/>
-        <w:rPr>
-          <w:highlight w:val="none"/>
-        </w:rPr>
-      </w:pPr>
-      <w:r>
-        <w:rPr>
-          <w:highlight w:val="none"/>
-        </w:rPr>
-        <w:t>Exploratory Bayesian graph</w:t>
-      </w:r>
-    </w:p>
-    <w:p>
-      <w:pPr>
-        <w:rPr>
-          <w:rFonts w:hint="eastAsia" w:eastAsia="宋体"/>
-          <w:highlight w:val="none"/>
-          <w:lang w:val="en-US" w:eastAsia="zh-CN"/>
-        </w:rPr>
-      </w:pPr>
-      <w:r>
-        <w:rPr>
-          <w:rFonts w:hint="eastAsia"/>
-          <w:highlight w:val="none"/>
-        </w:rPr>
-        <w:t>The six baseline domain scores of the 6,092 longitudinally matched SEARCH participants</w:t>
-      </w:r>
-      <w:r>
-        <w:rPr>
-          <w:highlight w:val="none"/>
-        </w:rPr>
-        <w:t xml:space="preserve"> were discretised into tertiles and a directed acyclic graph was learned by hill-climb search with the Bayesian information criterion in pgmpy. Directed-edge stability was estimated across 200 bootstrap resamples. We also examined the completed partially directed acyclic graph, a continuous Gaussian Bayesian network and leave-one-domain-out correlations. </w:t>
-      </w:r>
-      <w:r>
-        <w:rPr>
-          <w:rFonts w:hint="eastAsia"/>
-          <w:highlight w:val="none"/>
-        </w:rPr>
-        <w:t>Because observational Bayesian graphs identify an equivalence class and may be affected by unmeasured confounding, this analysis was interpreted as an exploratory comparison with CLPN ordering rather than causal identification.</w:t>
-      </w:r>
-      <w:r>
-        <w:rPr>
-          <w:rFonts w:hint="eastAsia" w:eastAsia="宋体"/>
-          <w:highlight w:val="none"/>
-          <w:lang w:val="en-US" w:eastAsia="zh-CN"/>
-        </w:rPr>
-        <w:t xml:space="preserve"> Agreement between Bayesian net out-degree and CLPN net directionality was assessed across six paired domain-level estimates using Pearson and Spearman correlations. The exact two-sided permutation test enumerated all 720 permutations and compared absolute Pearson correlations. The percentile 95% confidence interval for Pearson r was calculated from 5,000 attempted paired bootstrap resamples, excluding resamples with undefined correlations.</w:t>
-      </w:r>
-    </w:p>
-    <w:p>
-      <w:pPr>
-        <w:pStyle w:val="5"/>
-        <w:keepNext/>
-        <w:rPr>
-          <w:highlight w:val="none"/>
-        </w:rPr>
-      </w:pPr>
-      <w:r>
-        <w:rPr>
-          <w:highlight w:val="none"/>
-        </w:rPr>
-        <w:t>Global Mind Project analysis</w:t>
-      </w:r>
-    </w:p>
-    <w:p>
-      <w:pPr>
-        <w:rPr>
-          <w:highlight w:val="none"/>
-        </w:rPr>
-      </w:pPr>
-      <w:r>
-        <w:rPr>
-          <w:highlight w:val="none"/>
-        </w:rPr>
-        <w:t>The Global Mind Project/Mental Health Million dataset contains adult self-report records collected internationally</w:t>
-      </w:r>
-      <w:r>
-        <w:rPr>
-          <w:rFonts w:hint="eastAsia" w:eastAsia="宋体"/>
-          <w:highlight w:val="none"/>
-          <w:vertAlign w:val="superscript"/>
-          <w:lang w:val="en-US" w:eastAsia="zh-CN"/>
-        </w:rPr>
-        <w:t>29</w:t>
-      </w:r>
-      <w:r>
-        <w:rPr>
-          <w:highlight w:val="none"/>
-          <w:vertAlign w:val="superscript"/>
-        </w:rPr>
-        <w:t>,</w:t>
-      </w:r>
-      <w:r>
-        <w:rPr>
-          <w:rFonts w:hint="eastAsia" w:eastAsia="宋体"/>
-          <w:highlight w:val="none"/>
-          <w:vertAlign w:val="superscript"/>
-          <w:lang w:val="en-US" w:eastAsia="zh-CN"/>
-        </w:rPr>
-        <w:t xml:space="preserve"> 30</w:t>
-      </w:r>
-      <w:r>
-        <w:rPr>
-          <w:highlight w:val="none"/>
-        </w:rPr>
-        <w:t xml:space="preserve">. </w:t>
-      </w:r>
-      <w:r>
-        <w:rPr>
-          <w:rFonts w:hint="eastAsia"/>
-          <w:highlight w:val="none"/>
-        </w:rPr>
-        <w:t>We selected participants aged 18–24 years; 147,506 had complete data for six mapped constructs and were included in the pooled multinational analysis.</w:t>
-      </w:r>
-      <w:r>
-        <w:rPr>
-          <w:highlight w:val="none"/>
-        </w:rPr>
-        <w:t xml:space="preserve"> Emotion was represented by fear/anxiety, sadness/hopelessness, mood swings and anger; broad behaviour by restlessness/hyperactivity, aggression and impulsivity; sleep by sleep frequency and quality; diet by ultra-processed food, fruit/vegetable and sugary-food frequency and appetite; activity by exercise frequency; and digital exposure by social-media frequency.</w:t>
-      </w:r>
-    </w:p>
-    <w:p>
-      <w:pPr>
-        <w:rPr>
-          <w:rFonts w:hint="eastAsia"/>
-          <w:highlight w:val="none"/>
-        </w:rPr>
-      </w:pPr>
-      <w:r>
-        <w:rPr>
-          <w:rFonts w:hint="eastAsia"/>
-          <w:highlight w:val="none"/>
-        </w:rPr>
-        <w:t xml:space="preserve">Within each mapped GMP domain, component items were z-standardised and averaged to form a domain score. The six domain scores were transformed to normal marginals, and a Gaussian graphical model was estimated using cross-validated graphical </w:t>
-      </w:r>
-      <w:r>
-        <w:rPr>
-          <w:rFonts w:hint="eastAsia" w:eastAsia="宋体"/>
-          <w:highlight w:val="none"/>
-          <w:lang w:val="en-US" w:eastAsia="zh-CN"/>
-        </w:rPr>
-        <w:t>l</w:t>
-      </w:r>
-      <w:r>
-        <w:rPr>
-          <w:rFonts w:hint="eastAsia"/>
-          <w:highlight w:val="none"/>
-        </w:rPr>
-        <w:t xml:space="preserve">asso. Domain strength was calculated as the sum of absolute partial correlations, with 95% confidence intervals obtained from 300 </w:t>
-      </w:r>
-      <w:r>
-        <w:rPr>
-          <w:rFonts w:hint="eastAsia" w:eastAsia="宋体"/>
-          <w:highlight w:val="none"/>
-          <w:lang w:eastAsia="zh-CN"/>
-        </w:rPr>
-        <w:t>nonparametric</w:t>
-      </w:r>
-      <w:r>
-        <w:rPr>
-          <w:rFonts w:hint="eastAsia"/>
-          <w:highlight w:val="none"/>
-        </w:rPr>
-        <w:t xml:space="preserve"> bootstrap resamples. </w:t>
-      </w:r>
-    </w:p>
-    <w:p>
-      <w:pPr>
-        <w:rPr>
-          <w:highlight w:val="none"/>
-        </w:rPr>
-      </w:pPr>
-      <w:r>
-        <w:rPr>
-          <w:rFonts w:hint="eastAsia"/>
-          <w:highlight w:val="none"/>
-        </w:rPr>
-        <w:t>For the descriptive comparison in Fig. 5b, the 104 baseline SEARCH items were summed within six corresponding domains, and the resulting domain scores were z-standardised. A six-domain partial-correlation network was derived from the inverse correlation matrix, with domain strength calculated in the same way. Strengths were normalised separately within each cohort by dividing each value by the maximum domain strength, so that the strongest domain was assigned a value of 1. This comparison was descriptive and did not test differences between cohorts.</w:t>
-      </w:r>
-    </w:p>
-    <w:p>
-      <w:pPr>
-        <w:pStyle w:val="5"/>
-        <w:keepNext/>
-        <w:rPr>
-          <w:highlight w:val="none"/>
-        </w:rPr>
-      </w:pPr>
-      <w:r>
-        <w:rPr>
-          <w:highlight w:val="none"/>
-        </w:rPr>
-        <w:t>Statistics and reproducibility</w:t>
-      </w:r>
-    </w:p>
-    <w:p>
-      <w:pPr>
-        <w:rPr>
-          <w:highlight w:val="none"/>
-        </w:rPr>
-      </w:pPr>
-      <w:r>
-        <w:rPr>
-          <w:highlight w:val="none"/>
-        </w:rPr>
-        <w:t xml:space="preserve">All available eligible records were analysed and no a priori sample-size calculation was performed. No missing-data imputation was used. The SEARCH cross-lagged model included 6,092 linked complete cases, the MCS model included 7,838 complete cases, the secondary baseline SEARCH network included 10,356 participants, and the Global Mind Project analysis included 147,506 complete cases. </w:t>
-      </w:r>
-      <w:r>
-        <w:rPr>
-          <w:rFonts w:hint="eastAsia"/>
-          <w:highlight w:val="none"/>
-        </w:rPr>
-        <w:t>All tests were two-sided. Bootstrap counts were 1,000 for SEARCH directionality, 500 for MCS directionality, 300 for Global Mind Project strength and 200 for Bayesian edge stability. We also generated 500 degree-preserving null networks.</w:t>
-      </w:r>
-      <w:r>
-        <w:rPr>
-          <w:highlight w:val="none"/>
-        </w:rPr>
-        <w:t xml:space="preserve"> </w:t>
+        <w:t>All tests were two-sided. Bootstrap counts were 1,000 for SEARCH directionality, 500 for MCS directionality, 300 for Global Mind Project strength and 200 for Bayesian edge stability. We also generated 500 degree-preserving null networks.Unless otherwise stated, nonparametric bootstrap analyses resampled participants with replacement. SEARCH net-directionality intervals used 1,000 resamples, MCS intervals used 500, GMP strength intervals used 300, Bayesian edge stability used 200, and cross-wave community stability used 100. Structural-control-node stability used 300 independent 90% subsamples drawn without replacement.</w:t>
       </w:r>
     </w:p>
     <w:p>

</xml_diff>